<commit_message>
Bespoke AI: previews, lightbox, DnD & UI polish
Add rich file previews and lightbox, drag-and-drop attach, PDF-thumb rasterization, preview tiles, object-URL lifecycle handling, and various UI/animation polish for the Bespoke AI widget. Wire preview click and drop handlers in JS, add thinking/pulse send UI, and improve panel/chip/typing styles in CSS. Add docs/service-provider-briefing/build_security_section.py to rebuild SECURITY TALKING POINTS in the webinar plan. Bump bespoke-ai asset versions (v19→v20) in portal-access and dashboard, and update the webinar plan DOCX.
</commit_message>
<xml_diff>
--- a/docs/Webinar-Plan-TMA-Portal.docx
+++ b/docs/Webinar-Plan-TMA-Portal.docx
@@ -1,6 +1,6 @@
 
 <file path=word/document.xml><?xml version="1.0" encoding="utf-8"?>
-<w:document xmlns:wpc="http://schemas.microsoft.com/office/word/2010/wordprocessingCanvas" xmlns:cx="http://schemas.microsoft.com/office/drawing/2014/chartex" xmlns:cx1="http://schemas.microsoft.com/office/drawing/2015/9/8/chartex" xmlns:cx2="http://schemas.microsoft.com/office/drawing/2015/10/21/chartex" xmlns:cx3="http://schemas.microsoft.com/office/drawing/2016/5/9/chartex" xmlns:cx4="http://schemas.microsoft.com/office/drawing/2016/5/10/chartex" xmlns:cx5="http://schemas.microsoft.com/office/drawing/2016/5/11/chartex" xmlns:cx6="http://schemas.microsoft.com/office/drawing/2016/5/12/chartex" xmlns:cx7="http://schemas.microsoft.com/office/drawing/2016/5/13/chartex" xmlns:cx8="http://schemas.microsoft.com/office/drawing/2016/5/14/chartex" xmlns:mc="http://schemas.openxmlformats.org/markup-compatibility/2006" xmlns:aink="http://schemas.microsoft.com/office/drawing/2016/ink" xmlns:am3d="http://schemas.microsoft.com/office/drawing/2017/model3d" xmlns:o="urn:schemas-microsoft-com:office:office" xmlns:oel="http://schemas.microsoft.com/office/2019/extlst" xmlns:r="http://schemas.openxmlformats.org/officeDocument/2006/relationships" xmlns:m="http://schemas.openxmlformats.org/officeDocument/2006/math" xmlns:v="urn:schemas-microsoft-com:vml" xmlns:wp14="http://schemas.microsoft.com/office/word/2010/wordprocessingDrawing" xmlns:wp="http://schemas.openxmlformats.org/drawingml/2006/wordprocessingDrawing" xmlns:w10="urn:schemas-microsoft-com:office:word" xmlns:w="http://schemas.openxmlformats.org/wordprocessingml/2006/main" xmlns:w14="http://schemas.microsoft.com/office/word/2010/wordml" xmlns:w15="http://schemas.microsoft.com/office/word/2012/wordml" xmlns:w16cex="http://schemas.microsoft.com/office/word/2018/wordml/cex" xmlns:w16cid="http://schemas.microsoft.com/office/word/2016/wordml/cid" xmlns:w16="http://schemas.microsoft.com/office/word/2018/wordml" xmlns:w16du="http://schemas.microsoft.com/office/word/2023/wordml/word16du" xmlns:w16sdtdh="http://schemas.microsoft.com/office/word/2020/wordml/sdtdatahash" xmlns:w16sdtfl="http://schemas.microsoft.com/office/word/2024/wordml/sdtformatlock" xmlns:w16se="http://schemas.microsoft.com/office/word/2015/wordml/symex" xmlns:wpg="http://schemas.microsoft.com/office/word/2010/wordprocessingGroup" xmlns:wpi="http://schemas.microsoft.com/office/word/2010/wordprocessingInk" xmlns:wne="http://schemas.microsoft.com/office/word/2006/wordml" xmlns:wps="http://schemas.microsoft.com/office/word/2010/wordprocessingShape" mc:Ignorable="w14 w15 w16se w16cid w16 w16cex w16sdtdh w16sdtfl w16du wp14">
+<w:document xmlns:wpc="http://schemas.microsoft.com/office/word/2010/wordprocessingCanvas" xmlns:cx="http://schemas.microsoft.com/office/drawing/2014/chartex" xmlns:cx1="http://schemas.microsoft.com/office/drawing/2015/9/8/chartex" xmlns:cx2="http://schemas.microsoft.com/office/drawing/2015/10/21/chartex" xmlns:cx3="http://schemas.microsoft.com/office/drawing/2016/5/9/chartex" xmlns:cx4="http://schemas.microsoft.com/office/drawing/2016/5/10/chartex" xmlns:cx5="http://schemas.microsoft.com/office/drawing/2016/5/11/chartex" xmlns:cx6="http://schemas.microsoft.com/office/drawing/2016/5/12/chartex" xmlns:cx7="http://schemas.microsoft.com/office/drawing/2016/5/13/chartex" xmlns:cx8="http://schemas.microsoft.com/office/drawing/2016/5/14/chartex" xmlns:mc="http://schemas.openxmlformats.org/markup-compatibility/2006" xmlns:m="http://schemas.openxmlformats.org/officeDocument/2006/math" xmlns:aink="http://schemas.microsoft.com/office/drawing/2016/ink" xmlns:am3d="http://schemas.microsoft.com/office/drawing/2017/model3d" xmlns:oel="http://schemas.microsoft.com/office/2019/extlst" xmlns:r="http://schemas.openxmlformats.org/officeDocument/2006/relationships" xmlns:wp14="http://schemas.microsoft.com/office/word/2010/wordprocessingDrawing" xmlns:wp="http://schemas.openxmlformats.org/drawingml/2006/wordprocessingDrawing" xmlns:wpg="http://schemas.microsoft.com/office/word/2010/wordprocessingGroup" xmlns:wpi="http://schemas.microsoft.com/office/word/2010/wordprocessingInk" xmlns:wps="http://schemas.microsoft.com/office/word/2010/wordprocessingShape" xmlns:o="urn:schemas-microsoft-com:office:office" xmlns:v="urn:schemas-microsoft-com:vml" xmlns:w10="urn:schemas-microsoft-com:office:word" xmlns:w="http://schemas.openxmlformats.org/wordprocessingml/2006/main" xmlns:w14="http://schemas.microsoft.com/office/word/2010/wordml" xmlns:w15="http://schemas.microsoft.com/office/word/2012/wordml" xmlns:w16cex="http://schemas.microsoft.com/office/word/2018/wordml/cex" xmlns:w16cid="http://schemas.microsoft.com/office/word/2016/wordml/cid" xmlns:w16="http://schemas.microsoft.com/office/word/2018/wordml" xmlns:w16sdtdh="http://schemas.microsoft.com/office/word/2020/wordml/sdtdatahash" xmlns:w16sdtfl="http://schemas.microsoft.com/office/word/2024/wordml/sdtformatlock" xmlns:w16se="http://schemas.microsoft.com/office/word/2015/wordml/symex" xmlns:w16du="http://schemas.microsoft.com/office/word/2023/wordml/word16du" xmlns:wne="http://schemas.microsoft.com/office/word/2006/wordml" mc:Ignorable="w14 w15 w16se w16cid w16 w16cex w16sdtdh w16sdtfl w16du wp14">
   <w:body>
     <w:p>
       <w:pPr>
@@ -56,7 +56,6 @@
           <w:ilvl w:val="0"/>
           <w:numId w:val="12"/>
         </w:numPr>
-        <w:rPr/>
       </w:pPr>
       <w:r>
         <w:rPr>
@@ -78,13 +77,7 @@
         </w:numPr>
       </w:pPr>
       <w:r>
-        <w:t xml:space="preserve">Register and log in to the </w:t>
-      </w:r>
-      <w:r>
-        <w:t>portal and</w:t>
-      </w:r>
-      <w:r>
-        <w:t xml:space="preserve"> know where to get help if login fails.</w:t>
+        <w:t>Register and log in to the portal and know where to get help if login fails.</w:t>
       </w:r>
     </w:p>
     <w:p>
@@ -104,7 +97,6 @@
           <w:ilvl w:val="0"/>
           <w:numId w:val="1"/>
         </w:numPr>
-        <w:rPr/>
       </w:pPr>
       <w:r>
         <w:rPr>
@@ -149,8 +141,8 @@
     <w:p>
       <w:r>
         <w:rPr>
-          <w:b w:val="1"/>
-          <w:bCs w:val="1"/>
+          <w:b/>
+          <w:bCs/>
           <w:lang w:val="en-US"/>
         </w:rPr>
         <w:t>DATE:</w:t>
@@ -171,8 +163,8 @@
     <w:p>
       <w:r>
         <w:rPr>
-          <w:b w:val="1"/>
-          <w:bCs w:val="1"/>
+          <w:b/>
+          <w:bCs/>
           <w:lang w:val="en-US"/>
         </w:rPr>
         <w:t>AUDIENCE</w:t>
@@ -190,54 +182,48 @@
         <w:rPr>
           <w:lang w:val="en-US"/>
         </w:rPr>
-        <w:t>ALL</w:t>
-      </w:r>
-      <w:r>
-        <w:rPr>
+        <w:t xml:space="preserve">ALL service providers in one session. </w:t>
+      </w:r>
+    </w:p>
+    <w:p>
+      <w:r>
+        <w:rPr>
+          <w:b/>
+          <w:bCs/>
           <w:lang w:val="en-US"/>
         </w:rPr>
-        <w:t xml:space="preserve"> service providers in one session. </w:t>
-      </w:r>
-    </w:p>
-    <w:p>
-      <w:r>
-        <w:rPr>
-          <w:b w:val="1"/>
-          <w:bCs w:val="1"/>
+        <w:t>START TIME:</w:t>
+      </w:r>
+      <w:r>
+        <w:tab/>
+      </w:r>
+      <w:r>
+        <w:rPr>
           <w:lang w:val="en-US"/>
         </w:rPr>
-        <w:t>START TIME:</w:t>
-      </w:r>
-      <w:r>
-        <w:tab/>
-      </w:r>
-      <w:r>
-        <w:rPr>
+        <w:t xml:space="preserve">9:00 a.m. </w:t>
+      </w:r>
+    </w:p>
+    <w:p>
+      <w:pPr>
+        <w:rPr>
+          <w:b/>
+          <w:bCs/>
+        </w:rPr>
+      </w:pPr>
+    </w:p>
+    <w:p>
+      <w:pPr>
+        <w:rPr>
+          <w:b/>
+          <w:bCs/>
           <w:lang w:val="en-US"/>
         </w:rPr>
-        <w:t xml:space="preserve">9:00 a.m. </w:t>
-      </w:r>
-    </w:p>
-    <w:p>
-      <w:pPr>
+      </w:pPr>
+      <w:r>
         <w:rPr>
           <w:b/>
           <w:bCs/>
-        </w:rPr>
-      </w:pPr>
-    </w:p>
-    <w:p>
-      <w:pPr>
-        <w:rPr>
-          <w:b w:val="1"/>
-          <w:bCs w:val="1"/>
-          <w:lang w:val="en-US"/>
-        </w:rPr>
-      </w:pPr>
-      <w:r>
-        <w:rPr>
-          <w:b w:val="1"/>
-          <w:bCs w:val="1"/>
           <w:lang w:val="en-US"/>
         </w:rPr>
         <w:t>Format, logistics and roles</w:t>
@@ -266,7 +252,6 @@
         <w:tc>
           <w:tcPr>
             <w:tcW w:w="0" w:type="auto"/>
-            <w:tcMar/>
             <w:vAlign w:val="center"/>
             <w:hideMark/>
           </w:tcPr>
@@ -289,7 +274,6 @@
         <w:tc>
           <w:tcPr>
             <w:tcW w:w="0" w:type="auto"/>
-            <w:tcMar/>
             <w:vAlign w:val="center"/>
             <w:hideMark/>
           </w:tcPr>
@@ -317,7 +301,6 @@
         <w:tc>
           <w:tcPr>
             <w:tcW w:w="0" w:type="auto"/>
-            <w:tcMar/>
             <w:vAlign w:val="center"/>
             <w:hideMark/>
           </w:tcPr>
@@ -340,7 +323,6 @@
         <w:tc>
           <w:tcPr>
             <w:tcW w:w="0" w:type="auto"/>
-            <w:tcMar/>
             <w:vAlign w:val="center"/>
             <w:hideMark/>
           </w:tcPr>
@@ -358,7 +340,6 @@
         <w:tc>
           <w:tcPr>
             <w:tcW w:w="0" w:type="auto"/>
-            <w:tcMar/>
             <w:vAlign w:val="center"/>
             <w:hideMark/>
           </w:tcPr>
@@ -381,7 +362,6 @@
         <w:tc>
           <w:tcPr>
             <w:tcW w:w="0" w:type="auto"/>
-            <w:tcMar/>
             <w:vAlign w:val="center"/>
             <w:hideMark/>
           </w:tcPr>
@@ -399,7 +379,6 @@
         <w:tc>
           <w:tcPr>
             <w:tcW w:w="0" w:type="auto"/>
-            <w:tcMar/>
             <w:vAlign w:val="center"/>
             <w:hideMark/>
           </w:tcPr>
@@ -422,7 +401,6 @@
         <w:tc>
           <w:tcPr>
             <w:tcW w:w="0" w:type="auto"/>
-            <w:tcMar/>
             <w:vAlign w:val="center"/>
             <w:hideMark/>
           </w:tcPr>
@@ -440,7 +418,6 @@
         <w:tc>
           <w:tcPr>
             <w:tcW w:w="0" w:type="auto"/>
-            <w:tcMar/>
             <w:vAlign w:val="center"/>
             <w:hideMark/>
           </w:tcPr>
@@ -463,7 +440,6 @@
         <w:tc>
           <w:tcPr>
             <w:tcW w:w="0" w:type="auto"/>
-            <w:tcMar/>
             <w:vAlign w:val="center"/>
             <w:hideMark/>
           </w:tcPr>
@@ -481,7 +457,6 @@
         <w:tc>
           <w:tcPr>
             <w:tcW w:w="0" w:type="auto"/>
-            <w:tcMar/>
             <w:vAlign w:val="center"/>
             <w:hideMark/>
           </w:tcPr>
@@ -504,7 +479,6 @@
         <w:tc>
           <w:tcPr>
             <w:tcW w:w="0" w:type="auto"/>
-            <w:tcMar/>
             <w:vAlign w:val="center"/>
             <w:hideMark/>
           </w:tcPr>
@@ -522,7 +496,6 @@
         <w:tc>
           <w:tcPr>
             <w:tcW w:w="0" w:type="auto"/>
-            <w:tcMar/>
             <w:vAlign w:val="center"/>
             <w:hideMark/>
           </w:tcPr>
@@ -538,6 +511,7 @@
                 <w:b/>
                 <w:bCs/>
               </w:rPr>
+              <w:lastRenderedPageBreak/>
               <w:t>Support</w:t>
             </w:r>
           </w:p>
@@ -545,7 +519,6 @@
         <w:tc>
           <w:tcPr>
             <w:tcW w:w="0" w:type="auto"/>
-            <w:tcMar/>
             <w:vAlign w:val="center"/>
             <w:hideMark/>
           </w:tcPr>
@@ -566,7 +539,6 @@
         <w:tc>
           <w:tcPr>
             <w:tcW w:w="0" w:type="auto"/>
-            <w:tcMar/>
             <w:vAlign w:val="center"/>
             <w:hideMark/>
           </w:tcPr>
@@ -589,7 +561,6 @@
         <w:tc>
           <w:tcPr>
             <w:tcW w:w="0" w:type="auto"/>
-            <w:tcMar/>
             <w:vAlign w:val="center"/>
             <w:hideMark/>
           </w:tcPr>
@@ -648,7 +619,6 @@
         <w:tc>
           <w:tcPr>
             <w:tcW w:w="1515" w:type="dxa"/>
-            <w:tcMar/>
             <w:vAlign w:val="center"/>
             <w:hideMark/>
           </w:tcPr>
@@ -671,7 +641,6 @@
         <w:tc>
           <w:tcPr>
             <w:tcW w:w="5661" w:type="dxa"/>
-            <w:tcMar/>
             <w:vAlign w:val="center"/>
             <w:hideMark/>
           </w:tcPr>
@@ -694,7 +663,6 @@
         <w:tc>
           <w:tcPr>
             <w:tcW w:w="0" w:type="auto"/>
-            <w:tcMar/>
             <w:vAlign w:val="center"/>
             <w:hideMark/>
           </w:tcPr>
@@ -722,7 +690,6 @@
         <w:tc>
           <w:tcPr>
             <w:tcW w:w="1515" w:type="dxa"/>
-            <w:tcMar/>
             <w:vAlign w:val="center"/>
             <w:hideMark/>
           </w:tcPr>
@@ -735,7 +702,6 @@
         <w:tc>
           <w:tcPr>
             <w:tcW w:w="5661" w:type="dxa"/>
-            <w:tcMar/>
             <w:vAlign w:val="center"/>
             <w:hideMark/>
           </w:tcPr>
@@ -748,7 +714,6 @@
         <w:tc>
           <w:tcPr>
             <w:tcW w:w="0" w:type="auto"/>
-            <w:tcMar/>
             <w:vAlign w:val="center"/>
             <w:hideMark/>
           </w:tcPr>
@@ -766,7 +731,6 @@
         <w:tc>
           <w:tcPr>
             <w:tcW w:w="1515" w:type="dxa"/>
-            <w:tcMar/>
             <w:vAlign w:val="center"/>
             <w:hideMark/>
           </w:tcPr>
@@ -779,7 +743,6 @@
         <w:tc>
           <w:tcPr>
             <w:tcW w:w="5661" w:type="dxa"/>
-            <w:tcMar/>
             <w:vAlign w:val="center"/>
             <w:hideMark/>
           </w:tcPr>
@@ -788,26 +751,13 @@
               <w:rPr>
                 <w:lang w:val="en-US"/>
               </w:rPr>
-              <w:t xml:space="preserve">Why the portal: one place instead of email, </w:t>
-            </w:r>
-            <w:r>
-              <w:rPr>
-                <w:lang w:val="en-US"/>
-              </w:rPr>
-              <w:t>SmartSheet</w:t>
-            </w:r>
-            <w:r>
-              <w:rPr>
-                <w:lang w:val="en-US"/>
-              </w:rPr>
-              <w:t xml:space="preserve"> and other channels</w:t>
+              <w:t>Why the portal: one place instead of email, SmartSheet and other channels</w:t>
             </w:r>
           </w:p>
         </w:tc>
         <w:tc>
           <w:tcPr>
             <w:tcW w:w="0" w:type="auto"/>
-            <w:tcMar/>
             <w:vAlign w:val="center"/>
             <w:hideMark/>
           </w:tcPr>
@@ -825,7 +775,6 @@
         <w:tc>
           <w:tcPr>
             <w:tcW w:w="1515" w:type="dxa"/>
-            <w:tcMar/>
             <w:vAlign w:val="center"/>
             <w:hideMark/>
           </w:tcPr>
@@ -838,7 +787,6 @@
         <w:tc>
           <w:tcPr>
             <w:tcW w:w="5661" w:type="dxa"/>
-            <w:tcMar/>
             <w:vAlign w:val="center"/>
             <w:hideMark/>
           </w:tcPr>
@@ -851,7 +799,6 @@
         <w:tc>
           <w:tcPr>
             <w:tcW w:w="0" w:type="auto"/>
-            <w:tcMar/>
             <w:vAlign w:val="center"/>
             <w:hideMark/>
           </w:tcPr>
@@ -869,7 +816,6 @@
         <w:tc>
           <w:tcPr>
             <w:tcW w:w="1515" w:type="dxa"/>
-            <w:tcMar/>
             <w:vAlign w:val="center"/>
             <w:hideMark/>
           </w:tcPr>
@@ -882,7 +828,6 @@
         <w:tc>
           <w:tcPr>
             <w:tcW w:w="5661" w:type="dxa"/>
-            <w:tcMar/>
             <w:vAlign w:val="center"/>
             <w:hideMark/>
           </w:tcPr>
@@ -895,7 +840,6 @@
         <w:tc>
           <w:tcPr>
             <w:tcW w:w="0" w:type="auto"/>
-            <w:tcMar/>
             <w:vAlign w:val="center"/>
             <w:hideMark/>
           </w:tcPr>
@@ -913,7 +857,6 @@
         <w:tc>
           <w:tcPr>
             <w:tcW w:w="1515" w:type="dxa"/>
-            <w:tcMar/>
             <w:vAlign w:val="center"/>
             <w:hideMark/>
           </w:tcPr>
@@ -926,7 +869,6 @@
         <w:tc>
           <w:tcPr>
             <w:tcW w:w="5661" w:type="dxa"/>
-            <w:tcMar/>
             <w:vAlign w:val="center"/>
             <w:hideMark/>
           </w:tcPr>
@@ -939,7 +881,6 @@
         <w:tc>
           <w:tcPr>
             <w:tcW w:w="0" w:type="auto"/>
-            <w:tcMar/>
             <w:vAlign w:val="center"/>
             <w:hideMark/>
           </w:tcPr>
@@ -957,7 +898,6 @@
         <w:tc>
           <w:tcPr>
             <w:tcW w:w="1515" w:type="dxa"/>
-            <w:tcMar/>
             <w:vAlign w:val="center"/>
             <w:hideMark/>
           </w:tcPr>
@@ -970,7 +910,6 @@
         <w:tc>
           <w:tcPr>
             <w:tcW w:w="5661" w:type="dxa"/>
-            <w:tcMar/>
             <w:vAlign w:val="center"/>
             <w:hideMark/>
           </w:tcPr>
@@ -983,7 +922,6 @@
         <w:tc>
           <w:tcPr>
             <w:tcW w:w="0" w:type="auto"/>
-            <w:tcMar/>
             <w:vAlign w:val="center"/>
             <w:hideMark/>
           </w:tcPr>
@@ -1001,7 +939,6 @@
         <w:tc>
           <w:tcPr>
             <w:tcW w:w="1515" w:type="dxa"/>
-            <w:tcMar/>
             <w:vAlign w:val="center"/>
             <w:hideMark/>
           </w:tcPr>
@@ -1014,7 +951,6 @@
         <w:tc>
           <w:tcPr>
             <w:tcW w:w="5661" w:type="dxa"/>
-            <w:tcMar/>
             <w:vAlign w:val="center"/>
             <w:hideMark/>
           </w:tcPr>
@@ -1027,7 +963,6 @@
         <w:tc>
           <w:tcPr>
             <w:tcW w:w="0" w:type="auto"/>
-            <w:tcMar/>
             <w:vAlign w:val="center"/>
             <w:hideMark/>
           </w:tcPr>
@@ -1045,7 +980,6 @@
         <w:tc>
           <w:tcPr>
             <w:tcW w:w="1515" w:type="dxa"/>
-            <w:tcMar/>
             <w:vAlign w:val="center"/>
             <w:hideMark/>
           </w:tcPr>
@@ -1058,7 +992,6 @@
         <w:tc>
           <w:tcPr>
             <w:tcW w:w="5661" w:type="dxa"/>
-            <w:tcMar/>
             <w:vAlign w:val="center"/>
             <w:hideMark/>
           </w:tcPr>
@@ -1071,7 +1004,6 @@
         <w:tc>
           <w:tcPr>
             <w:tcW w:w="0" w:type="auto"/>
-            <w:tcMar/>
             <w:vAlign w:val="center"/>
             <w:hideMark/>
           </w:tcPr>
@@ -1121,55 +1053,97 @@
           <w:ilvl w:val="0"/>
           <w:numId w:val="2"/>
         </w:numPr>
-        <w:rPr/>
       </w:pPr>
       <w:r>
         <w:rPr>
           <w:lang w:val="en-US"/>
         </w:rPr>
-        <w:t xml:space="preserve">The portal replaces fragmented work across email, </w:t>
-      </w:r>
+        <w:t>The portal replaces fragmented work across email, SmartSheet and other channels with one place for documents, comments and status.</w:t>
+      </w:r>
+    </w:p>
+    <w:p>
+      <w:pPr>
+        <w:numPr>
+          <w:ilvl w:val="0"/>
+          <w:numId w:val="2"/>
+        </w:numPr>
+      </w:pPr>
       <w:r>
         <w:rPr>
           <w:lang w:val="en-US"/>
         </w:rPr>
-        <w:t>SmartSheet</w:t>
-      </w:r>
+        <w:t>Every action is time-stamped, so everyone can see when something was done.</w:t>
+      </w:r>
+    </w:p>
+    <w:p>
+      <w:pPr>
+        <w:numPr>
+          <w:ilvl w:val="0"/>
+          <w:numId w:val="2"/>
+        </w:numPr>
+      </w:pPr>
       <w:r>
         <w:rPr>
           <w:lang w:val="en-US"/>
         </w:rPr>
-        <w:t xml:space="preserve"> and other channels with one place for documents, comments and status.</w:t>
-      </w:r>
-    </w:p>
-    <w:p>
-      <w:pPr>
-        <w:numPr>
-          <w:ilvl w:val="0"/>
-          <w:numId w:val="2"/>
-        </w:numPr>
-        <w:rPr/>
+        <w:t>It supports applications, post approvals, appeals, reviews, comments and version history.</w:t>
+      </w:r>
+    </w:p>
+    <w:p>
+      <w:pPr>
+        <w:rPr>
+          <w:b/>
+          <w:bCs/>
+        </w:rPr>
+      </w:pPr>
+    </w:p>
+    <w:p>
+      <w:r>
+        <w:rPr>
+          <w:b/>
+          <w:bCs/>
+        </w:rPr>
+        <w:lastRenderedPageBreak/>
+        <w:t>Getting started (0:09)</w:t>
+      </w:r>
+    </w:p>
+    <w:p>
+      <w:pPr>
+        <w:numPr>
+          <w:ilvl w:val="0"/>
+          <w:numId w:val="3"/>
+        </w:numPr>
+      </w:pPr>
+      <w:r>
+        <w:t>Register, then log in. Anyone who cannot log in should use Microsoft Office support.</w:t>
+      </w:r>
+    </w:p>
+    <w:p>
+      <w:pPr>
+        <w:numPr>
+          <w:ilvl w:val="0"/>
+          <w:numId w:val="3"/>
+        </w:numPr>
       </w:pPr>
       <w:r>
         <w:rPr>
           <w:lang w:val="en-US"/>
         </w:rPr>
-        <w:t>Every action is time-stamped, so everyone can see when something was done.</w:t>
-      </w:r>
-    </w:p>
-    <w:p>
-      <w:pPr>
-        <w:numPr>
-          <w:ilvl w:val="0"/>
-          <w:numId w:val="2"/>
-        </w:numPr>
-        <w:rPr/>
+        <w:t>Service provider personnel are added under the relevant service provider when application access is set up. Use Galaxy as the example.</w:t>
+      </w:r>
+    </w:p>
+    <w:p>
+      <w:pPr>
+        <w:numPr>
+          <w:ilvl w:val="0"/>
+          <w:numId w:val="3"/>
+        </w:numPr>
       </w:pPr>
       <w:r>
         <w:rPr>
           <w:lang w:val="en-US"/>
         </w:rPr>
-        <w:t>It supports applications, post approvals, appeals, reviews, comments and version history.</w:t>
+        <w:t>Restricted visibility is planned for future finance models, so providers see only what applies to them.</w:t>
       </w:r>
     </w:p>
     <w:p>
@@ -1186,48 +1160,88 @@
           <w:b/>
           <w:bCs/>
         </w:rPr>
-        <w:t>Getting started (0:09)</w:t>
-      </w:r>
-    </w:p>
-    <w:p>
-      <w:pPr>
-        <w:numPr>
-          <w:ilvl w:val="0"/>
-          <w:numId w:val="3"/>
-        </w:numPr>
-      </w:pPr>
-      <w:r>
-        <w:t>Register, then log in. Anyone who cannot log in should use Microsoft Office support.</w:t>
-      </w:r>
-    </w:p>
-    <w:p>
-      <w:pPr>
-        <w:numPr>
-          <w:ilvl w:val="0"/>
-          <w:numId w:val="3"/>
-        </w:numPr>
-        <w:rPr/>
+        <w:t>Creating applications and uploading documents (0:14)</w:t>
+      </w:r>
+    </w:p>
+    <w:p>
+      <w:pPr>
+        <w:numPr>
+          <w:ilvl w:val="0"/>
+          <w:numId w:val="4"/>
+        </w:numPr>
+      </w:pPr>
+      <w:r>
+        <w:t xml:space="preserve">Service </w:t>
+      </w:r>
+      <w:r>
+        <w:t>Providers create a new application and upload its documents themselves.</w:t>
+      </w:r>
+    </w:p>
+    <w:p>
+      <w:pPr>
+        <w:numPr>
+          <w:ilvl w:val="0"/>
+          <w:numId w:val="4"/>
+        </w:numPr>
+      </w:pPr>
+      <w:r>
+        <w:t>Select the correct service provider and expect document requirements to differ by investment type.</w:t>
+      </w:r>
+    </w:p>
+    <w:p>
+      <w:pPr>
+        <w:numPr>
+          <w:ilvl w:val="0"/>
+          <w:numId w:val="4"/>
+        </w:numPr>
       </w:pPr>
       <w:r>
         <w:rPr>
           <w:lang w:val="en-US"/>
         </w:rPr>
-        <w:t>Service provider personnel are added under the relevant service provider when application access is set up. Use Galaxy as the example.</w:t>
-      </w:r>
-    </w:p>
-    <w:p>
-      <w:pPr>
-        <w:numPr>
-          <w:ilvl w:val="0"/>
-          <w:numId w:val="3"/>
-        </w:numPr>
-        <w:rPr/>
+        <w:t>Duplicate-prevention controls stop the same application being entered twice.</w:t>
+      </w:r>
+    </w:p>
+    <w:p>
+      <w:pPr>
+        <w:rPr>
+          <w:b/>
+          <w:bCs/>
+        </w:rPr>
+      </w:pPr>
+    </w:p>
+    <w:p>
+      <w:r>
+        <w:rPr>
+          <w:b/>
+          <w:bCs/>
+        </w:rPr>
+        <w:t>Responding to update requests (0:14)</w:t>
+      </w:r>
+    </w:p>
+    <w:p>
+      <w:pPr>
+        <w:numPr>
+          <w:ilvl w:val="0"/>
+          <w:numId w:val="5"/>
+        </w:numPr>
       </w:pPr>
       <w:r>
         <w:rPr>
           <w:lang w:val="en-US"/>
         </w:rPr>
-        <w:t>Restricted visibility is planned for future finance models, so providers see only what applies to them.</w:t>
+        <w:t>The team may request an update on any document, at any stage of the process, including post-approval documents and appeals.</w:t>
+      </w:r>
+    </w:p>
+    <w:p>
+      <w:pPr>
+        <w:numPr>
+          <w:ilvl w:val="0"/>
+          <w:numId w:val="5"/>
+        </w:numPr>
+      </w:pPr>
+      <w:r>
+        <w:t>Providers upload a corrected version. Older versions are preserved, so nothing is lost.</w:t>
       </w:r>
     </w:p>
     <w:p>
@@ -1244,53 +1258,122 @@
           <w:b/>
           <w:bCs/>
         </w:rPr>
-        <w:t>Creating applications and uploading documents (0:14)</w:t>
-      </w:r>
-    </w:p>
-    <w:p>
-      <w:pPr>
-        <w:numPr>
-          <w:ilvl w:val="0"/>
-          <w:numId w:val="4"/>
-        </w:numPr>
-      </w:pPr>
-      <w:r>
-        <w:t xml:space="preserve">Service </w:t>
-      </w:r>
-      <w:r>
-        <w:t>Providers create a new application and upload its documents themselves.</w:t>
-      </w:r>
-    </w:p>
-    <w:p>
-      <w:pPr>
-        <w:numPr>
-          <w:ilvl w:val="0"/>
-          <w:numId w:val="4"/>
-        </w:numPr>
-      </w:pPr>
-      <w:r>
-        <w:t xml:space="preserve">Select the correct service </w:t>
-      </w:r>
-      <w:r>
-        <w:t>provider and</w:t>
-      </w:r>
-      <w:r>
-        <w:t xml:space="preserve"> expect document requirements to differ by investment type.</w:t>
-      </w:r>
-    </w:p>
-    <w:p>
-      <w:pPr>
-        <w:numPr>
-          <w:ilvl w:val="0"/>
-          <w:numId w:val="4"/>
-        </w:numPr>
-        <w:rPr/>
+        <w:t>Conversations (0:14)</w:t>
+      </w:r>
+    </w:p>
+    <w:p>
+      <w:pPr>
+        <w:numPr>
+          <w:ilvl w:val="0"/>
+          <w:numId w:val="6"/>
+        </w:numPr>
+      </w:pPr>
+      <w:r>
+        <w:t>Use portal messaging to talk to the team about an application, in place of email and other channels.</w:t>
+      </w:r>
+    </w:p>
+    <w:p>
+      <w:pPr>
+        <w:rPr>
+          <w:b/>
+          <w:bCs/>
+        </w:rPr>
+      </w:pPr>
+    </w:p>
+    <w:p>
+      <w:r>
+        <w:rPr>
+          <w:b/>
+          <w:bCs/>
+        </w:rPr>
+        <w:t>Your responsibilities (0:30)</w:t>
+      </w:r>
+    </w:p>
+    <w:p>
+      <w:pPr>
+        <w:numPr>
+          <w:ilvl w:val="0"/>
+          <w:numId w:val="7"/>
+        </w:numPr>
+      </w:pPr>
+      <w:r>
+        <w:t>Respond to update requests promptly. The portal time-stamps actions, so the team can see when each was done.</w:t>
+      </w:r>
+    </w:p>
+    <w:p>
+      <w:pPr>
+        <w:numPr>
+          <w:ilvl w:val="0"/>
+          <w:numId w:val="7"/>
+        </w:numPr>
+      </w:pPr>
+      <w:r>
+        <w:t>Upload the correct document in the correct format. For example, a wrongly prepared two-by-two photo will not be accepted for passport purposes.</w:t>
+      </w:r>
+    </w:p>
+    <w:p>
+      <w:pPr>
+        <w:numPr>
+          <w:ilvl w:val="0"/>
+          <w:numId w:val="7"/>
+        </w:numPr>
+      </w:pPr>
+      <w:r>
+        <w:lastRenderedPageBreak/>
+        <w:t>Photos: already-notarized photos may be printed; otherwise, the client must provide them.</w:t>
+      </w:r>
+    </w:p>
+    <w:p>
+      <w:pPr>
+        <w:numPr>
+          <w:ilvl w:val="0"/>
+          <w:numId w:val="7"/>
+        </w:numPr>
+      </w:pPr>
+      <w:r>
+        <w:t>Optional documents will show a "not applicable" status rather than staying pending (once built).</w:t>
+      </w:r>
+    </w:p>
+    <w:p>
+      <w:pPr>
+        <w:numPr>
+          <w:ilvl w:val="0"/>
+          <w:numId w:val="7"/>
+        </w:numPr>
+      </w:pPr>
+      <w:r>
+        <w:t>Keep conversations about an application in the portal.</w:t>
+      </w:r>
+    </w:p>
+    <w:p>
+      <w:pPr>
+        <w:rPr>
+          <w:b/>
+          <w:bCs/>
+        </w:rPr>
+      </w:pPr>
+    </w:p>
+    <w:p>
+      <w:r>
+        <w:rPr>
+          <w:b/>
+          <w:bCs/>
+        </w:rPr>
+        <w:t>Appeals (0:34)</w:t>
+      </w:r>
+    </w:p>
+    <w:p>
+      <w:pPr>
+        <w:numPr>
+          <w:ilvl w:val="0"/>
+          <w:numId w:val="8"/>
+        </w:numPr>
       </w:pPr>
       <w:r>
         <w:rPr>
           <w:lang w:val="en-US"/>
         </w:rPr>
-        <w:t>Duplicate-prevention controls stop the same application being entered twice.</w:t>
+        <w:t>Applicants create appeals through the portal and upload supporting documents to an appeals-specific folder.</w:t>
       </w:r>
     </w:p>
     <w:p>
@@ -1307,201 +1390,20 @@
           <w:b/>
           <w:bCs/>
         </w:rPr>
-        <w:t>Responding to update requests (0:14)</w:t>
-      </w:r>
-    </w:p>
-    <w:p>
-      <w:pPr>
-        <w:numPr>
-          <w:ilvl w:val="0"/>
-          <w:numId w:val="5"/>
-        </w:numPr>
-        <w:rPr/>
-      </w:pPr>
-      <w:r>
-        <w:rPr>
-          <w:lang w:val="en-US"/>
-        </w:rPr>
-        <w:t>The team may request an update on any document, at any stage of the process, including post-approval documents and appeals.</w:t>
-      </w:r>
-    </w:p>
-    <w:p>
-      <w:pPr>
-        <w:numPr>
-          <w:ilvl w:val="0"/>
-          <w:numId w:val="5"/>
-        </w:numPr>
-      </w:pPr>
-      <w:r>
-        <w:t>Providers upload a corrected version. Older versions are preserved, so nothing is lost.</w:t>
-      </w:r>
-    </w:p>
-    <w:p>
-      <w:pPr>
+        <w:t xml:space="preserve">Reporting </w:t>
+      </w:r>
+      <w:r>
         <w:rPr>
           <w:b/>
           <w:bCs/>
         </w:rPr>
-      </w:pPr>
-    </w:p>
-    <w:p>
+        <w:t>P</w:t>
+      </w:r>
       <w:r>
         <w:rPr>
           <w:b/>
           <w:bCs/>
         </w:rPr>
-        <w:t>Conversations (0:14)</w:t>
-      </w:r>
-    </w:p>
-    <w:p>
-      <w:pPr>
-        <w:numPr>
-          <w:ilvl w:val="0"/>
-          <w:numId w:val="6"/>
-        </w:numPr>
-      </w:pPr>
-      <w:r>
-        <w:t>Use portal messaging to talk to the team about an application, in place of email and other channels.</w:t>
-      </w:r>
-    </w:p>
-    <w:p>
-      <w:pPr>
-        <w:rPr>
-          <w:b/>
-          <w:bCs/>
-        </w:rPr>
-      </w:pPr>
-    </w:p>
-    <w:p>
-      <w:r>
-        <w:rPr>
-          <w:b/>
-          <w:bCs/>
-        </w:rPr>
-        <w:t>Your responsibilities (0:30)</w:t>
-      </w:r>
-    </w:p>
-    <w:p>
-      <w:pPr>
-        <w:numPr>
-          <w:ilvl w:val="0"/>
-          <w:numId w:val="7"/>
-        </w:numPr>
-      </w:pPr>
-      <w:r>
-        <w:t>Respond to update requests promptly. The portal time-stamps actions, so the team can see when each was done.</w:t>
-      </w:r>
-    </w:p>
-    <w:p>
-      <w:pPr>
-        <w:numPr>
-          <w:ilvl w:val="0"/>
-          <w:numId w:val="7"/>
-        </w:numPr>
-      </w:pPr>
-      <w:r>
-        <w:t>Upload the correct document in the correct format. For example, a wrongly prepared two-by-two photo will not be accepted for passport purposes.</w:t>
-      </w:r>
-    </w:p>
-    <w:p>
-      <w:pPr>
-        <w:numPr>
-          <w:ilvl w:val="0"/>
-          <w:numId w:val="7"/>
-        </w:numPr>
-      </w:pPr>
-      <w:r>
-        <w:t xml:space="preserve">Photos: already-notarized photos may be printed; </w:t>
-      </w:r>
-      <w:r>
-        <w:t>otherwise,</w:t>
-      </w:r>
-      <w:r>
-        <w:t xml:space="preserve"> the client must provide them.</w:t>
-      </w:r>
-    </w:p>
-    <w:p>
-      <w:pPr>
-        <w:numPr>
-          <w:ilvl w:val="0"/>
-          <w:numId w:val="7"/>
-        </w:numPr>
-      </w:pPr>
-      <w:r>
-        <w:t>Optional documents will show a "not applicable" status rather than staying pending (once built).</w:t>
-      </w:r>
-    </w:p>
-    <w:p>
-      <w:pPr>
-        <w:numPr>
-          <w:ilvl w:val="0"/>
-          <w:numId w:val="7"/>
-        </w:numPr>
-      </w:pPr>
-      <w:r>
-        <w:t>Keep conversations about an application in the portal.</w:t>
-      </w:r>
-    </w:p>
-    <w:p>
-      <w:pPr>
-        <w:rPr>
-          <w:b/>
-          <w:bCs/>
-        </w:rPr>
-      </w:pPr>
-    </w:p>
-    <w:p>
-      <w:r>
-        <w:rPr>
-          <w:b/>
-          <w:bCs/>
-        </w:rPr>
-        <w:t>Appeals (0:34)</w:t>
-      </w:r>
-    </w:p>
-    <w:p>
-      <w:pPr>
-        <w:numPr>
-          <w:ilvl w:val="0"/>
-          <w:numId w:val="8"/>
-        </w:numPr>
-        <w:rPr/>
-      </w:pPr>
-      <w:r>
-        <w:rPr>
-          <w:lang w:val="en-US"/>
-        </w:rPr>
-        <w:t>Applicants create appeals through the portal and upload supporting documents to an appeals-specific folder.</w:t>
-      </w:r>
-    </w:p>
-    <w:p>
-      <w:pPr>
-        <w:rPr>
-          <w:b/>
-          <w:bCs/>
-        </w:rPr>
-      </w:pPr>
-    </w:p>
-    <w:p>
-      <w:r>
-        <w:rPr>
-          <w:b/>
-          <w:bCs/>
-        </w:rPr>
-        <w:t xml:space="preserve">Reporting </w:t>
-      </w:r>
-      <w:r>
-        <w:rPr>
-          <w:b/>
-          <w:bCs/>
-        </w:rPr>
-        <w:t>P</w:t>
-      </w:r>
-      <w:r>
-        <w:rPr>
-          <w:b/>
-          <w:bCs/>
-        </w:rPr>
         <w:t>roblems (0:37)</w:t>
       </w:r>
     </w:p>
@@ -1518,7 +1420,7 @@
       <w:r>
         <w:t xml:space="preserve">email to </w:t>
       </w:r>
-      <w:hyperlink w:history="1" r:id="rId5">
+      <w:hyperlink r:id="rId5" w:history="1">
         <w:r>
           <w:rPr>
             <w:rStyle w:val="Hyperlink"/>
@@ -1567,12 +1469,11 @@
           <w:ilvl w:val="0"/>
           <w:numId w:val="10"/>
         </w:numPr>
-        <w:rPr/>
-      </w:pPr>
-      <w:r>
-        <w:rPr>
-          <w:b w:val="1"/>
-          <w:bCs w:val="1"/>
+      </w:pPr>
+      <w:r>
+        <w:rPr>
+          <w:b/>
+          <w:bCs/>
           <w:lang w:val="en-US"/>
         </w:rPr>
         <w:t>Log in and dashboard (2 min).</w:t>
@@ -1590,12 +1491,11 @@
           <w:ilvl w:val="0"/>
           <w:numId w:val="10"/>
         </w:numPr>
-        <w:rPr/>
-      </w:pPr>
-      <w:r>
-        <w:rPr>
-          <w:b w:val="1"/>
-          <w:bCs w:val="1"/>
+      </w:pPr>
+      <w:r>
+        <w:rPr>
+          <w:b/>
+          <w:bCs/>
           <w:lang w:val="en-US"/>
         </w:rPr>
         <w:t>Create a new application (4 min).</w:t>
@@ -1604,19 +1504,43 @@
         <w:rPr>
           <w:lang w:val="en-US"/>
         </w:rPr>
-        <w:t xml:space="preserve"> Select the service </w:t>
-      </w:r>
-      <w:r>
-        <w:rPr>
+        <w:t xml:space="preserve"> Select the service provider and point out the investment-specific document requirements and the duplicate-prevention controls.</w:t>
+      </w:r>
+    </w:p>
+    <w:p>
+      <w:pPr>
+        <w:numPr>
+          <w:ilvl w:val="0"/>
+          <w:numId w:val="10"/>
+        </w:numPr>
+      </w:pPr>
+      <w:r>
+        <w:rPr>
+          <w:b/>
+          <w:bCs/>
           <w:lang w:val="en-US"/>
         </w:rPr>
-        <w:t>provider and</w:t>
+        <w:t>Upload documents (3 min).</w:t>
       </w:r>
       <w:r>
         <w:rPr>
           <w:lang w:val="en-US"/>
         </w:rPr>
-        <w:t xml:space="preserve"> point out the investment-specific document requirements and the duplicate-prevention controls.</w:t>
+        <w:t xml:space="preserve"> Upload into the application </w:t>
+      </w:r>
+      <w:proofErr w:type="gramStart"/>
+      <w:r>
+        <w:rPr>
+          <w:lang w:val="en-US"/>
+        </w:rPr>
+        <w:t>folder, and</w:t>
+      </w:r>
+      <w:proofErr w:type="gramEnd"/>
+      <w:r>
+        <w:rPr>
+          <w:lang w:val="en-US"/>
+        </w:rPr>
+        <w:t xml:space="preserve"> show the automatically created post-approval and appeals folders.</w:t>
       </w:r>
     </w:p>
     <w:p>
@@ -1625,39 +1549,16 @@
           <w:ilvl w:val="0"/>
           <w:numId w:val="10"/>
         </w:numPr>
-        <w:rPr/>
-      </w:pPr>
-      <w:r>
-        <w:rPr>
-          <w:b w:val="1"/>
-          <w:bCs w:val="1"/>
-          <w:lang w:val="en-US"/>
-        </w:rPr>
-        <w:t>Upload documents (3 min).</w:t>
-      </w:r>
-      <w:r>
-        <w:rPr>
-          <w:lang w:val="en-US"/>
-        </w:rPr>
-        <w:t xml:space="preserve"> Upload into the application </w:t>
-      </w:r>
-      <w:r>
-        <w:rPr>
-          <w:lang w:val="en-US"/>
-        </w:rPr>
-        <w:t>folder,</w:t>
-      </w:r>
-      <w:r>
-        <w:rPr>
-          <w:lang w:val="en-US"/>
-        </w:rPr>
-        <w:t xml:space="preserve"> and</w:t>
-      </w:r>
-      <w:r>
-        <w:rPr>
-          <w:lang w:val="en-US"/>
-        </w:rPr>
-        <w:t xml:space="preserve"> show the automatically created post-approval and appeals folders.</w:t>
+      </w:pPr>
+      <w:r>
+        <w:rPr>
+          <w:b/>
+          <w:bCs/>
+        </w:rPr>
+        <w:t>Respond to an update request (4 min).</w:t>
+      </w:r>
+      <w:r>
+        <w:t xml:space="preserve"> Show a request from the team, preview the document and its comments, upload a corrected version, and show that the older version is preserved. Repeat briefly for a post-approval document.</w:t>
       </w:r>
     </w:p>
     <w:p>
@@ -1672,10 +1573,10 @@
           <w:b/>
           <w:bCs/>
         </w:rPr>
-        <w:t>Respond to an update request (4 min).</w:t>
-      </w:r>
-      <w:r>
-        <w:t xml:space="preserve"> Show a request from the team, preview the document and its comments, upload a corrected version, and show that the older version is preserved. Repeat briefly for a post-approval document.</w:t>
+        <w:t>Conversations (2 min).</w:t>
+      </w:r>
+      <w:r>
+        <w:t xml:space="preserve"> Send and answer a message on an application.</w:t>
       </w:r>
     </w:p>
     <w:p>
@@ -1690,47 +1591,30 @@
           <w:b/>
           <w:bCs/>
         </w:rPr>
-        <w:t>Conversations (2 min).</w:t>
-      </w:r>
-      <w:r>
-        <w:t xml:space="preserve"> Send and answer a message on an application.</w:t>
-      </w:r>
-    </w:p>
-    <w:p>
-      <w:pPr>
-        <w:numPr>
-          <w:ilvl w:val="0"/>
-          <w:numId w:val="10"/>
-        </w:numPr>
-      </w:pPr>
-      <w:r>
+        <w:t>Getting help (1 min).</w:t>
+      </w:r>
+      <w:r>
+        <w:t xml:space="preserve"> Show how to capture a screenshot and post it with a description.</w:t>
+      </w:r>
+    </w:p>
+    <w:p>
+      <w:pPr>
         <w:rPr>
           <w:b/>
           <w:bCs/>
         </w:rPr>
-        <w:t>Getting help (1 min).</w:t>
-      </w:r>
-      <w:r>
-        <w:t xml:space="preserve"> Show how to capture a screenshot and post it with a description.</w:t>
-      </w:r>
-    </w:p>
-    <w:p>
-      <w:pPr>
+      </w:pPr>
+      <w:r>
         <w:rPr>
           <w:b/>
           <w:bCs/>
         </w:rPr>
-      </w:pPr>
-      <w:r>
-        <w:rPr>
-          <w:b/>
-          <w:bCs/>
-        </w:rPr>
         <w:t>Anticipated questions</w:t>
       </w:r>
     </w:p>
     <w:p>
       <w:r>
+        <w:lastRenderedPageBreak/>
         <w:t>Answers below come from the recap. Anything marked "confirm" needs a decision from the team before the session.</w:t>
       </w:r>
     </w:p>
@@ -1939,7 +1823,7 @@
             <w:r>
               <w:t xml:space="preserve">Re-register first, then use Microsoft Office support. Report it in the </w:t>
             </w:r>
-            <w:hyperlink w:history="1" r:id="rId6">
+            <w:hyperlink r:id="rId6" w:history="1">
               <w:r>
                 <w:rPr>
                   <w:rStyle w:val="Hyperlink"/>
@@ -2114,15 +1998,7 @@
           <w:p/>
           <w:p>
             <w:r>
-              <w:t xml:space="preserve">No!  All documents MUST be uploaded via the portal. Where we receive emails, we will redirect you to the portal for </w:t>
-            </w:r>
-            <w:proofErr w:type="gramStart"/>
-            <w:r>
-              <w:t>uploads..</w:t>
-            </w:r>
-            <w:proofErr w:type="gramEnd"/>
-            <w:r>
-              <w:t xml:space="preserve"> </w:t>
+              <w:t xml:space="preserve">No!  All documents MUST be uploaded via the portal. Where we receive emails, we will redirect you to the portal for uploads.. </w:t>
             </w:r>
           </w:p>
         </w:tc>
@@ -2156,6 +2032,7 @@
           <w:b/>
           <w:bCs/>
         </w:rPr>
+        <w:lastRenderedPageBreak/>
         <w:t>Preparation timeline and follow-up</w:t>
       </w:r>
     </w:p>
@@ -2394,254 +2271,491 @@
     </w:p>
     <w:p>
       <w:r>
-        <w:rPr>
-          <w:b/>
-        </w:rPr>
+        <w:lastRenderedPageBreak/>
+        <w:br w:type="page"/>
+      </w:r>
+      <w:r>
+        <w:rPr>
+          <w:b/>
+        </w:rPr>
+        <w:lastRenderedPageBreak/>
         <w:t>SECURITY TALKING POINTS</w:t>
       </w:r>
     </w:p>
     <w:p>
-      <w:r>
-        <w:t>Say this in plain English. Short lines. Stop after each block and ask if it is clear.</w:t>
-      </w:r>
-    </w:p>
-    <w:p>
-      <w:r>
-        <w:t>This is not a technical lecture. It is so a partner or a case handler can repeat it to a client.</w:t>
-      </w:r>
-    </w:p>
-    <w:p/>
-    <w:p>
-      <w:r>
-        <w:rPr>
-          <w:b/>
-        </w:rPr>
-        <w:t>This is our portal</w:t>
-      </w:r>
-    </w:p>
-    <w:p>
-      <w:pPr>
-        <w:pStyle w:val="ListParagraph"/>
-      </w:pPr>
-      <w:r>
-        <w:t>Built in-house by TM ANTOINE. Not a rented or white-label product.</w:t>
-      </w:r>
-    </w:p>
-    <w:p>
-      <w:pPr>
-        <w:pStyle w:val="ListParagraph"/>
-      </w:pPr>
-      <w:r>
-        <w:t>Live site: portal.tmantoinelaw.com</w:t>
-      </w:r>
-    </w:p>
-    <w:p>
-      <w:pPr>
-        <w:pStyle w:val="ListParagraph"/>
-      </w:pPr>
-      <w:r>
-        <w:t>Live mail: portal@tmantoinelaw.com and support@tmantoinelaw.com</w:t>
-      </w:r>
-    </w:p>
-    <w:p>
-      <w:pPr>
-        <w:pStyle w:val="ListParagraph"/>
-      </w:pPr>
-      <w:r>
-        <w:t>support@tmantoine.com was staging. Do not use it.</w:t>
-      </w:r>
-    </w:p>
-    <w:p>
-      <w:pPr>
-        <w:pStyle w:val="ListParagraph"/>
-      </w:pPr>
-      <w:r>
-        <w:t>If the address bar is not portal.tmantoinelaw.com, stop. Email support before anyone types a password or a code.</w:t>
-      </w:r>
-    </w:p>
-    <w:p/>
-    <w:p>
-      <w:r>
-        <w:rPr>
-          <w:b/>
-        </w:rPr>
-        <w:t>Who can get in</w:t>
-      </w:r>
-    </w:p>
-    <w:p>
-      <w:pPr>
-        <w:pStyle w:val="ListParagraph"/>
-      </w:pPr>
-      <w:r>
-        <w:t>Four kinds of access only.</w:t>
-      </w:r>
-    </w:p>
-    <w:p>
-      <w:pPr>
-        <w:pStyle w:val="ListParagraph"/>
-      </w:pPr>
-      <w:r>
-        <w:t>Service provider — works every CIP file for your firm, not only the ones they created.</w:t>
-      </w:r>
-    </w:p>
-    <w:p>
-      <w:pPr>
-        <w:pStyle w:val="ListParagraph"/>
-      </w:pPr>
-      <w:r>
-        <w:t>Service provider admin — invites and removes people at your firm.</w:t>
-      </w:r>
-    </w:p>
-    <w:p>
-      <w:pPr>
-        <w:pStyle w:val="ListParagraph"/>
-      </w:pPr>
-      <w:r>
-        <w:t>CRO / reviewing officer — TM ANTOINE review. Not your staff.</w:t>
-      </w:r>
-    </w:p>
-    <w:p>
-      <w:pPr>
-        <w:pStyle w:val="ListParagraph"/>
-      </w:pPr>
-      <w:r>
-        <w:t>Administrator — TM ANTOINE only. Approves new accounts.</w:t>
-      </w:r>
-    </w:p>
-    <w:p>
-      <w:pPr>
-        <w:pStyle w:val="ListParagraph"/>
-      </w:pPr>
-      <w:r>
-        <w:t>Path: your admin invites → the person accepts → TM ANTOINE approves → then they can sign in.</w:t>
-      </w:r>
-    </w:p>
-    <w:p>
-      <w:pPr>
-        <w:pStyle w:val="ListParagraph"/>
-      </w:pPr>
-      <w:r>
-        <w:t>No approval, no access.</w:t>
-      </w:r>
-    </w:p>
-    <w:p>
-      <w:pPr>
-        <w:pStyle w:val="ListParagraph"/>
+      <w:pPr>
+        <w:rPr>
+          <w:lang w:val="en-US"/>
+        </w:rPr>
+      </w:pPr>
+    </w:p>
+    <w:p>
+      <w:r>
+        <w:rPr>
+          <w:b/>
+        </w:rPr>
+        <w:t>The short version</w:t>
+      </w:r>
+    </w:p>
+    <w:p>
+      <w:pPr>
+        <w:pStyle w:val="ListParagraph"/>
+        <w:numPr>
+          <w:ilvl w:val="0"/>
+          <w:numId w:val="3"/>
+        </w:numPr>
+      </w:pPr>
+      <w:r>
+        <w:t xml:space="preserve">The portal is built for confidential client work. </w:t>
+      </w:r>
+      <w:r>
+        <w:t>That is what it is for.</w:t>
+      </w:r>
+    </w:p>
+    <w:p>
+      <w:pPr>
+        <w:pStyle w:val="ListParagraph"/>
+        <w:numPr>
+          <w:ilvl w:val="0"/>
+          <w:numId w:val="3"/>
+        </w:numPr>
+      </w:pPr>
+      <w:r>
+        <w:t>Heavy security is already in place: approved accounts only, two checks at sign-in, country limits, filtered traffic, locked files, scanned uploads, and a log of every action.</w:t>
+      </w:r>
+    </w:p>
+    <w:p>
+      <w:pPr>
+        <w:pStyle w:val="ListParagraph"/>
+        <w:numPr>
+          <w:ilvl w:val="0"/>
+          <w:numId w:val="3"/>
+        </w:numPr>
+      </w:pPr>
+      <w:r>
+        <w:t>It is ready to hold and work on confidential information today.</w:t>
+      </w:r>
+    </w:p>
+    <w:p>
+      <w:pPr>
+        <w:pStyle w:val="ListParagraph"/>
+        <w:numPr>
+          <w:ilvl w:val="0"/>
+          <w:numId w:val="3"/>
+        </w:numPr>
+      </w:pPr>
+      <w:r>
+        <w:t>Built in-house by TM ANTOINE.</w:t>
+      </w:r>
+    </w:p>
+    <w:p>
+      <w:pPr>
+        <w:pStyle w:val="ListParagraph"/>
+        <w:numPr>
+          <w:ilvl w:val="0"/>
+          <w:numId w:val="3"/>
+        </w:numPr>
+      </w:pPr>
+      <w:r>
+        <w:t>Live site: portal.tmantoinelaw.com. Live mail:</w:t>
+      </w:r>
+      <w:r>
+        <w:rPr>
+          <w:lang w:val="en-US"/>
+        </w:rPr>
+        <w:t xml:space="preserve"> </w:t>
+      </w:r>
+      <w:r>
+        <w:t>support@tmantoinelaw.com.</w:t>
+      </w:r>
+    </w:p>
+    <w:p>
+      <w:r>
+        <w:rPr>
+          <w:b/>
+        </w:rPr>
+        <w:t>Who can enter the portal</w:t>
+      </w:r>
+    </w:p>
+    <w:p>
+      <w:pPr>
+        <w:pStyle w:val="ListParagraph"/>
+        <w:numPr>
+          <w:ilvl w:val="0"/>
+          <w:numId w:val="3"/>
+        </w:numPr>
+      </w:pPr>
+      <w:r>
+        <w:t>There are four kinds of access. Your firm only ever holds the first two.</w:t>
+      </w:r>
+    </w:p>
+    <w:p>
+      <w:pPr>
+        <w:pStyle w:val="ListParagraph"/>
+        <w:numPr>
+          <w:ilvl w:val="0"/>
+          <w:numId w:val="3"/>
+        </w:numPr>
+      </w:pPr>
+      <w:r>
+        <w:t>Service provider</w:t>
+      </w:r>
+      <w:r>
+        <w:t xml:space="preserve"> a named person at your firm. Works every CIP file that belongs to your company, not only the ones they created.</w:t>
+      </w:r>
+    </w:p>
+    <w:p>
+      <w:pPr>
+        <w:pStyle w:val="ListParagraph"/>
+        <w:numPr>
+          <w:ilvl w:val="0"/>
+          <w:numId w:val="3"/>
+        </w:numPr>
+      </w:pPr>
+      <w:r>
+        <w:t>Service provider admin</w:t>
+      </w:r>
+      <w:r>
+        <w:t xml:space="preserve"> the person your firm names to us. Invites colleagues and removes them when someone leaves.</w:t>
+      </w:r>
+    </w:p>
+    <w:p>
+      <w:pPr>
+        <w:pStyle w:val="ListParagraph"/>
+        <w:numPr>
+          <w:ilvl w:val="0"/>
+          <w:numId w:val="3"/>
+        </w:numPr>
+      </w:pPr>
+      <w:r>
+        <w:t>CRO / reviewing officer</w:t>
+      </w:r>
+      <w:r>
+        <w:t xml:space="preserve"> a TM ANTOINE officer who reviews files. Not your staff.</w:t>
+      </w:r>
+    </w:p>
+    <w:p>
+      <w:pPr>
+        <w:pStyle w:val="ListParagraph"/>
+        <w:numPr>
+          <w:ilvl w:val="0"/>
+          <w:numId w:val="3"/>
+        </w:numPr>
+      </w:pPr>
+      <w:r>
+        <w:t xml:space="preserve">Administrator </w:t>
+      </w:r>
+      <w:r>
+        <w:t>TM ANTOINE only. Approves new accounts and holds firm-wide settings. No service-provider person is one.</w:t>
+      </w:r>
+    </w:p>
+    <w:p>
+      <w:r>
+        <w:rPr>
+          <w:b/>
+        </w:rPr>
+        <w:t>How a person at your firm gets an account</w:t>
+      </w:r>
+    </w:p>
+    <w:p>
+      <w:pPr>
+        <w:pStyle w:val="ListParagraph"/>
+        <w:numPr>
+          <w:ilvl w:val="0"/>
+          <w:numId w:val="3"/>
+        </w:numPr>
+      </w:pPr>
+      <w:r>
+        <w:t>Nobody reaches the portal until TM ANTOINE approves the account.</w:t>
+      </w:r>
+    </w:p>
+    <w:p>
+      <w:pPr>
+        <w:pStyle w:val="ListParagraph"/>
+        <w:numPr>
+          <w:ilvl w:val="0"/>
+          <w:numId w:val="3"/>
+        </w:numPr>
+      </w:pPr>
+      <w:r>
+        <w:t>Step 1: your service-provider admin invites the person.</w:t>
+      </w:r>
+    </w:p>
+    <w:p>
+      <w:pPr>
+        <w:pStyle w:val="ListParagraph"/>
+        <w:numPr>
+          <w:ilvl w:val="0"/>
+          <w:numId w:val="3"/>
+        </w:numPr>
+      </w:pPr>
+      <w:r>
+        <w:t>Step 2: the person accepts the invitation.</w:t>
+      </w:r>
+    </w:p>
+    <w:p>
+      <w:pPr>
+        <w:pStyle w:val="ListParagraph"/>
+        <w:numPr>
+          <w:ilvl w:val="0"/>
+          <w:numId w:val="3"/>
+        </w:numPr>
+      </w:pPr>
+      <w:r>
+        <w:t>Step 3: TM ANTOINE still has to approve it.</w:t>
+      </w:r>
+    </w:p>
+    <w:p>
+      <w:pPr>
+        <w:pStyle w:val="ListParagraph"/>
+        <w:numPr>
+          <w:ilvl w:val="0"/>
+          <w:numId w:val="3"/>
+        </w:numPr>
+      </w:pPr>
+      <w:r>
+        <w:t>Step 4: only then can they sign in.</w:t>
+      </w:r>
+    </w:p>
+    <w:p>
+      <w:pPr>
+        <w:pStyle w:val="ListParagraph"/>
+        <w:numPr>
+          <w:ilvl w:val="0"/>
+          <w:numId w:val="3"/>
+        </w:numPr>
+      </w:pPr>
+      <w:r>
+        <w:t>An invitation on its own is not enough. That second human check is on purpose.</w:t>
+      </w:r>
+    </w:p>
+    <w:p>
+      <w:pPr>
+        <w:pStyle w:val="ListParagraph"/>
+        <w:numPr>
+          <w:ilvl w:val="0"/>
+          <w:numId w:val="3"/>
+        </w:numPr>
       </w:pPr>
       <w:r>
         <w:t>When someone leaves your firm, your admin removes them that day. We are notified.</w:t>
       </w:r>
     </w:p>
-    <w:p/>
-    <w:p>
-      <w:r>
-        <w:rPr>
-          <w:b/>
-        </w:rPr>
-        <w:t>Sign-in</w:t>
-      </w:r>
-    </w:p>
-    <w:p>
-      <w:pPr>
-        <w:pStyle w:val="ListParagraph"/>
-      </w:pPr>
-      <w:r>
-        <w:t>Today: if the device changes, a six-digit code is sent only to the email already on the account.</w:t>
-      </w:r>
-    </w:p>
-    <w:p>
-      <w:pPr>
-        <w:pStyle w:val="ListParagraph"/>
-      </w:pPr>
-      <w:r>
-        <w:t>Nobody can send that code to a new address they type in.</w:t>
-      </w:r>
-    </w:p>
-    <w:p>
-      <w:pPr>
-        <w:pStyle w:val="ListParagraph"/>
-      </w:pPr>
-      <w:r>
-        <w:t>After this webinar: every service-provider account must use an authenticator app.</w:t>
-      </w:r>
-    </w:p>
-    <w:p>
-      <w:pPr>
-        <w:pStyle w:val="ListParagraph"/>
-      </w:pPr>
-      <w:r>
-        <w:t>Password plus email will not be enough.</w:t>
-      </w:r>
-    </w:p>
-    <w:p>
-      <w:pPr>
-        <w:pStyle w:val="ListParagraph"/>
-      </w:pPr>
-      <w:r>
-        <w:t>Keep recovery codes offline. Never send a code in chat, email, or to the assistant.</w:t>
-      </w:r>
-    </w:p>
-    <w:p/>
-    <w:p>
-      <w:r>
-        <w:rPr>
-          <w:b/>
-        </w:rPr>
-        <w:t>Where you can use it</w:t>
-      </w:r>
-    </w:p>
-    <w:p>
-      <w:pPr>
-        <w:pStyle w:val="ListParagraph"/>
-      </w:pPr>
-      <w:r>
-        <w:t>The portal is limited to countries where our service-provider clients actually work.</w:t>
-      </w:r>
-    </w:p>
-    <w:p>
-      <w:pPr>
-        <w:pStyle w:val="ListParagraph"/>
-      </w:pPr>
-      <w:r>
-        <w:t>North Korea, South Korea and Russia cannot reach it.</w:t>
-      </w:r>
-    </w:p>
-    <w:p>
-      <w:pPr>
-        <w:pStyle w:val="ListParagraph"/>
-      </w:pPr>
-      <w:r>
-        <w:t>If the page asks you to turn a VPN off, do that. That is the control working.</w:t>
-      </w:r>
-    </w:p>
-    <w:p/>
-    <w:p>
-      <w:r>
-        <w:rPr>
-          <w:b/>
-        </w:rPr>
-        <w:t>How data is protected</w:t>
-      </w:r>
-    </w:p>
-    <w:p>
-      <w:pPr>
-        <w:pStyle w:val="ListParagraph"/>
-      </w:pPr>
-      <w:r>
-        <w:t>On the way: the lock in the browser (https). Someone watching the network cannot read the pages or files.</w:t>
-      </w:r>
-    </w:p>
-    <w:p>
-      <w:pPr>
-        <w:pStyle w:val="ListParagraph"/>
-      </w:pPr>
-      <w:r>
-        <w:t>At rest: files are stored locked. Opening them needs the portal.</w:t>
-      </w:r>
-    </w:p>
-    <w:p>
-      <w:pPr>
-        <w:pStyle w:val="ListParagraph"/>
+    <w:p>
+      <w:r>
+        <w:rPr>
+          <w:b/>
+        </w:rPr>
+        <w:t>How sign-in works today, and what changes after this webinar</w:t>
+      </w:r>
+    </w:p>
+    <w:p>
+      <w:pPr>
+        <w:pStyle w:val="ListParagraph"/>
+        <w:numPr>
+          <w:ilvl w:val="0"/>
+          <w:numId w:val="3"/>
+        </w:numPr>
+      </w:pPr>
+      <w:r>
+        <w:t xml:space="preserve">Today: if the device </w:t>
+      </w:r>
+      <w:r>
+        <w:rPr>
+          <w:lang w:val="en-US"/>
+        </w:rPr>
+        <w:t xml:space="preserve">or browser </w:t>
+      </w:r>
+      <w:r>
+        <w:t>changes, the portal sends a six-digit code.</w:t>
+      </w:r>
+    </w:p>
+    <w:p>
+      <w:pPr>
+        <w:pStyle w:val="ListParagraph"/>
+        <w:numPr>
+          <w:ilvl w:val="0"/>
+          <w:numId w:val="3"/>
+        </w:numPr>
+      </w:pPr>
+      <w:r>
+        <w:t>That code goes only to the email already on the account. Never to a new address someone types in.</w:t>
+      </w:r>
+    </w:p>
+    <w:p>
+      <w:pPr>
+        <w:pStyle w:val="ListParagraph"/>
+        <w:numPr>
+          <w:ilvl w:val="0"/>
+          <w:numId w:val="3"/>
+        </w:numPr>
+      </w:pPr>
+      <w:r>
+        <w:t xml:space="preserve">After this webinar: every service-provider account must connect an authenticator app </w:t>
+      </w:r>
+      <w:r>
+        <w:t xml:space="preserve"> Google Authenticator</w:t>
+      </w:r>
+      <w:r>
+        <w:rPr>
+          <w:lang w:val="en-US"/>
+        </w:rPr>
+        <w:t xml:space="preserve"> or </w:t>
+      </w:r>
+      <w:r>
+        <w:t>Microsoft Authenticator</w:t>
+      </w:r>
+    </w:p>
+    <w:p>
+      <w:pPr>
+        <w:pStyle w:val="ListParagraph"/>
+        <w:numPr>
+          <w:ilvl w:val="0"/>
+          <w:numId w:val="3"/>
+        </w:numPr>
+      </w:pPr>
+      <w:r>
+        <w:t>A password plus an email will no longer be enough. Without the phone, nobody gets in.</w:t>
+      </w:r>
+    </w:p>
+    <w:p>
+      <w:pPr>
+        <w:pStyle w:val="ListParagraph"/>
+        <w:numPr>
+          <w:ilvl w:val="0"/>
+          <w:numId w:val="3"/>
+        </w:numPr>
+      </w:pPr>
+      <w:r>
+        <w:t>Set it up in Settings → Account Security → Two-factor authentication.</w:t>
+      </w:r>
+    </w:p>
+    <w:p>
+      <w:pPr>
+        <w:pStyle w:val="ListParagraph"/>
+        <w:numPr>
+          <w:ilvl w:val="0"/>
+          <w:numId w:val="3"/>
+        </w:numPr>
+      </w:pPr>
+      <w:r>
+        <w:lastRenderedPageBreak/>
+        <w:t>Keep the recovery codes offline. They are the only way back in if the phone is lost.</w:t>
+      </w:r>
+    </w:p>
+    <w:p>
+      <w:pPr>
+        <w:pStyle w:val="ListParagraph"/>
+        <w:numPr>
+          <w:ilvl w:val="0"/>
+          <w:numId w:val="3"/>
+        </w:numPr>
+      </w:pPr>
+      <w:r>
+        <w:t>Never send a sign-in code in chat, in email, or to the assistant. Support will never ask for one.</w:t>
+      </w:r>
+    </w:p>
+    <w:p>
+      <w:r>
+        <w:rPr>
+          <w:b/>
+        </w:rPr>
+        <w:t>Where the portal may be used</w:t>
+      </w:r>
+    </w:p>
+    <w:p>
+      <w:pPr>
+        <w:pStyle w:val="ListParagraph"/>
+        <w:numPr>
+          <w:ilvl w:val="0"/>
+          <w:numId w:val="3"/>
+        </w:numPr>
+      </w:pPr>
+      <w:r>
+        <w:t>Access is limited to countries where our service-provider clients actually work.</w:t>
+      </w:r>
+    </w:p>
+    <w:p>
+      <w:pPr>
+        <w:pStyle w:val="ListParagraph"/>
+        <w:numPr>
+          <w:ilvl w:val="0"/>
+          <w:numId w:val="3"/>
+        </w:numPr>
+      </w:pPr>
+      <w:r>
+        <w:t>North Korea, South Korea and Russia are among the places that cannot reach it.</w:t>
+      </w:r>
+    </w:p>
+    <w:p>
+      <w:pPr>
+        <w:pStyle w:val="ListParagraph"/>
+        <w:numPr>
+          <w:ilvl w:val="0"/>
+          <w:numId w:val="3"/>
+        </w:numPr>
+      </w:pPr>
+      <w:r>
+        <w:t>The country is read before a session is created, so a refused visitor never reaches sign-in.</w:t>
+      </w:r>
+    </w:p>
+    <w:p>
+      <w:pPr>
+        <w:pStyle w:val="ListParagraph"/>
+        <w:numPr>
+          <w:ilvl w:val="0"/>
+          <w:numId w:val="3"/>
+        </w:numPr>
+      </w:pPr>
+      <w:r>
+        <w:t>If the page asks you to turn a VPN off, do that. That is the control working, not a fault.</w:t>
+      </w:r>
+    </w:p>
+    <w:p>
+      <w:r>
+        <w:rPr>
+          <w:b/>
+        </w:rPr>
+        <w:t>How the connection and the files are protected</w:t>
+      </w:r>
+    </w:p>
+    <w:p>
+      <w:pPr>
+        <w:pStyle w:val="ListParagraph"/>
+        <w:numPr>
+          <w:ilvl w:val="0"/>
+          <w:numId w:val="3"/>
+        </w:numPr>
+        <w:rPr>
+          <w:color w:val="EE0000"/>
+        </w:rPr>
+      </w:pPr>
+      <w:r>
+        <w:rPr>
+          <w:color w:val="EE0000"/>
+        </w:rPr>
+        <w:t>On the way: the lock in the browser (https). Someone watching the network cannot read the pages or the files.</w:t>
+      </w:r>
+    </w:p>
+    <w:p>
+      <w:pPr>
+        <w:pStyle w:val="ListParagraph"/>
+        <w:numPr>
+          <w:ilvl w:val="0"/>
+          <w:numId w:val="3"/>
+        </w:numPr>
+      </w:pPr>
+      <w:r>
+        <w:t>At rest: files are stored locked, not as open PDFs on a disk.</w:t>
+      </w:r>
+    </w:p>
+    <w:p>
+      <w:pPr>
+        <w:pStyle w:val="ListParagraph"/>
+        <w:numPr>
+          <w:ilvl w:val="0"/>
+          <w:numId w:val="3"/>
+        </w:numPr>
       </w:pPr>
       <w:r>
         <w:t>API keys and secrets stay on the server. Not in the browser. Not in Bespoke AI.</w:t>
@@ -2650,31 +2764,42 @@
     <w:p>
       <w:pPr>
         <w:pStyle w:val="ListParagraph"/>
-      </w:pPr>
-      <w:r>
-        <w:t>Hostile traffic is filtered at the edge before it reaches the application.</w:t>
-      </w:r>
-    </w:p>
-    <w:p>
-      <w:pPr>
-        <w:pStyle w:val="ListParagraph"/>
-      </w:pPr>
-      <w:r>
-        <w:t>Every action is logged: who, what, when. Users cannot edit that log.</w:t>
-      </w:r>
-    </w:p>
-    <w:p/>
-    <w:p>
-      <w:r>
-        <w:rPr>
-          <w:b/>
-        </w:rPr>
-        <w:t>What you may upload</w:t>
-      </w:r>
-    </w:p>
-    <w:p>
-      <w:pPr>
-        <w:pStyle w:val="ListParagraph"/>
+        <w:numPr>
+          <w:ilvl w:val="0"/>
+          <w:numId w:val="3"/>
+        </w:numPr>
+      </w:pPr>
+      <w:r>
+        <w:t>Hostile traffic and automated scanners are filtered at the edge before they reach the application.</w:t>
+      </w:r>
+    </w:p>
+    <w:p>
+      <w:pPr>
+        <w:pStyle w:val="ListParagraph"/>
+        <w:numPr>
+          <w:ilvl w:val="0"/>
+          <w:numId w:val="3"/>
+        </w:numPr>
+      </w:pPr>
+      <w:r>
+        <w:t>Every action is logged: who, what, when, including who opened a document. Users cannot edit that log.</w:t>
+      </w:r>
+    </w:p>
+    <w:p>
+      <w:r>
+        <w:rPr>
+          <w:b/>
+        </w:rPr>
+        <w:t>What may be uploaded</w:t>
+      </w:r>
+    </w:p>
+    <w:p>
+      <w:pPr>
+        <w:pStyle w:val="ListParagraph"/>
+        <w:numPr>
+          <w:ilvl w:val="0"/>
+          <w:numId w:val="3"/>
+        </w:numPr>
       </w:pPr>
       <w:r>
         <w:t>CIP files: PDF or photo only.</w:t>
@@ -2683,6 +2808,10 @@
     <w:p>
       <w:pPr>
         <w:pStyle w:val="ListParagraph"/>
+        <w:numPr>
+          <w:ilvl w:val="0"/>
+          <w:numId w:val="3"/>
+        </w:numPr>
       </w:pPr>
       <w:r>
         <w:t>We read the file itself, not just the name. A renamed program is refused.</w:t>
@@ -2691,28 +2820,61 @@
     <w:p>
       <w:pPr>
         <w:pStyle w:val="ListParagraph"/>
-      </w:pPr>
-      <w:r>
-        <w:t>Public upload links: 5–10 MB. That is a security limit as well as a practical one.</w:t>
-      </w:r>
-    </w:p>
-    <w:p>
-      <w:pPr>
-        <w:pStyle w:val="ListParagraph"/>
-      </w:pPr>
-      <w:r>
-        <w:t>Every upload is scanned for malware. A failed scan cannot be opened or downloaded.</w:t>
-      </w:r>
-    </w:p>
-    <w:p>
-      <w:pPr>
-        <w:pStyle w:val="ListParagraph"/>
+        <w:numPr>
+          <w:ilvl w:val="0"/>
+          <w:numId w:val="3"/>
+        </w:numPr>
+      </w:pPr>
+      <w:r>
+        <w:t xml:space="preserve">Public upload links are capped at 5–10 MB. That is a </w:t>
+      </w:r>
+      <w:r>
+        <w:rPr>
+          <w:b/>
+          <w:bCs/>
+          <w:u w:val="single"/>
+        </w:rPr>
+        <w:t>security limit</w:t>
+      </w:r>
+      <w:r>
+        <w:t xml:space="preserve"> as well as a practical one.</w:t>
+      </w:r>
+    </w:p>
+    <w:p>
+      <w:pPr>
+        <w:pStyle w:val="ListParagraph"/>
+        <w:numPr>
+          <w:ilvl w:val="0"/>
+          <w:numId w:val="3"/>
+        </w:numPr>
+      </w:pPr>
+      <w:r>
+        <w:t xml:space="preserve">Every upload is </w:t>
+      </w:r>
+      <w:r>
+        <w:rPr>
+          <w:b/>
+          <w:bCs/>
+          <w:u w:val="single"/>
+        </w:rPr>
+        <w:t>scanned for malware</w:t>
+      </w:r>
+      <w:r>
+        <w:t>. A file that fails cannot be opened or downloaded.</w:t>
+      </w:r>
+    </w:p>
+    <w:p>
+      <w:pPr>
+        <w:pStyle w:val="ListParagraph"/>
+        <w:numPr>
+          <w:ilvl w:val="0"/>
+          <w:numId w:val="3"/>
+        </w:numPr>
       </w:pPr>
       <w:r>
         <w:t>All documents go through the portal. Do not email them.</w:t>
       </w:r>
     </w:p>
-    <w:p/>
     <w:p>
       <w:r>
         <w:rPr>
@@ -2724,14 +2886,10 @@
     <w:p>
       <w:pPr>
         <w:pStyle w:val="ListParagraph"/>
-      </w:pPr>
-      <w:r>
-        <w:t>Working files sit in the portal store.</w:t>
-      </w:r>
-    </w:p>
-    <w:p>
-      <w:pPr>
-        <w:pStyle w:val="ListParagraph"/>
+        <w:numPr>
+          <w:ilvl w:val="0"/>
+          <w:numId w:val="3"/>
+        </w:numPr>
       </w:pPr>
       <w:r>
         <w:t>A live copy sits in Microsoft 365 / SharePoint.</w:t>
@@ -2740,6 +2898,10 @@
     <w:p>
       <w:pPr>
         <w:pStyle w:val="ListParagraph"/>
+        <w:numPr>
+          <w:ilvl w:val="0"/>
+          <w:numId w:val="3"/>
+        </w:numPr>
       </w:pPr>
       <w:r>
         <w:t>The host takes a daily backup of the site.</w:t>
@@ -2748,61 +2910,93 @@
     <w:p>
       <w:pPr>
         <w:pStyle w:val="ListParagraph"/>
-      </w:pPr>
-      <w:r>
-        <w:t>The app and the database run together, in the United States, with Cloudflare in front.</w:t>
-      </w:r>
-    </w:p>
-    <w:p/>
-    <w:p>
-      <w:r>
-        <w:rPr>
-          <w:b/>
-        </w:rPr>
+        <w:numPr>
+          <w:ilvl w:val="0"/>
+          <w:numId w:val="3"/>
+        </w:numPr>
+      </w:pPr>
+      <w:r>
+        <w:t>The application and the database run together in the United States, with Cloudflare in front.</w:t>
+      </w:r>
+    </w:p>
+    <w:p>
+      <w:pPr>
+        <w:rPr>
+          <w:b/>
+          <w:lang w:val="en-US"/>
+        </w:rPr>
+      </w:pPr>
+    </w:p>
+    <w:p>
+      <w:pPr>
+        <w:rPr>
+          <w:b/>
+          <w:lang w:val="en-US"/>
+        </w:rPr>
+      </w:pPr>
+    </w:p>
+    <w:p>
+      <w:pPr>
+        <w:rPr>
+          <w:b/>
+          <w:lang w:val="en-US"/>
+        </w:rPr>
+      </w:pPr>
+    </w:p>
+    <w:p>
+      <w:r>
+        <w:rPr>
+          <w:b/>
+        </w:rPr>
+        <w:lastRenderedPageBreak/>
         <w:t>Bespoke AI</w:t>
       </w:r>
     </w:p>
     <w:p>
       <w:pPr>
         <w:pStyle w:val="ListParagraph"/>
-      </w:pPr>
-      <w:r>
-        <w:t>Use it. It knows this portal.</w:t>
-      </w:r>
-    </w:p>
-    <w:p>
-      <w:pPr>
-        <w:pStyle w:val="ListParagraph"/>
-      </w:pPr>
-      <w:r>
-        <w:t>Ask how a step works. Ask what is still missing on the file you have open.</w:t>
-      </w:r>
-    </w:p>
-    <w:p>
-      <w:pPr>
-        <w:pStyle w:val="ListParagraph"/>
-      </w:pPr>
-      <w:r>
-        <w:t>Ask who to speak to if something breaks.</w:t>
-      </w:r>
-    </w:p>
-    <w:p>
-      <w:pPr>
-        <w:pStyle w:val="ListParagraph"/>
-      </w:pPr>
-      <w:r>
-        <w:t>It cannot see other firms’ files. It cannot see keys.</w:t>
-      </w:r>
-    </w:p>
-    <w:p>
-      <w:pPr>
-        <w:pStyle w:val="ListParagraph"/>
-      </w:pPr>
-      <w:r>
-        <w:t>Do not paste passwords or authenticator codes into it.</w:t>
-      </w:r>
-    </w:p>
-    <w:p/>
+        <w:numPr>
+          <w:ilvl w:val="0"/>
+          <w:numId w:val="3"/>
+        </w:numPr>
+      </w:pPr>
+      <w:r>
+        <w:t>Use it. It knows this portal</w:t>
+      </w:r>
+      <w:r>
+        <w:rPr>
+          <w:lang w:val="en-US"/>
+        </w:rPr>
+        <w:t xml:space="preserve"> it is a bult in AI trained specifically for this portal</w:t>
+      </w:r>
+      <w:r>
+        <w:t>.</w:t>
+      </w:r>
+    </w:p>
+    <w:p>
+      <w:pPr>
+        <w:pStyle w:val="ListParagraph"/>
+        <w:numPr>
+          <w:ilvl w:val="0"/>
+          <w:numId w:val="3"/>
+        </w:numPr>
+      </w:pPr>
+      <w:r>
+        <w:t>Ask how a step works, or what is still missing on the file you have open.</w:t>
+      </w:r>
+    </w:p>
+    <w:p>
+      <w:pPr>
+        <w:pStyle w:val="ListParagraph"/>
+        <w:numPr>
+          <w:ilvl w:val="0"/>
+          <w:numId w:val="3"/>
+        </w:numPr>
+      </w:pPr>
+      <w:r>
+        <w:t>It cannot see other firms' files. It cannot see keys.</w:t>
+      </w:r>
+    </w:p>
     <w:p>
       <w:r>
         <w:rPr>
@@ -2814,22 +3008,40 @@
     <w:p>
       <w:pPr>
         <w:pStyle w:val="ListParagraph"/>
-      </w:pPr>
-      <w:r>
-        <w:t>Email support@tmantoinelaw.com</w:t>
-      </w:r>
-    </w:p>
-    <w:p>
-      <w:pPr>
-        <w:pStyle w:val="ListParagraph"/>
-      </w:pPr>
-      <w:r>
-        <w:t>That mailbox is shared with TM ANTOINE admins. Aim: a reply within an hour, if people are available.</w:t>
-      </w:r>
-    </w:p>
-    <w:p>
-      <w:pPr>
-        <w:pStyle w:val="ListParagraph"/>
+        <w:numPr>
+          <w:ilvl w:val="0"/>
+          <w:numId w:val="3"/>
+        </w:numPr>
+      </w:pPr>
+      <w:r>
+        <w:t>Email support@tmantoinelaw.com. That mailbox is shared with TM ANTOINE admins.</w:t>
+      </w:r>
+    </w:p>
+    <w:p>
+      <w:pPr>
+        <w:pStyle w:val="ListParagraph"/>
+        <w:numPr>
+          <w:ilvl w:val="0"/>
+          <w:numId w:val="3"/>
+        </w:numPr>
+      </w:pPr>
+      <w:r>
+        <w:rPr>
+          <w:lang w:val="en-US"/>
+        </w:rPr>
+        <w:t xml:space="preserve">Get </w:t>
+      </w:r>
+      <w:r>
+        <w:t>a reply within an hour, if people are available.</w:t>
+      </w:r>
+    </w:p>
+    <w:p>
+      <w:pPr>
+        <w:pStyle w:val="ListParagraph"/>
+        <w:numPr>
+          <w:ilvl w:val="0"/>
+          <w:numId w:val="3"/>
+        </w:numPr>
       </w:pPr>
       <w:r>
         <w:t>Vernon Francis is the main technical contact.</w:t>
@@ -2838,28 +3050,68 @@
     <w:p>
       <w:pPr>
         <w:pStyle w:val="ListParagraph"/>
-      </w:pPr>
-      <w:r>
-        <w:t>You can also message Cindy McLean, Emmanuel McLean, Krishna Manru, or Vernon in the portal.</w:t>
-      </w:r>
-    </w:p>
-    <w:p>
-      <w:pPr>
-        <w:pStyle w:val="ListParagraph"/>
-      </w:pPr>
-      <w:r>
-        <w:t>Send: the page, the account email, the CIP number if there is one, and what you clicked.</w:t>
-      </w:r>
-    </w:p>
-    <w:p>
-      <w:pPr>
-        <w:pStyle w:val="ListParagraph"/>
+        <w:numPr>
+          <w:ilvl w:val="0"/>
+          <w:numId w:val="3"/>
+        </w:numPr>
+      </w:pPr>
+      <w:r>
+        <w:t>If you can still sign in, message Cindy McLean, Emmanuel McLean, Krishna M</w:t>
+      </w:r>
+      <w:proofErr w:type="spellStart"/>
+      <w:r>
+        <w:rPr>
+          <w:lang w:val="en-US"/>
+        </w:rPr>
+        <w:t>onrose</w:t>
+      </w:r>
+      <w:proofErr w:type="spellEnd"/>
+      <w:r>
+        <w:t xml:space="preserve">, or Vernon </w:t>
+      </w:r>
+      <w:r>
+        <w:rPr>
+          <w:lang w:val="en-US"/>
+        </w:rPr>
+        <w:t>Francis</w:t>
+      </w:r>
+      <w:r>
+        <w:t>in the portal.</w:t>
+      </w:r>
+      <w:r>
+        <w:rPr>
+          <w:lang w:val="en-US"/>
+        </w:rPr>
+        <w:t xml:space="preserve"> Bespoke AI can also help with messaging either one of the admins in the portal</w:t>
+      </w:r>
+    </w:p>
+    <w:p>
+      <w:pPr>
+        <w:pStyle w:val="ListParagraph"/>
+        <w:numPr>
+          <w:ilvl w:val="0"/>
+          <w:numId w:val="3"/>
+        </w:numPr>
+      </w:pPr>
+      <w:r>
+        <w:t>S</w:t>
+      </w:r>
+      <w:r>
+        <w:t>end: the page you were on, the account email, the CIP number if there is one, and what you clicked.</w:t>
+      </w:r>
+    </w:p>
+    <w:p>
+      <w:pPr>
+        <w:pStyle w:val="ListParagraph"/>
+        <w:numPr>
+          <w:ilvl w:val="0"/>
+          <w:numId w:val="3"/>
+        </w:numPr>
       </w:pPr>
       <w:r>
         <w:t>Never send a sign-in code or an authenticator code.</w:t>
       </w:r>
     </w:p>
-    <w:p/>
     <w:p>
       <w:r>
         <w:rPr>
@@ -2871,6 +3123,10 @@
     <w:p>
       <w:pPr>
         <w:pStyle w:val="ListParagraph"/>
+        <w:numPr>
+          <w:ilvl w:val="0"/>
+          <w:numId w:val="3"/>
+        </w:numPr>
       </w:pPr>
       <w:r>
         <w:t>Host: Laravel Cloud on Amazon Web Services, United States, plus Cloudflare.</w:t>
@@ -2879,6 +3135,10 @@
     <w:p>
       <w:pPr>
         <w:pStyle w:val="ListParagraph"/>
+        <w:numPr>
+          <w:ilvl w:val="0"/>
+          <w:numId w:val="3"/>
+        </w:numPr>
       </w:pPr>
       <w:r>
         <w:t>Encrypted in transit and at rest. Yes.</w:t>
@@ -2887,6 +3147,10 @@
     <w:p>
       <w:pPr>
         <w:pStyle w:val="ListParagraph"/>
+        <w:numPr>
+          <w:ilvl w:val="0"/>
+          <w:numId w:val="3"/>
+        </w:numPr>
       </w:pPr>
       <w:r>
         <w:t>Company members see every application for the company, not only their own.</w:t>
@@ -2895,14 +3159,32 @@
     <w:p>
       <w:pPr>
         <w:pStyle w:val="ListParagraph"/>
-      </w:pPr>
-      <w:r>
+        <w:numPr>
+          <w:ilvl w:val="0"/>
+          <w:numId w:val="3"/>
+        </w:numPr>
+        <w:rPr>
+          <w:b/>
+          <w:bCs/>
+          <w:u w:val="single"/>
+        </w:rPr>
+      </w:pPr>
+      <w:r>
+        <w:rPr>
+          <w:b/>
+          <w:bCs/>
+          <w:u w:val="single"/>
+        </w:rPr>
         <w:t>Data Processing Agreement: yes, pending review by our legal team.</w:t>
       </w:r>
     </w:p>
     <w:p>
       <w:pPr>
         <w:pStyle w:val="ListParagraph"/>
+        <w:numPr>
+          <w:ilvl w:val="0"/>
+          <w:numId w:val="3"/>
+        </w:numPr>
       </w:pPr>
       <w:r>
         <w:t>We collect only what the applications need.</w:t>
@@ -2911,14 +3193,25 @@
     <w:p>
       <w:pPr>
         <w:pStyle w:val="ListParagraph"/>
-      </w:pPr>
-      <w:r>
-        <w:t>We send onwards only what the Citizenship by Investment Unit, NIC and Immigration need — same practice as before the portal.</w:t>
-      </w:r>
-    </w:p>
-    <w:p>
-      <w:pPr>
-        <w:pStyle w:val="ListParagraph"/>
+        <w:numPr>
+          <w:ilvl w:val="0"/>
+          <w:numId w:val="3"/>
+        </w:numPr>
+      </w:pPr>
+      <w:r>
+        <w:t>We send onwards only what the Citizenship by Investment Unit, NIC and Immigration need</w:t>
+      </w:r>
+      <w:r>
+        <w:t xml:space="preserve"> same practice as before the portal.</w:t>
+      </w:r>
+    </w:p>
+    <w:p>
+      <w:pPr>
+        <w:pStyle w:val="ListParagraph"/>
+        <w:numPr>
+          <w:ilvl w:val="0"/>
+          <w:numId w:val="3"/>
+        </w:numPr>
       </w:pPr>
       <w:r>
         <w:t>We keep the file unless the applicant asks us to delete it after the case is closed.</w:t>
@@ -2927,6 +3220,10 @@
     <w:p>
       <w:pPr>
         <w:pStyle w:val="ListParagraph"/>
+        <w:numPr>
+          <w:ilvl w:val="0"/>
+          <w:numId w:val="3"/>
+        </w:numPr>
       </w:pPr>
       <w:r>
         <w:t>Other processors: AWS, Cloudflare (including file storage), Microsoft 365 / SharePoint.</w:t>
@@ -2935,64 +3232,117 @@
     <w:p>
       <w:pPr>
         <w:pStyle w:val="ListParagraph"/>
+        <w:numPr>
+          <w:ilvl w:val="0"/>
+          <w:numId w:val="3"/>
+        </w:numPr>
       </w:pPr>
       <w:r>
         <w:t>If personal data is breached, we tell affected firms without delay. The written playbook is being finished.</w:t>
       </w:r>
     </w:p>
-    <w:p/>
-    <w:p>
-      <w:r>
-        <w:rPr>
-          <w:b/>
-        </w:rPr>
-        <w:t>Testing — say this honestly</w:t>
-      </w:r>
-    </w:p>
-    <w:p>
-      <w:pPr>
-        <w:pStyle w:val="ListParagraph"/>
-      </w:pPr>
-      <w:r>
-        <w:t>We have already tested the portal: injection, unsafe uploads, and access between accounts.</w:t>
-      </w:r>
-    </w:p>
-    <w:p>
-      <w:pPr>
-        <w:pStyle w:val="ListParagraph"/>
-      </w:pPr>
-      <w:r>
-        <w:t>A full independent penetration test is not finished yet.</w:t>
-      </w:r>
-    </w:p>
-    <w:p>
-      <w:pPr>
-        <w:pStyle w:val="ListParagraph"/>
-      </w:pPr>
-      <w:r>
-        <w:t>We do not hold ISO 27001 or SOC 2 today.</w:t>
-      </w:r>
-    </w:p>
-    <w:p>
-      <w:pPr>
-        <w:pStyle w:val="ListParagraph"/>
+    <w:p>
+      <w:r>
+        <w:rPr>
+          <w:b/>
+        </w:rPr>
+        <w:t>Certification — say this plainly</w:t>
+      </w:r>
+    </w:p>
+    <w:p>
+      <w:pPr>
+        <w:pStyle w:val="ListParagraph"/>
+        <w:numPr>
+          <w:ilvl w:val="0"/>
+          <w:numId w:val="3"/>
+        </w:numPr>
+      </w:pPr>
+      <w:r>
+        <w:t>ISO 27001 and SOC 2: we are working on them now. We do not hold them yet.</w:t>
+      </w:r>
+    </w:p>
+    <w:p>
+      <w:pPr>
+        <w:pStyle w:val="ListParagraph"/>
+        <w:numPr>
+          <w:ilvl w:val="0"/>
+          <w:numId w:val="3"/>
+        </w:numPr>
+      </w:pPr>
+      <w:r>
+        <w:t>We have already tested the portal ourselves: injection, unsafe uploads, and access between accounts.</w:t>
+      </w:r>
+    </w:p>
+    <w:p>
+      <w:pPr>
+        <w:pStyle w:val="ListParagraph"/>
+        <w:numPr>
+          <w:ilvl w:val="0"/>
+          <w:numId w:val="3"/>
+        </w:numPr>
+      </w:pPr>
+      <w:r>
+        <w:t>A full independent penetration test is under way and not finished.</w:t>
+      </w:r>
+    </w:p>
+    <w:p>
+      <w:pPr>
+        <w:pStyle w:val="ListParagraph"/>
+        <w:numPr>
+          <w:ilvl w:val="0"/>
+          <w:numId w:val="3"/>
+        </w:numPr>
       </w:pPr>
       <w:r>
         <w:t>We will share the outcome when that work is done.</w:t>
       </w:r>
     </w:p>
-    <w:p/>
-    <w:p>
-      <w:r>
-        <w:rPr>
-          <w:b/>
-        </w:rPr>
+    <w:p>
+      <w:pPr>
+        <w:pStyle w:val="ListParagraph"/>
+        <w:numPr>
+          <w:ilvl w:val="0"/>
+          <w:numId w:val="3"/>
+        </w:numPr>
+        <w:rPr>
+          <w:b/>
+          <w:bCs/>
+          <w:u w:val="single"/>
+        </w:rPr>
+      </w:pPr>
+      <w:r>
+        <w:rPr>
+          <w:b/>
+          <w:bCs/>
+          <w:u w:val="single"/>
+        </w:rPr>
+        <w:t>None of that changes the answer to the real question: the portal is heavily secured and ready for confidential client files today.</w:t>
+      </w:r>
+    </w:p>
+    <w:p>
+      <w:pPr>
+        <w:rPr>
+          <w:b/>
+          <w:lang w:val="en-US"/>
+        </w:rPr>
+      </w:pPr>
+    </w:p>
+    <w:p>
+      <w:r>
+        <w:rPr>
+          <w:b/>
+        </w:rPr>
+        <w:lastRenderedPageBreak/>
         <w:t>What we need from you</w:t>
       </w:r>
     </w:p>
     <w:p>
       <w:pPr>
         <w:pStyle w:val="ListParagraph"/>
+        <w:numPr>
+          <w:ilvl w:val="0"/>
+          <w:numId w:val="3"/>
+        </w:numPr>
       </w:pPr>
       <w:r>
         <w:t>Name your service-provider administrator if you have not.</w:t>
@@ -3001,6 +3351,10 @@
     <w:p>
       <w:pPr>
         <w:pStyle w:val="ListParagraph"/>
+        <w:numPr>
+          <w:ilvl w:val="0"/>
+          <w:numId w:val="3"/>
+        </w:numPr>
       </w:pPr>
       <w:r>
         <w:t>Connect an authenticator app after this session.</w:t>
@@ -3009,29 +3363,72 @@
     <w:p>
       <w:pPr>
         <w:pStyle w:val="ListParagraph"/>
-      </w:pPr>
-      <w:r>
-        <w:t>Bookmark portal.tmantoinelaw.com</w:t>
-      </w:r>
-    </w:p>
-    <w:p>
-      <w:pPr>
-        <w:pStyle w:val="ListParagraph"/>
-      </w:pPr>
-      <w:r>
-        <w:t>Use Bespoke AI for “how does this screen work”.</w:t>
-      </w:r>
-    </w:p>
-    <w:p>
-      <w:pPr>
-        <w:pStyle w:val="ListParagraph"/>
-      </w:pPr>
-      <w:r>
-        <w:t>Use support@tmantoinelaw.com or Messages for faults.</w:t>
+        <w:numPr>
+          <w:ilvl w:val="0"/>
+          <w:numId w:val="3"/>
+        </w:numPr>
+      </w:pPr>
+      <w:r>
+        <w:t xml:space="preserve">Bookmark </w:t>
+      </w:r>
+      <w:r>
+        <w:rPr>
+          <w:b/>
+          <w:bCs/>
+          <w:u w:val="single"/>
+        </w:rPr>
+        <w:t>portal.tmantoinelaw.com</w:t>
+      </w:r>
+      <w:r>
+        <w:t xml:space="preserve"> and treat any other host as suspect.</w:t>
+      </w:r>
+    </w:p>
+    <w:p>
+      <w:pPr>
+        <w:pStyle w:val="ListParagraph"/>
+        <w:numPr>
+          <w:ilvl w:val="0"/>
+          <w:numId w:val="3"/>
+        </w:numPr>
+      </w:pPr>
+      <w:r>
+        <w:t xml:space="preserve">Use Bespoke AI for </w:t>
+      </w:r>
+      <w:r>
+        <w:rPr>
+          <w:b/>
+          <w:bCs/>
+        </w:rPr>
+        <w:t>“how does this screen work”</w:t>
+      </w:r>
+      <w:r>
+        <w:t xml:space="preserve"> questions.</w:t>
+      </w:r>
+    </w:p>
+    <w:p>
+      <w:pPr>
+        <w:pStyle w:val="ListParagraph"/>
+        <w:numPr>
+          <w:ilvl w:val="0"/>
+          <w:numId w:val="3"/>
+        </w:numPr>
+      </w:pPr>
+      <w:r>
+        <w:t xml:space="preserve">Use </w:t>
+      </w:r>
+      <w:r>
+        <w:rPr>
+          <w:b/>
+          <w:bCs/>
+        </w:rPr>
+        <w:t>support@tmantoinelaw.com</w:t>
+      </w:r>
+      <w:r>
+        <w:t xml:space="preserve"> or Messages for faults, never for sharing codes.</w:t>
       </w:r>
     </w:p>
     <w:sectPr>
-      <w:pgSz w:w="11906" w:h="16838" w:orient="portrait"/>
+      <w:pgSz w:w="11906" w:h="16838"/>
       <w:pgMar w:top="1440" w:right="1440" w:bottom="1440" w:left="1440" w:header="708" w:footer="708" w:gutter="0"/>
       <w:cols w:space="708"/>
       <w:docGrid w:linePitch="360"/>
@@ -3041,7 +3438,7 @@
 </file>
 
 <file path=word/numbering.xml><?xml version="1.0" encoding="utf-8"?>
-<w:numbering xmlns:wpc="http://schemas.microsoft.com/office/word/2010/wordprocessingCanvas" xmlns:cx="http://schemas.microsoft.com/office/drawing/2014/chartex" xmlns:cx1="http://schemas.microsoft.com/office/drawing/2015/9/8/chartex" xmlns:cx2="http://schemas.microsoft.com/office/drawing/2015/10/21/chartex" xmlns:cx3="http://schemas.microsoft.com/office/drawing/2016/5/9/chartex" xmlns:cx4="http://schemas.microsoft.com/office/drawing/2016/5/10/chartex" xmlns:cx5="http://schemas.microsoft.com/office/drawing/2016/5/11/chartex" xmlns:cx6="http://schemas.microsoft.com/office/drawing/2016/5/12/chartex" xmlns:cx7="http://schemas.microsoft.com/office/drawing/2016/5/13/chartex" xmlns:cx8="http://schemas.microsoft.com/office/drawing/2016/5/14/chartex" xmlns:mc="http://schemas.openxmlformats.org/markup-compatibility/2006" xmlns:aink="http://schemas.microsoft.com/office/drawing/2016/ink" xmlns:am3d="http://schemas.microsoft.com/office/drawing/2017/model3d" xmlns:o="urn:schemas-microsoft-com:office:office" xmlns:oel="http://schemas.microsoft.com/office/2019/extlst" xmlns:r="http://schemas.openxmlformats.org/officeDocument/2006/relationships" xmlns:m="http://schemas.openxmlformats.org/officeDocument/2006/math" xmlns:v="urn:schemas-microsoft-com:vml" xmlns:wp14="http://schemas.microsoft.com/office/word/2010/wordprocessingDrawing" xmlns:wp="http://schemas.openxmlformats.org/drawingml/2006/wordprocessingDrawing" xmlns:w10="urn:schemas-microsoft-com:office:word" xmlns:w="http://schemas.openxmlformats.org/wordprocessingml/2006/main" xmlns:w14="http://schemas.microsoft.com/office/word/2010/wordml" xmlns:w15="http://schemas.microsoft.com/office/word/2012/wordml" xmlns:w16cex="http://schemas.microsoft.com/office/word/2018/wordml/cex" xmlns:w16cid="http://schemas.microsoft.com/office/word/2016/wordml/cid" xmlns:w16="http://schemas.microsoft.com/office/word/2018/wordml" xmlns:w16du="http://schemas.microsoft.com/office/word/2023/wordml/word16du" xmlns:w16sdtdh="http://schemas.microsoft.com/office/word/2020/wordml/sdtdatahash" xmlns:w16sdtfl="http://schemas.microsoft.com/office/word/2024/wordml/sdtformatlock" xmlns:w16se="http://schemas.microsoft.com/office/word/2015/wordml/symex" xmlns:wpg="http://schemas.microsoft.com/office/word/2010/wordprocessingGroup" xmlns:wpi="http://schemas.microsoft.com/office/word/2010/wordprocessingInk" xmlns:wne="http://schemas.microsoft.com/office/word/2006/wordml" xmlns:wps="http://schemas.microsoft.com/office/word/2010/wordprocessingShape" mc:Ignorable="w14 w15 w16se w16cid w16 w16cex w16sdtdh w16sdtfl w16du wp14">
+<w:numbering xmlns:wpc="http://schemas.microsoft.com/office/word/2010/wordprocessingCanvas" xmlns:cx="http://schemas.microsoft.com/office/drawing/2014/chartex" xmlns:cx1="http://schemas.microsoft.com/office/drawing/2015/9/8/chartex" xmlns:cx2="http://schemas.microsoft.com/office/drawing/2015/10/21/chartex" xmlns:cx3="http://schemas.microsoft.com/office/drawing/2016/5/9/chartex" xmlns:cx4="http://schemas.microsoft.com/office/drawing/2016/5/10/chartex" xmlns:cx5="http://schemas.microsoft.com/office/drawing/2016/5/11/chartex" xmlns:cx6="http://schemas.microsoft.com/office/drawing/2016/5/12/chartex" xmlns:cx7="http://schemas.microsoft.com/office/drawing/2016/5/13/chartex" xmlns:cx8="http://schemas.microsoft.com/office/drawing/2016/5/14/chartex" xmlns:mc="http://schemas.openxmlformats.org/markup-compatibility/2006" xmlns:m="http://schemas.openxmlformats.org/officeDocument/2006/math" xmlns:aink="http://schemas.microsoft.com/office/drawing/2016/ink" xmlns:am3d="http://schemas.microsoft.com/office/drawing/2017/model3d" xmlns:oel="http://schemas.microsoft.com/office/2019/extlst" xmlns:r="http://schemas.openxmlformats.org/officeDocument/2006/relationships" xmlns:wp14="http://schemas.microsoft.com/office/word/2010/wordprocessingDrawing" xmlns:wp="http://schemas.openxmlformats.org/drawingml/2006/wordprocessingDrawing" xmlns:wpg="http://schemas.microsoft.com/office/word/2010/wordprocessingGroup" xmlns:wpi="http://schemas.microsoft.com/office/word/2010/wordprocessingInk" xmlns:wps="http://schemas.microsoft.com/office/word/2010/wordprocessingShape" xmlns:o="urn:schemas-microsoft-com:office:office" xmlns:v="urn:schemas-microsoft-com:vml" xmlns:w10="urn:schemas-microsoft-com:office:word" xmlns:w="http://schemas.openxmlformats.org/wordprocessingml/2006/main" xmlns:w14="http://schemas.microsoft.com/office/word/2010/wordml" xmlns:w15="http://schemas.microsoft.com/office/word/2012/wordml" xmlns:w16cex="http://schemas.microsoft.com/office/word/2018/wordml/cex" xmlns:w16cid="http://schemas.microsoft.com/office/word/2016/wordml/cid" xmlns:w16="http://schemas.microsoft.com/office/word/2018/wordml" xmlns:w16sdtdh="http://schemas.microsoft.com/office/word/2020/wordml/sdtdatahash" xmlns:w16sdtfl="http://schemas.microsoft.com/office/word/2024/wordml/sdtformatlock" xmlns:w16se="http://schemas.microsoft.com/office/word/2015/wordml/symex" xmlns:w16du="http://schemas.microsoft.com/office/word/2023/wordml/word16du" xmlns:wne="http://schemas.microsoft.com/office/word/2006/wordml" mc:Ignorable="w14 w15 w16se w16cid w16 w16cex w16sdtdh w16sdtfl w16du wp14">
   <w:abstractNum w:abstractNumId="0" w15:restartNumberingAfterBreak="0">
     <w:nsid w:val="0E3B1824"/>
     <w:multiLevelType w:val="multilevel"/>
@@ -3171,7 +3568,7 @@
         <w:ind w:left="720" w:hanging="360"/>
       </w:pPr>
       <w:rPr>
-        <w:rFonts w:hint="default" w:ascii="Symbol" w:hAnsi="Symbol"/>
+        <w:rFonts w:ascii="Symbol" w:hAnsi="Symbol" w:hint="default"/>
         <w:sz w:val="20"/>
       </w:rPr>
     </w:lvl>
@@ -3187,7 +3584,7 @@
         <w:ind w:left="1440" w:hanging="360"/>
       </w:pPr>
       <w:rPr>
-        <w:rFonts w:hint="default" w:ascii="Courier New" w:hAnsi="Courier New"/>
+        <w:rFonts w:ascii="Courier New" w:hAnsi="Courier New" w:hint="default"/>
         <w:sz w:val="20"/>
       </w:rPr>
     </w:lvl>
@@ -3203,7 +3600,7 @@
         <w:ind w:left="2160" w:hanging="360"/>
       </w:pPr>
       <w:rPr>
-        <w:rFonts w:hint="default" w:ascii="Wingdings" w:hAnsi="Wingdings"/>
+        <w:rFonts w:ascii="Wingdings" w:hAnsi="Wingdings" w:hint="default"/>
         <w:sz w:val="20"/>
       </w:rPr>
     </w:lvl>
@@ -3219,7 +3616,7 @@
         <w:ind w:left="2880" w:hanging="360"/>
       </w:pPr>
       <w:rPr>
-        <w:rFonts w:hint="default" w:ascii="Wingdings" w:hAnsi="Wingdings"/>
+        <w:rFonts w:ascii="Wingdings" w:hAnsi="Wingdings" w:hint="default"/>
         <w:sz w:val="20"/>
       </w:rPr>
     </w:lvl>
@@ -3235,7 +3632,7 @@
         <w:ind w:left="3600" w:hanging="360"/>
       </w:pPr>
       <w:rPr>
-        <w:rFonts w:hint="default" w:ascii="Wingdings" w:hAnsi="Wingdings"/>
+        <w:rFonts w:ascii="Wingdings" w:hAnsi="Wingdings" w:hint="default"/>
         <w:sz w:val="20"/>
       </w:rPr>
     </w:lvl>
@@ -3251,7 +3648,7 @@
         <w:ind w:left="4320" w:hanging="360"/>
       </w:pPr>
       <w:rPr>
-        <w:rFonts w:hint="default" w:ascii="Wingdings" w:hAnsi="Wingdings"/>
+        <w:rFonts w:ascii="Wingdings" w:hAnsi="Wingdings" w:hint="default"/>
         <w:sz w:val="20"/>
       </w:rPr>
     </w:lvl>
@@ -3267,7 +3664,7 @@
         <w:ind w:left="5040" w:hanging="360"/>
       </w:pPr>
       <w:rPr>
-        <w:rFonts w:hint="default" w:ascii="Wingdings" w:hAnsi="Wingdings"/>
+        <w:rFonts w:ascii="Wingdings" w:hAnsi="Wingdings" w:hint="default"/>
         <w:sz w:val="20"/>
       </w:rPr>
     </w:lvl>
@@ -3283,7 +3680,7 @@
         <w:ind w:left="5760" w:hanging="360"/>
       </w:pPr>
       <w:rPr>
-        <w:rFonts w:hint="default" w:ascii="Wingdings" w:hAnsi="Wingdings"/>
+        <w:rFonts w:ascii="Wingdings" w:hAnsi="Wingdings" w:hint="default"/>
         <w:sz w:val="20"/>
       </w:rPr>
     </w:lvl>
@@ -3299,7 +3696,7 @@
         <w:ind w:left="6480" w:hanging="360"/>
       </w:pPr>
       <w:rPr>
-        <w:rFonts w:hint="default" w:ascii="Wingdings" w:hAnsi="Wingdings"/>
+        <w:rFonts w:ascii="Wingdings" w:hAnsi="Wingdings" w:hint="default"/>
         <w:sz w:val="20"/>
       </w:rPr>
     </w:lvl>
@@ -3320,7 +3717,7 @@
         <w:ind w:left="720" w:hanging="360"/>
       </w:pPr>
       <w:rPr>
-        <w:rFonts w:hint="default" w:ascii="Symbol" w:hAnsi="Symbol"/>
+        <w:rFonts w:ascii="Symbol" w:hAnsi="Symbol" w:hint="default"/>
         <w:sz w:val="20"/>
       </w:rPr>
     </w:lvl>
@@ -3336,7 +3733,7 @@
         <w:ind w:left="1440" w:hanging="360"/>
       </w:pPr>
       <w:rPr>
-        <w:rFonts w:hint="default" w:ascii="Courier New" w:hAnsi="Courier New"/>
+        <w:rFonts w:ascii="Courier New" w:hAnsi="Courier New" w:hint="default"/>
         <w:sz w:val="20"/>
       </w:rPr>
     </w:lvl>
@@ -3352,7 +3749,7 @@
         <w:ind w:left="2160" w:hanging="360"/>
       </w:pPr>
       <w:rPr>
-        <w:rFonts w:hint="default" w:ascii="Wingdings" w:hAnsi="Wingdings"/>
+        <w:rFonts w:ascii="Wingdings" w:hAnsi="Wingdings" w:hint="default"/>
         <w:sz w:val="20"/>
       </w:rPr>
     </w:lvl>
@@ -3368,7 +3765,7 @@
         <w:ind w:left="2880" w:hanging="360"/>
       </w:pPr>
       <w:rPr>
-        <w:rFonts w:hint="default" w:ascii="Wingdings" w:hAnsi="Wingdings"/>
+        <w:rFonts w:ascii="Wingdings" w:hAnsi="Wingdings" w:hint="default"/>
         <w:sz w:val="20"/>
       </w:rPr>
     </w:lvl>
@@ -3384,7 +3781,7 @@
         <w:ind w:left="3600" w:hanging="360"/>
       </w:pPr>
       <w:rPr>
-        <w:rFonts w:hint="default" w:ascii="Wingdings" w:hAnsi="Wingdings"/>
+        <w:rFonts w:ascii="Wingdings" w:hAnsi="Wingdings" w:hint="default"/>
         <w:sz w:val="20"/>
       </w:rPr>
     </w:lvl>
@@ -3400,7 +3797,7 @@
         <w:ind w:left="4320" w:hanging="360"/>
       </w:pPr>
       <w:rPr>
-        <w:rFonts w:hint="default" w:ascii="Wingdings" w:hAnsi="Wingdings"/>
+        <w:rFonts w:ascii="Wingdings" w:hAnsi="Wingdings" w:hint="default"/>
         <w:sz w:val="20"/>
       </w:rPr>
     </w:lvl>
@@ -3416,7 +3813,7 @@
         <w:ind w:left="5040" w:hanging="360"/>
       </w:pPr>
       <w:rPr>
-        <w:rFonts w:hint="default" w:ascii="Wingdings" w:hAnsi="Wingdings"/>
+        <w:rFonts w:ascii="Wingdings" w:hAnsi="Wingdings" w:hint="default"/>
         <w:sz w:val="20"/>
       </w:rPr>
     </w:lvl>
@@ -3432,7 +3829,7 @@
         <w:ind w:left="5760" w:hanging="360"/>
       </w:pPr>
       <w:rPr>
-        <w:rFonts w:hint="default" w:ascii="Wingdings" w:hAnsi="Wingdings"/>
+        <w:rFonts w:ascii="Wingdings" w:hAnsi="Wingdings" w:hint="default"/>
         <w:sz w:val="20"/>
       </w:rPr>
     </w:lvl>
@@ -3448,7 +3845,7 @@
         <w:ind w:left="6480" w:hanging="360"/>
       </w:pPr>
       <w:rPr>
-        <w:rFonts w:hint="default" w:ascii="Wingdings" w:hAnsi="Wingdings"/>
+        <w:rFonts w:ascii="Wingdings" w:hAnsi="Wingdings" w:hint="default"/>
         <w:sz w:val="20"/>
       </w:rPr>
     </w:lvl>
@@ -3465,7 +3862,7 @@
         <w:ind w:left="720" w:hanging="360"/>
       </w:pPr>
       <w:rPr>
-        <w:rFonts w:hint="default" w:ascii="Aptos" w:hAnsi="Aptos" w:eastAsiaTheme="minorHAnsi" w:cstheme="minorBidi"/>
+        <w:rFonts w:ascii="Aptos" w:eastAsiaTheme="minorHAnsi" w:hAnsi="Aptos" w:cstheme="minorBidi" w:hint="default"/>
       </w:rPr>
     </w:lvl>
     <w:lvl w:ilvl="1" w:tplc="20000003" w:tentative="1">
@@ -3477,7 +3874,7 @@
         <w:ind w:left="1440" w:hanging="360"/>
       </w:pPr>
       <w:rPr>
-        <w:rFonts w:hint="default" w:ascii="Courier New" w:hAnsi="Courier New" w:cs="Courier New"/>
+        <w:rFonts w:ascii="Courier New" w:hAnsi="Courier New" w:cs="Courier New" w:hint="default"/>
       </w:rPr>
     </w:lvl>
     <w:lvl w:ilvl="2" w:tplc="20000005" w:tentative="1">
@@ -3489,7 +3886,7 @@
         <w:ind w:left="2160" w:hanging="360"/>
       </w:pPr>
       <w:rPr>
-        <w:rFonts w:hint="default" w:ascii="Wingdings" w:hAnsi="Wingdings"/>
+        <w:rFonts w:ascii="Wingdings" w:hAnsi="Wingdings" w:hint="default"/>
       </w:rPr>
     </w:lvl>
     <w:lvl w:ilvl="3" w:tplc="20000001" w:tentative="1">
@@ -3501,7 +3898,7 @@
         <w:ind w:left="2880" w:hanging="360"/>
       </w:pPr>
       <w:rPr>
-        <w:rFonts w:hint="default" w:ascii="Symbol" w:hAnsi="Symbol"/>
+        <w:rFonts w:ascii="Symbol" w:hAnsi="Symbol" w:hint="default"/>
       </w:rPr>
     </w:lvl>
     <w:lvl w:ilvl="4" w:tplc="20000003" w:tentative="1">
@@ -3513,7 +3910,7 @@
         <w:ind w:left="3600" w:hanging="360"/>
       </w:pPr>
       <w:rPr>
-        <w:rFonts w:hint="default" w:ascii="Courier New" w:hAnsi="Courier New" w:cs="Courier New"/>
+        <w:rFonts w:ascii="Courier New" w:hAnsi="Courier New" w:cs="Courier New" w:hint="default"/>
       </w:rPr>
     </w:lvl>
     <w:lvl w:ilvl="5" w:tplc="20000005" w:tentative="1">
@@ -3525,7 +3922,7 @@
         <w:ind w:left="4320" w:hanging="360"/>
       </w:pPr>
       <w:rPr>
-        <w:rFonts w:hint="default" w:ascii="Wingdings" w:hAnsi="Wingdings"/>
+        <w:rFonts w:ascii="Wingdings" w:hAnsi="Wingdings" w:hint="default"/>
       </w:rPr>
     </w:lvl>
     <w:lvl w:ilvl="6" w:tplc="20000001" w:tentative="1">
@@ -3537,7 +3934,7 @@
         <w:ind w:left="5040" w:hanging="360"/>
       </w:pPr>
       <w:rPr>
-        <w:rFonts w:hint="default" w:ascii="Symbol" w:hAnsi="Symbol"/>
+        <w:rFonts w:ascii="Symbol" w:hAnsi="Symbol" w:hint="default"/>
       </w:rPr>
     </w:lvl>
     <w:lvl w:ilvl="7" w:tplc="20000003" w:tentative="1">
@@ -3549,7 +3946,7 @@
         <w:ind w:left="5760" w:hanging="360"/>
       </w:pPr>
       <w:rPr>
-        <w:rFonts w:hint="default" w:ascii="Courier New" w:hAnsi="Courier New" w:cs="Courier New"/>
+        <w:rFonts w:ascii="Courier New" w:hAnsi="Courier New" w:cs="Courier New" w:hint="default"/>
       </w:rPr>
     </w:lvl>
     <w:lvl w:ilvl="8" w:tplc="20000005" w:tentative="1">
@@ -3561,7 +3958,7 @@
         <w:ind w:left="6480" w:hanging="360"/>
       </w:pPr>
       <w:rPr>
-        <w:rFonts w:hint="default" w:ascii="Wingdings" w:hAnsi="Wingdings"/>
+        <w:rFonts w:ascii="Wingdings" w:hAnsi="Wingdings" w:hint="default"/>
       </w:rPr>
     </w:lvl>
   </w:abstractNum>
@@ -3581,7 +3978,7 @@
         <w:ind w:left="720" w:hanging="360"/>
       </w:pPr>
       <w:rPr>
-        <w:rFonts w:hint="default" w:ascii="Symbol" w:hAnsi="Symbol"/>
+        <w:rFonts w:ascii="Symbol" w:hAnsi="Symbol" w:hint="default"/>
         <w:sz w:val="20"/>
       </w:rPr>
     </w:lvl>
@@ -3597,7 +3994,7 @@
         <w:ind w:left="1440" w:hanging="360"/>
       </w:pPr>
       <w:rPr>
-        <w:rFonts w:hint="default" w:ascii="Courier New" w:hAnsi="Courier New"/>
+        <w:rFonts w:ascii="Courier New" w:hAnsi="Courier New" w:hint="default"/>
         <w:sz w:val="20"/>
       </w:rPr>
     </w:lvl>
@@ -3613,7 +4010,7 @@
         <w:ind w:left="2160" w:hanging="360"/>
       </w:pPr>
       <w:rPr>
-        <w:rFonts w:hint="default" w:ascii="Wingdings" w:hAnsi="Wingdings"/>
+        <w:rFonts w:ascii="Wingdings" w:hAnsi="Wingdings" w:hint="default"/>
         <w:sz w:val="20"/>
       </w:rPr>
     </w:lvl>
@@ -3629,7 +4026,7 @@
         <w:ind w:left="2880" w:hanging="360"/>
       </w:pPr>
       <w:rPr>
-        <w:rFonts w:hint="default" w:ascii="Wingdings" w:hAnsi="Wingdings"/>
+        <w:rFonts w:ascii="Wingdings" w:hAnsi="Wingdings" w:hint="default"/>
         <w:sz w:val="20"/>
       </w:rPr>
     </w:lvl>
@@ -3645,7 +4042,7 @@
         <w:ind w:left="3600" w:hanging="360"/>
       </w:pPr>
       <w:rPr>
-        <w:rFonts w:hint="default" w:ascii="Wingdings" w:hAnsi="Wingdings"/>
+        <w:rFonts w:ascii="Wingdings" w:hAnsi="Wingdings" w:hint="default"/>
         <w:sz w:val="20"/>
       </w:rPr>
     </w:lvl>
@@ -3661,7 +4058,7 @@
         <w:ind w:left="4320" w:hanging="360"/>
       </w:pPr>
       <w:rPr>
-        <w:rFonts w:hint="default" w:ascii="Wingdings" w:hAnsi="Wingdings"/>
+        <w:rFonts w:ascii="Wingdings" w:hAnsi="Wingdings" w:hint="default"/>
         <w:sz w:val="20"/>
       </w:rPr>
     </w:lvl>
@@ -3677,7 +4074,7 @@
         <w:ind w:left="5040" w:hanging="360"/>
       </w:pPr>
       <w:rPr>
-        <w:rFonts w:hint="default" w:ascii="Wingdings" w:hAnsi="Wingdings"/>
+        <w:rFonts w:ascii="Wingdings" w:hAnsi="Wingdings" w:hint="default"/>
         <w:sz w:val="20"/>
       </w:rPr>
     </w:lvl>
@@ -3693,7 +4090,7 @@
         <w:ind w:left="5760" w:hanging="360"/>
       </w:pPr>
       <w:rPr>
-        <w:rFonts w:hint="default" w:ascii="Wingdings" w:hAnsi="Wingdings"/>
+        <w:rFonts w:ascii="Wingdings" w:hAnsi="Wingdings" w:hint="default"/>
         <w:sz w:val="20"/>
       </w:rPr>
     </w:lvl>
@@ -3709,7 +4106,7 @@
         <w:ind w:left="6480" w:hanging="360"/>
       </w:pPr>
       <w:rPr>
-        <w:rFonts w:hint="default" w:ascii="Wingdings" w:hAnsi="Wingdings"/>
+        <w:rFonts w:ascii="Wingdings" w:hAnsi="Wingdings" w:hint="default"/>
         <w:sz w:val="20"/>
       </w:rPr>
     </w:lvl>
@@ -3730,7 +4127,7 @@
         <w:ind w:left="720" w:hanging="360"/>
       </w:pPr>
       <w:rPr>
-        <w:rFonts w:hint="default" w:ascii="Symbol" w:hAnsi="Symbol"/>
+        <w:rFonts w:ascii="Symbol" w:hAnsi="Symbol" w:hint="default"/>
         <w:sz w:val="20"/>
       </w:rPr>
     </w:lvl>
@@ -3746,7 +4143,7 @@
         <w:ind w:left="1440" w:hanging="360"/>
       </w:pPr>
       <w:rPr>
-        <w:rFonts w:hint="default" w:ascii="Courier New" w:hAnsi="Courier New"/>
+        <w:rFonts w:ascii="Courier New" w:hAnsi="Courier New" w:hint="default"/>
         <w:sz w:val="20"/>
       </w:rPr>
     </w:lvl>
@@ -3762,7 +4159,7 @@
         <w:ind w:left="2160" w:hanging="360"/>
       </w:pPr>
       <w:rPr>
-        <w:rFonts w:hint="default" w:ascii="Wingdings" w:hAnsi="Wingdings"/>
+        <w:rFonts w:ascii="Wingdings" w:hAnsi="Wingdings" w:hint="default"/>
         <w:sz w:val="20"/>
       </w:rPr>
     </w:lvl>
@@ -3778,7 +4175,7 @@
         <w:ind w:left="2880" w:hanging="360"/>
       </w:pPr>
       <w:rPr>
-        <w:rFonts w:hint="default" w:ascii="Wingdings" w:hAnsi="Wingdings"/>
+        <w:rFonts w:ascii="Wingdings" w:hAnsi="Wingdings" w:hint="default"/>
         <w:sz w:val="20"/>
       </w:rPr>
     </w:lvl>
@@ -3794,7 +4191,7 @@
         <w:ind w:left="3600" w:hanging="360"/>
       </w:pPr>
       <w:rPr>
-        <w:rFonts w:hint="default" w:ascii="Wingdings" w:hAnsi="Wingdings"/>
+        <w:rFonts w:ascii="Wingdings" w:hAnsi="Wingdings" w:hint="default"/>
         <w:sz w:val="20"/>
       </w:rPr>
     </w:lvl>
@@ -3810,7 +4207,7 @@
         <w:ind w:left="4320" w:hanging="360"/>
       </w:pPr>
       <w:rPr>
-        <w:rFonts w:hint="default" w:ascii="Wingdings" w:hAnsi="Wingdings"/>
+        <w:rFonts w:ascii="Wingdings" w:hAnsi="Wingdings" w:hint="default"/>
         <w:sz w:val="20"/>
       </w:rPr>
     </w:lvl>
@@ -3826,7 +4223,7 @@
         <w:ind w:left="5040" w:hanging="360"/>
       </w:pPr>
       <w:rPr>
-        <w:rFonts w:hint="default" w:ascii="Wingdings" w:hAnsi="Wingdings"/>
+        <w:rFonts w:ascii="Wingdings" w:hAnsi="Wingdings" w:hint="default"/>
         <w:sz w:val="20"/>
       </w:rPr>
     </w:lvl>
@@ -3842,7 +4239,7 @@
         <w:ind w:left="5760" w:hanging="360"/>
       </w:pPr>
       <w:rPr>
-        <w:rFonts w:hint="default" w:ascii="Wingdings" w:hAnsi="Wingdings"/>
+        <w:rFonts w:ascii="Wingdings" w:hAnsi="Wingdings" w:hint="default"/>
         <w:sz w:val="20"/>
       </w:rPr>
     </w:lvl>
@@ -3858,7 +4255,7 @@
         <w:ind w:left="6480" w:hanging="360"/>
       </w:pPr>
       <w:rPr>
-        <w:rFonts w:hint="default" w:ascii="Wingdings" w:hAnsi="Wingdings"/>
+        <w:rFonts w:ascii="Wingdings" w:hAnsi="Wingdings" w:hint="default"/>
         <w:sz w:val="20"/>
       </w:rPr>
     </w:lvl>
@@ -3879,7 +4276,7 @@
         <w:ind w:left="720" w:hanging="360"/>
       </w:pPr>
       <w:rPr>
-        <w:rFonts w:hint="default" w:ascii="Symbol" w:hAnsi="Symbol"/>
+        <w:rFonts w:ascii="Symbol" w:hAnsi="Symbol" w:hint="default"/>
         <w:sz w:val="20"/>
       </w:rPr>
     </w:lvl>
@@ -3895,7 +4292,7 @@
         <w:ind w:left="1440" w:hanging="360"/>
       </w:pPr>
       <w:rPr>
-        <w:rFonts w:hint="default" w:ascii="Courier New" w:hAnsi="Courier New"/>
+        <w:rFonts w:ascii="Courier New" w:hAnsi="Courier New" w:hint="default"/>
         <w:sz w:val="20"/>
       </w:rPr>
     </w:lvl>
@@ -3911,7 +4308,7 @@
         <w:ind w:left="2160" w:hanging="360"/>
       </w:pPr>
       <w:rPr>
-        <w:rFonts w:hint="default" w:ascii="Wingdings" w:hAnsi="Wingdings"/>
+        <w:rFonts w:ascii="Wingdings" w:hAnsi="Wingdings" w:hint="default"/>
         <w:sz w:val="20"/>
       </w:rPr>
     </w:lvl>
@@ -3927,7 +4324,7 @@
         <w:ind w:left="2880" w:hanging="360"/>
       </w:pPr>
       <w:rPr>
-        <w:rFonts w:hint="default" w:ascii="Wingdings" w:hAnsi="Wingdings"/>
+        <w:rFonts w:ascii="Wingdings" w:hAnsi="Wingdings" w:hint="default"/>
         <w:sz w:val="20"/>
       </w:rPr>
     </w:lvl>
@@ -3943,7 +4340,7 @@
         <w:ind w:left="3600" w:hanging="360"/>
       </w:pPr>
       <w:rPr>
-        <w:rFonts w:hint="default" w:ascii="Wingdings" w:hAnsi="Wingdings"/>
+        <w:rFonts w:ascii="Wingdings" w:hAnsi="Wingdings" w:hint="default"/>
         <w:sz w:val="20"/>
       </w:rPr>
     </w:lvl>
@@ -3959,7 +4356,7 @@
         <w:ind w:left="4320" w:hanging="360"/>
       </w:pPr>
       <w:rPr>
-        <w:rFonts w:hint="default" w:ascii="Wingdings" w:hAnsi="Wingdings"/>
+        <w:rFonts w:ascii="Wingdings" w:hAnsi="Wingdings" w:hint="default"/>
         <w:sz w:val="20"/>
       </w:rPr>
     </w:lvl>
@@ -3975,7 +4372,7 @@
         <w:ind w:left="5040" w:hanging="360"/>
       </w:pPr>
       <w:rPr>
-        <w:rFonts w:hint="default" w:ascii="Wingdings" w:hAnsi="Wingdings"/>
+        <w:rFonts w:ascii="Wingdings" w:hAnsi="Wingdings" w:hint="default"/>
         <w:sz w:val="20"/>
       </w:rPr>
     </w:lvl>
@@ -3991,7 +4388,7 @@
         <w:ind w:left="5760" w:hanging="360"/>
       </w:pPr>
       <w:rPr>
-        <w:rFonts w:hint="default" w:ascii="Wingdings" w:hAnsi="Wingdings"/>
+        <w:rFonts w:ascii="Wingdings" w:hAnsi="Wingdings" w:hint="default"/>
         <w:sz w:val="20"/>
       </w:rPr>
     </w:lvl>
@@ -4007,7 +4404,7 @@
         <w:ind w:left="6480" w:hanging="360"/>
       </w:pPr>
       <w:rPr>
-        <w:rFonts w:hint="default" w:ascii="Wingdings" w:hAnsi="Wingdings"/>
+        <w:rFonts w:ascii="Wingdings" w:hAnsi="Wingdings" w:hint="default"/>
         <w:sz w:val="20"/>
       </w:rPr>
     </w:lvl>
@@ -4028,7 +4425,7 @@
         <w:ind w:left="720" w:hanging="360"/>
       </w:pPr>
       <w:rPr>
-        <w:rFonts w:hint="default" w:ascii="Symbol" w:hAnsi="Symbol"/>
+        <w:rFonts w:ascii="Symbol" w:hAnsi="Symbol" w:hint="default"/>
         <w:sz w:val="20"/>
       </w:rPr>
     </w:lvl>
@@ -4044,7 +4441,7 @@
         <w:ind w:left="1440" w:hanging="360"/>
       </w:pPr>
       <w:rPr>
-        <w:rFonts w:hint="default" w:ascii="Courier New" w:hAnsi="Courier New"/>
+        <w:rFonts w:ascii="Courier New" w:hAnsi="Courier New" w:hint="default"/>
         <w:sz w:val="20"/>
       </w:rPr>
     </w:lvl>
@@ -4060,7 +4457,7 @@
         <w:ind w:left="2160" w:hanging="360"/>
       </w:pPr>
       <w:rPr>
-        <w:rFonts w:hint="default" w:ascii="Wingdings" w:hAnsi="Wingdings"/>
+        <w:rFonts w:ascii="Wingdings" w:hAnsi="Wingdings" w:hint="default"/>
         <w:sz w:val="20"/>
       </w:rPr>
     </w:lvl>
@@ -4076,7 +4473,7 @@
         <w:ind w:left="2880" w:hanging="360"/>
       </w:pPr>
       <w:rPr>
-        <w:rFonts w:hint="default" w:ascii="Wingdings" w:hAnsi="Wingdings"/>
+        <w:rFonts w:ascii="Wingdings" w:hAnsi="Wingdings" w:hint="default"/>
         <w:sz w:val="20"/>
       </w:rPr>
     </w:lvl>
@@ -4092,7 +4489,7 @@
         <w:ind w:left="3600" w:hanging="360"/>
       </w:pPr>
       <w:rPr>
-        <w:rFonts w:hint="default" w:ascii="Wingdings" w:hAnsi="Wingdings"/>
+        <w:rFonts w:ascii="Wingdings" w:hAnsi="Wingdings" w:hint="default"/>
         <w:sz w:val="20"/>
       </w:rPr>
     </w:lvl>
@@ -4108,7 +4505,7 @@
         <w:ind w:left="4320" w:hanging="360"/>
       </w:pPr>
       <w:rPr>
-        <w:rFonts w:hint="default" w:ascii="Wingdings" w:hAnsi="Wingdings"/>
+        <w:rFonts w:ascii="Wingdings" w:hAnsi="Wingdings" w:hint="default"/>
         <w:sz w:val="20"/>
       </w:rPr>
     </w:lvl>
@@ -4124,7 +4521,7 @@
         <w:ind w:left="5040" w:hanging="360"/>
       </w:pPr>
       <w:rPr>
-        <w:rFonts w:hint="default" w:ascii="Wingdings" w:hAnsi="Wingdings"/>
+        <w:rFonts w:ascii="Wingdings" w:hAnsi="Wingdings" w:hint="default"/>
         <w:sz w:val="20"/>
       </w:rPr>
     </w:lvl>
@@ -4140,7 +4537,7 @@
         <w:ind w:left="5760" w:hanging="360"/>
       </w:pPr>
       <w:rPr>
-        <w:rFonts w:hint="default" w:ascii="Wingdings" w:hAnsi="Wingdings"/>
+        <w:rFonts w:ascii="Wingdings" w:hAnsi="Wingdings" w:hint="default"/>
         <w:sz w:val="20"/>
       </w:rPr>
     </w:lvl>
@@ -4156,7 +4553,7 @@
         <w:ind w:left="6480" w:hanging="360"/>
       </w:pPr>
       <w:rPr>
-        <w:rFonts w:hint="default" w:ascii="Wingdings" w:hAnsi="Wingdings"/>
+        <w:rFonts w:ascii="Wingdings" w:hAnsi="Wingdings" w:hint="default"/>
         <w:sz w:val="20"/>
       </w:rPr>
     </w:lvl>
@@ -4177,7 +4574,7 @@
         <w:ind w:left="720" w:hanging="360"/>
       </w:pPr>
       <w:rPr>
-        <w:rFonts w:hint="default" w:ascii="Symbol" w:hAnsi="Symbol"/>
+        <w:rFonts w:ascii="Symbol" w:hAnsi="Symbol" w:hint="default"/>
         <w:sz w:val="20"/>
       </w:rPr>
     </w:lvl>
@@ -4193,7 +4590,7 @@
         <w:ind w:left="1440" w:hanging="360"/>
       </w:pPr>
       <w:rPr>
-        <w:rFonts w:hint="default" w:ascii="Courier New" w:hAnsi="Courier New"/>
+        <w:rFonts w:ascii="Courier New" w:hAnsi="Courier New" w:hint="default"/>
         <w:sz w:val="20"/>
       </w:rPr>
     </w:lvl>
@@ -4209,7 +4606,7 @@
         <w:ind w:left="2160" w:hanging="360"/>
       </w:pPr>
       <w:rPr>
-        <w:rFonts w:hint="default" w:ascii="Wingdings" w:hAnsi="Wingdings"/>
+        <w:rFonts w:ascii="Wingdings" w:hAnsi="Wingdings" w:hint="default"/>
         <w:sz w:val="20"/>
       </w:rPr>
     </w:lvl>
@@ -4225,7 +4622,7 @@
         <w:ind w:left="2880" w:hanging="360"/>
       </w:pPr>
       <w:rPr>
-        <w:rFonts w:hint="default" w:ascii="Wingdings" w:hAnsi="Wingdings"/>
+        <w:rFonts w:ascii="Wingdings" w:hAnsi="Wingdings" w:hint="default"/>
         <w:sz w:val="20"/>
       </w:rPr>
     </w:lvl>
@@ -4241,7 +4638,7 @@
         <w:ind w:left="3600" w:hanging="360"/>
       </w:pPr>
       <w:rPr>
-        <w:rFonts w:hint="default" w:ascii="Wingdings" w:hAnsi="Wingdings"/>
+        <w:rFonts w:ascii="Wingdings" w:hAnsi="Wingdings" w:hint="default"/>
         <w:sz w:val="20"/>
       </w:rPr>
     </w:lvl>
@@ -4257,7 +4654,7 @@
         <w:ind w:left="4320" w:hanging="360"/>
       </w:pPr>
       <w:rPr>
-        <w:rFonts w:hint="default" w:ascii="Wingdings" w:hAnsi="Wingdings"/>
+        <w:rFonts w:ascii="Wingdings" w:hAnsi="Wingdings" w:hint="default"/>
         <w:sz w:val="20"/>
       </w:rPr>
     </w:lvl>
@@ -4273,7 +4670,7 @@
         <w:ind w:left="5040" w:hanging="360"/>
       </w:pPr>
       <w:rPr>
-        <w:rFonts w:hint="default" w:ascii="Wingdings" w:hAnsi="Wingdings"/>
+        <w:rFonts w:ascii="Wingdings" w:hAnsi="Wingdings" w:hint="default"/>
         <w:sz w:val="20"/>
       </w:rPr>
     </w:lvl>
@@ -4289,7 +4686,7 @@
         <w:ind w:left="5760" w:hanging="360"/>
       </w:pPr>
       <w:rPr>
-        <w:rFonts w:hint="default" w:ascii="Wingdings" w:hAnsi="Wingdings"/>
+        <w:rFonts w:ascii="Wingdings" w:hAnsi="Wingdings" w:hint="default"/>
         <w:sz w:val="20"/>
       </w:rPr>
     </w:lvl>
@@ -4305,7 +4702,7 @@
         <w:ind w:left="6480" w:hanging="360"/>
       </w:pPr>
       <w:rPr>
-        <w:rFonts w:hint="default" w:ascii="Wingdings" w:hAnsi="Wingdings"/>
+        <w:rFonts w:ascii="Wingdings" w:hAnsi="Wingdings" w:hint="default"/>
         <w:sz w:val="20"/>
       </w:rPr>
     </w:lvl>
@@ -4326,7 +4723,7 @@
         <w:ind w:left="720" w:hanging="360"/>
       </w:pPr>
       <w:rPr>
-        <w:rFonts w:hint="default" w:ascii="Symbol" w:hAnsi="Symbol"/>
+        <w:rFonts w:ascii="Symbol" w:hAnsi="Symbol" w:hint="default"/>
         <w:sz w:val="20"/>
       </w:rPr>
     </w:lvl>
@@ -4342,7 +4739,7 @@
         <w:ind w:left="1440" w:hanging="360"/>
       </w:pPr>
       <w:rPr>
-        <w:rFonts w:hint="default" w:ascii="Courier New" w:hAnsi="Courier New"/>
+        <w:rFonts w:ascii="Courier New" w:hAnsi="Courier New" w:hint="default"/>
         <w:sz w:val="20"/>
       </w:rPr>
     </w:lvl>
@@ -4358,7 +4755,7 @@
         <w:ind w:left="2160" w:hanging="360"/>
       </w:pPr>
       <w:rPr>
-        <w:rFonts w:hint="default" w:ascii="Wingdings" w:hAnsi="Wingdings"/>
+        <w:rFonts w:ascii="Wingdings" w:hAnsi="Wingdings" w:hint="default"/>
         <w:sz w:val="20"/>
       </w:rPr>
     </w:lvl>
@@ -4374,7 +4771,7 @@
         <w:ind w:left="2880" w:hanging="360"/>
       </w:pPr>
       <w:rPr>
-        <w:rFonts w:hint="default" w:ascii="Wingdings" w:hAnsi="Wingdings"/>
+        <w:rFonts w:ascii="Wingdings" w:hAnsi="Wingdings" w:hint="default"/>
         <w:sz w:val="20"/>
       </w:rPr>
     </w:lvl>
@@ -4390,7 +4787,7 @@
         <w:ind w:left="3600" w:hanging="360"/>
       </w:pPr>
       <w:rPr>
-        <w:rFonts w:hint="default" w:ascii="Wingdings" w:hAnsi="Wingdings"/>
+        <w:rFonts w:ascii="Wingdings" w:hAnsi="Wingdings" w:hint="default"/>
         <w:sz w:val="20"/>
       </w:rPr>
     </w:lvl>
@@ -4406,7 +4803,7 @@
         <w:ind w:left="4320" w:hanging="360"/>
       </w:pPr>
       <w:rPr>
-        <w:rFonts w:hint="default" w:ascii="Wingdings" w:hAnsi="Wingdings"/>
+        <w:rFonts w:ascii="Wingdings" w:hAnsi="Wingdings" w:hint="default"/>
         <w:sz w:val="20"/>
       </w:rPr>
     </w:lvl>
@@ -4422,7 +4819,7 @@
         <w:ind w:left="5040" w:hanging="360"/>
       </w:pPr>
       <w:rPr>
-        <w:rFonts w:hint="default" w:ascii="Wingdings" w:hAnsi="Wingdings"/>
+        <w:rFonts w:ascii="Wingdings" w:hAnsi="Wingdings" w:hint="default"/>
         <w:sz w:val="20"/>
       </w:rPr>
     </w:lvl>
@@ -4438,7 +4835,7 @@
         <w:ind w:left="5760" w:hanging="360"/>
       </w:pPr>
       <w:rPr>
-        <w:rFonts w:hint="default" w:ascii="Wingdings" w:hAnsi="Wingdings"/>
+        <w:rFonts w:ascii="Wingdings" w:hAnsi="Wingdings" w:hint="default"/>
         <w:sz w:val="20"/>
       </w:rPr>
     </w:lvl>
@@ -4454,7 +4851,7 @@
         <w:ind w:left="6480" w:hanging="360"/>
       </w:pPr>
       <w:rPr>
-        <w:rFonts w:hint="default" w:ascii="Wingdings" w:hAnsi="Wingdings"/>
+        <w:rFonts w:ascii="Wingdings" w:hAnsi="Wingdings" w:hint="default"/>
         <w:sz w:val="20"/>
       </w:rPr>
     </w:lvl>
@@ -4475,7 +4872,7 @@
         <w:ind w:left="720" w:hanging="360"/>
       </w:pPr>
       <w:rPr>
-        <w:rFonts w:hint="default" w:ascii="Symbol" w:hAnsi="Symbol"/>
+        <w:rFonts w:ascii="Symbol" w:hAnsi="Symbol" w:hint="default"/>
         <w:sz w:val="20"/>
       </w:rPr>
     </w:lvl>
@@ -4491,7 +4888,7 @@
         <w:ind w:left="1440" w:hanging="360"/>
       </w:pPr>
       <w:rPr>
-        <w:rFonts w:hint="default" w:ascii="Courier New" w:hAnsi="Courier New"/>
+        <w:rFonts w:ascii="Courier New" w:hAnsi="Courier New" w:hint="default"/>
         <w:sz w:val="20"/>
       </w:rPr>
     </w:lvl>
@@ -4507,7 +4904,7 @@
         <w:ind w:left="2160" w:hanging="360"/>
       </w:pPr>
       <w:rPr>
-        <w:rFonts w:hint="default" w:ascii="Wingdings" w:hAnsi="Wingdings"/>
+        <w:rFonts w:ascii="Wingdings" w:hAnsi="Wingdings" w:hint="default"/>
         <w:sz w:val="20"/>
       </w:rPr>
     </w:lvl>
@@ -4523,7 +4920,7 @@
         <w:ind w:left="2880" w:hanging="360"/>
       </w:pPr>
       <w:rPr>
-        <w:rFonts w:hint="default" w:ascii="Wingdings" w:hAnsi="Wingdings"/>
+        <w:rFonts w:ascii="Wingdings" w:hAnsi="Wingdings" w:hint="default"/>
         <w:sz w:val="20"/>
       </w:rPr>
     </w:lvl>
@@ -4539,7 +4936,7 @@
         <w:ind w:left="3600" w:hanging="360"/>
       </w:pPr>
       <w:rPr>
-        <w:rFonts w:hint="default" w:ascii="Wingdings" w:hAnsi="Wingdings"/>
+        <w:rFonts w:ascii="Wingdings" w:hAnsi="Wingdings" w:hint="default"/>
         <w:sz w:val="20"/>
       </w:rPr>
     </w:lvl>
@@ -4555,7 +4952,7 @@
         <w:ind w:left="4320" w:hanging="360"/>
       </w:pPr>
       <w:rPr>
-        <w:rFonts w:hint="default" w:ascii="Wingdings" w:hAnsi="Wingdings"/>
+        <w:rFonts w:ascii="Wingdings" w:hAnsi="Wingdings" w:hint="default"/>
         <w:sz w:val="20"/>
       </w:rPr>
     </w:lvl>
@@ -4571,7 +4968,7 @@
         <w:ind w:left="5040" w:hanging="360"/>
       </w:pPr>
       <w:rPr>
-        <w:rFonts w:hint="default" w:ascii="Wingdings" w:hAnsi="Wingdings"/>
+        <w:rFonts w:ascii="Wingdings" w:hAnsi="Wingdings" w:hint="default"/>
         <w:sz w:val="20"/>
       </w:rPr>
     </w:lvl>
@@ -4587,7 +4984,7 @@
         <w:ind w:left="5760" w:hanging="360"/>
       </w:pPr>
       <w:rPr>
-        <w:rFonts w:hint="default" w:ascii="Wingdings" w:hAnsi="Wingdings"/>
+        <w:rFonts w:ascii="Wingdings" w:hAnsi="Wingdings" w:hint="default"/>
         <w:sz w:val="20"/>
       </w:rPr>
     </w:lvl>
@@ -4603,7 +5000,7 @@
         <w:ind w:left="6480" w:hanging="360"/>
       </w:pPr>
       <w:rPr>
-        <w:rFonts w:hint="default" w:ascii="Wingdings" w:hAnsi="Wingdings"/>
+        <w:rFonts w:ascii="Wingdings" w:hAnsi="Wingdings" w:hint="default"/>
         <w:sz w:val="20"/>
       </w:rPr>
     </w:lvl>
@@ -4624,7 +5021,7 @@
         <w:ind w:left="720" w:hanging="360"/>
       </w:pPr>
       <w:rPr>
-        <w:rFonts w:hint="default" w:ascii="Symbol" w:hAnsi="Symbol"/>
+        <w:rFonts w:ascii="Symbol" w:hAnsi="Symbol" w:hint="default"/>
         <w:sz w:val="20"/>
       </w:rPr>
     </w:lvl>
@@ -4640,7 +5037,7 @@
         <w:ind w:left="1440" w:hanging="360"/>
       </w:pPr>
       <w:rPr>
-        <w:rFonts w:hint="default" w:ascii="Courier New" w:hAnsi="Courier New"/>
+        <w:rFonts w:ascii="Courier New" w:hAnsi="Courier New" w:hint="default"/>
         <w:sz w:val="20"/>
       </w:rPr>
     </w:lvl>
@@ -4656,7 +5053,7 @@
         <w:ind w:left="2160" w:hanging="360"/>
       </w:pPr>
       <w:rPr>
-        <w:rFonts w:hint="default" w:ascii="Wingdings" w:hAnsi="Wingdings"/>
+        <w:rFonts w:ascii="Wingdings" w:hAnsi="Wingdings" w:hint="default"/>
         <w:sz w:val="20"/>
       </w:rPr>
     </w:lvl>
@@ -4672,7 +5069,7 @@
         <w:ind w:left="2880" w:hanging="360"/>
       </w:pPr>
       <w:rPr>
-        <w:rFonts w:hint="default" w:ascii="Wingdings" w:hAnsi="Wingdings"/>
+        <w:rFonts w:ascii="Wingdings" w:hAnsi="Wingdings" w:hint="default"/>
         <w:sz w:val="20"/>
       </w:rPr>
     </w:lvl>
@@ -4688,7 +5085,7 @@
         <w:ind w:left="3600" w:hanging="360"/>
       </w:pPr>
       <w:rPr>
-        <w:rFonts w:hint="default" w:ascii="Wingdings" w:hAnsi="Wingdings"/>
+        <w:rFonts w:ascii="Wingdings" w:hAnsi="Wingdings" w:hint="default"/>
         <w:sz w:val="20"/>
       </w:rPr>
     </w:lvl>
@@ -4704,7 +5101,7 @@
         <w:ind w:left="4320" w:hanging="360"/>
       </w:pPr>
       <w:rPr>
-        <w:rFonts w:hint="default" w:ascii="Wingdings" w:hAnsi="Wingdings"/>
+        <w:rFonts w:ascii="Wingdings" w:hAnsi="Wingdings" w:hint="default"/>
         <w:sz w:val="20"/>
       </w:rPr>
     </w:lvl>
@@ -4720,7 +5117,7 @@
         <w:ind w:left="5040" w:hanging="360"/>
       </w:pPr>
       <w:rPr>
-        <w:rFonts w:hint="default" w:ascii="Wingdings" w:hAnsi="Wingdings"/>
+        <w:rFonts w:ascii="Wingdings" w:hAnsi="Wingdings" w:hint="default"/>
         <w:sz w:val="20"/>
       </w:rPr>
     </w:lvl>
@@ -4736,7 +5133,7 @@
         <w:ind w:left="5760" w:hanging="360"/>
       </w:pPr>
       <w:rPr>
-        <w:rFonts w:hint="default" w:ascii="Wingdings" w:hAnsi="Wingdings"/>
+        <w:rFonts w:ascii="Wingdings" w:hAnsi="Wingdings" w:hint="default"/>
         <w:sz w:val="20"/>
       </w:rPr>
     </w:lvl>
@@ -4752,7 +5149,7 @@
         <w:ind w:left="6480" w:hanging="360"/>
       </w:pPr>
       <w:rPr>
-        <w:rFonts w:hint="default" w:ascii="Wingdings" w:hAnsi="Wingdings"/>
+        <w:rFonts w:ascii="Wingdings" w:hAnsi="Wingdings" w:hint="default"/>
         <w:sz w:val="20"/>
       </w:rPr>
     </w:lvl>
@@ -4797,15 +5194,15 @@
 </file>
 
 <file path=word/styles.xml><?xml version="1.0" encoding="utf-8"?>
-<w:styles xmlns:wp14="http://schemas.microsoft.com/office/word/2010/wordprocessingDrawing" xmlns:mc="http://schemas.openxmlformats.org/markup-compatibility/2006" xmlns:r="http://schemas.openxmlformats.org/officeDocument/2006/relationships" xmlns:w="http://schemas.openxmlformats.org/wordprocessingml/2006/main" xmlns:w14="http://schemas.microsoft.com/office/word/2010/wordml" xmlns:w15="http://schemas.microsoft.com/office/word/2012/wordml" xmlns:w16cex="http://schemas.microsoft.com/office/word/2018/wordml/cex" xmlns:w16cid="http://schemas.microsoft.com/office/word/2016/wordml/cid" xmlns:w16="http://schemas.microsoft.com/office/word/2018/wordml" xmlns:w16du="http://schemas.microsoft.com/office/word/2023/wordml/word16du" xmlns:w16sdtdh="http://schemas.microsoft.com/office/word/2020/wordml/sdtdatahash" xmlns:w16sdtfl="http://schemas.microsoft.com/office/word/2024/wordml/sdtformatlock" xmlns:w16se="http://schemas.microsoft.com/office/word/2015/wordml/symex" mc:Ignorable="w14 w15 w16se w16cid w16 w16cex w16sdtdh w16sdtfl w16du wp14">
+<w:styles xmlns:mc="http://schemas.openxmlformats.org/markup-compatibility/2006" xmlns:r="http://schemas.openxmlformats.org/officeDocument/2006/relationships" xmlns:w="http://schemas.openxmlformats.org/wordprocessingml/2006/main" xmlns:w14="http://schemas.microsoft.com/office/word/2010/wordml" xmlns:w15="http://schemas.microsoft.com/office/word/2012/wordml" xmlns:w16cex="http://schemas.microsoft.com/office/word/2018/wordml/cex" xmlns:w16cid="http://schemas.microsoft.com/office/word/2016/wordml/cid" xmlns:w16="http://schemas.microsoft.com/office/word/2018/wordml" xmlns:w16sdtdh="http://schemas.microsoft.com/office/word/2020/wordml/sdtdatahash" xmlns:w16sdtfl="http://schemas.microsoft.com/office/word/2024/wordml/sdtformatlock" xmlns:w16se="http://schemas.microsoft.com/office/word/2015/wordml/symex" xmlns:w16du="http://schemas.microsoft.com/office/word/2023/wordml/word16du" mc:Ignorable="w14 w15 w16se w16cid w16 w16cex w16sdtdh w16sdtfl w16du">
   <w:docDefaults>
     <w:rPrDefault>
       <w:rPr>
-        <w:rFonts w:asciiTheme="minorHAnsi" w:hAnsiTheme="minorHAnsi" w:eastAsiaTheme="minorHAnsi" w:cstheme="minorBidi"/>
+        <w:rFonts w:asciiTheme="minorHAnsi" w:eastAsiaTheme="minorHAnsi" w:hAnsiTheme="minorHAnsi" w:cstheme="minorBidi"/>
         <w:kern w:val="2"/>
         <w:sz w:val="24"/>
         <w:szCs w:val="24"/>
-        <w:lang w:val="en-LC" w:eastAsia="en-US" w:bidi="ar-SA"/>
+        <w:lang w:eastAsia="en-US" w:bidi="ar-SA"/>
         <w14:ligatures w14:val="standardContextual"/>
       </w:rPr>
     </w:rPrDefault>
@@ -4818,14 +5215,14 @@
   <w:latentStyles w:defLockedState="0" w:defUIPriority="99" w:defSemiHidden="0" w:defUnhideWhenUsed="0" w:defQFormat="0" w:count="376">
     <w:lsdException w:name="Normal" w:uiPriority="0" w:qFormat="1"/>
     <w:lsdException w:name="heading 1" w:uiPriority="9" w:qFormat="1"/>
-    <w:lsdException w:name="heading 2" w:uiPriority="9" w:semiHidden="1" w:unhideWhenUsed="1" w:qFormat="1"/>
-    <w:lsdException w:name="heading 3" w:uiPriority="9" w:semiHidden="1" w:unhideWhenUsed="1" w:qFormat="1"/>
-    <w:lsdException w:name="heading 4" w:uiPriority="9" w:semiHidden="1" w:unhideWhenUsed="1" w:qFormat="1"/>
-    <w:lsdException w:name="heading 5" w:uiPriority="9" w:semiHidden="1" w:unhideWhenUsed="1" w:qFormat="1"/>
-    <w:lsdException w:name="heading 6" w:uiPriority="9" w:semiHidden="1" w:unhideWhenUsed="1" w:qFormat="1"/>
-    <w:lsdException w:name="heading 7" w:uiPriority="9" w:semiHidden="1" w:unhideWhenUsed="1" w:qFormat="1"/>
-    <w:lsdException w:name="heading 8" w:uiPriority="9" w:semiHidden="1" w:unhideWhenUsed="1" w:qFormat="1"/>
-    <w:lsdException w:name="heading 9" w:uiPriority="9" w:semiHidden="1" w:unhideWhenUsed="1" w:qFormat="1"/>
+    <w:lsdException w:name="heading 2" w:semiHidden="1" w:uiPriority="9" w:unhideWhenUsed="1" w:qFormat="1"/>
+    <w:lsdException w:name="heading 3" w:semiHidden="1" w:uiPriority="9" w:unhideWhenUsed="1" w:qFormat="1"/>
+    <w:lsdException w:name="heading 4" w:semiHidden="1" w:uiPriority="9" w:unhideWhenUsed="1" w:qFormat="1"/>
+    <w:lsdException w:name="heading 5" w:semiHidden="1" w:uiPriority="9" w:unhideWhenUsed="1" w:qFormat="1"/>
+    <w:lsdException w:name="heading 6" w:semiHidden="1" w:uiPriority="9" w:unhideWhenUsed="1" w:qFormat="1"/>
+    <w:lsdException w:name="heading 7" w:semiHidden="1" w:uiPriority="9" w:unhideWhenUsed="1" w:qFormat="1"/>
+    <w:lsdException w:name="heading 8" w:semiHidden="1" w:uiPriority="9" w:unhideWhenUsed="1" w:qFormat="1"/>
+    <w:lsdException w:name="heading 9" w:semiHidden="1" w:uiPriority="9" w:unhideWhenUsed="1" w:qFormat="1"/>
     <w:lsdException w:name="index 1" w:semiHidden="1" w:unhideWhenUsed="1"/>
     <w:lsdException w:name="index 2" w:semiHidden="1" w:unhideWhenUsed="1"/>
     <w:lsdException w:name="index 3" w:semiHidden="1" w:unhideWhenUsed="1"/>
@@ -4835,22 +5232,22 @@
     <w:lsdException w:name="index 7" w:semiHidden="1" w:unhideWhenUsed="1"/>
     <w:lsdException w:name="index 8" w:semiHidden="1" w:unhideWhenUsed="1"/>
     <w:lsdException w:name="index 9" w:semiHidden="1" w:unhideWhenUsed="1"/>
-    <w:lsdException w:name="toc 1" w:uiPriority="39" w:semiHidden="1" w:unhideWhenUsed="1"/>
-    <w:lsdException w:name="toc 2" w:uiPriority="39" w:semiHidden="1" w:unhideWhenUsed="1"/>
-    <w:lsdException w:name="toc 3" w:uiPriority="39" w:semiHidden="1" w:unhideWhenUsed="1"/>
-    <w:lsdException w:name="toc 4" w:uiPriority="39" w:semiHidden="1" w:unhideWhenUsed="1"/>
-    <w:lsdException w:name="toc 5" w:uiPriority="39" w:semiHidden="1" w:unhideWhenUsed="1"/>
-    <w:lsdException w:name="toc 6" w:uiPriority="39" w:semiHidden="1" w:unhideWhenUsed="1"/>
-    <w:lsdException w:name="toc 7" w:uiPriority="39" w:semiHidden="1" w:unhideWhenUsed="1"/>
-    <w:lsdException w:name="toc 8" w:uiPriority="39" w:semiHidden="1" w:unhideWhenUsed="1"/>
-    <w:lsdException w:name="toc 9" w:uiPriority="39" w:semiHidden="1" w:unhideWhenUsed="1"/>
+    <w:lsdException w:name="toc 1" w:semiHidden="1" w:uiPriority="39" w:unhideWhenUsed="1"/>
+    <w:lsdException w:name="toc 2" w:semiHidden="1" w:uiPriority="39" w:unhideWhenUsed="1"/>
+    <w:lsdException w:name="toc 3" w:semiHidden="1" w:uiPriority="39" w:unhideWhenUsed="1"/>
+    <w:lsdException w:name="toc 4" w:semiHidden="1" w:uiPriority="39" w:unhideWhenUsed="1"/>
+    <w:lsdException w:name="toc 5" w:semiHidden="1" w:uiPriority="39" w:unhideWhenUsed="1"/>
+    <w:lsdException w:name="toc 6" w:semiHidden="1" w:uiPriority="39" w:unhideWhenUsed="1"/>
+    <w:lsdException w:name="toc 7" w:semiHidden="1" w:uiPriority="39" w:unhideWhenUsed="1"/>
+    <w:lsdException w:name="toc 8" w:semiHidden="1" w:uiPriority="39" w:unhideWhenUsed="1"/>
+    <w:lsdException w:name="toc 9" w:semiHidden="1" w:uiPriority="39" w:unhideWhenUsed="1"/>
     <w:lsdException w:name="Normal Indent" w:semiHidden="1" w:unhideWhenUsed="1"/>
     <w:lsdException w:name="footnote text" w:semiHidden="1" w:unhideWhenUsed="1"/>
     <w:lsdException w:name="annotation text" w:semiHidden="1" w:unhideWhenUsed="1"/>
     <w:lsdException w:name="header" w:semiHidden="1" w:unhideWhenUsed="1"/>
     <w:lsdException w:name="footer" w:semiHidden="1" w:unhideWhenUsed="1"/>
     <w:lsdException w:name="index heading" w:semiHidden="1" w:unhideWhenUsed="1"/>
-    <w:lsdException w:name="caption" w:uiPriority="35" w:semiHidden="1" w:unhideWhenUsed="1" w:qFormat="1"/>
+    <w:lsdException w:name="caption" w:semiHidden="1" w:uiPriority="35" w:unhideWhenUsed="1" w:qFormat="1"/>
     <w:lsdException w:name="table of figures" w:semiHidden="1" w:unhideWhenUsed="1"/>
     <w:lsdException w:name="envelope address" w:semiHidden="1" w:unhideWhenUsed="1"/>
     <w:lsdException w:name="envelope return" w:semiHidden="1" w:unhideWhenUsed="1"/>
@@ -4881,7 +5278,7 @@
     <w:lsdException w:name="Title" w:uiPriority="10" w:qFormat="1"/>
     <w:lsdException w:name="Closing" w:semiHidden="1" w:unhideWhenUsed="1"/>
     <w:lsdException w:name="Signature" w:semiHidden="1" w:unhideWhenUsed="1"/>
-    <w:lsdException w:name="Default Paragraph Font" w:uiPriority="1" w:semiHidden="1" w:unhideWhenUsed="1"/>
+    <w:lsdException w:name="Default Paragraph Font" w:semiHidden="1" w:uiPriority="1" w:unhideWhenUsed="1"/>
     <w:lsdException w:name="Body Text" w:semiHidden="1" w:unhideWhenUsed="1"/>
     <w:lsdException w:name="Body Text Indent" w:semiHidden="1" w:unhideWhenUsed="1"/>
     <w:lsdException w:name="List Continue" w:semiHidden="1" w:unhideWhenUsed="1"/>
@@ -5081,8 +5478,8 @@
     <w:lsdException w:name="Subtle Reference" w:uiPriority="31" w:qFormat="1"/>
     <w:lsdException w:name="Intense Reference" w:uiPriority="32" w:qFormat="1"/>
     <w:lsdException w:name="Book Title" w:uiPriority="33" w:qFormat="1"/>
-    <w:lsdException w:name="Bibliography" w:uiPriority="37" w:semiHidden="1" w:unhideWhenUsed="1"/>
-    <w:lsdException w:name="TOC Heading" w:uiPriority="39" w:semiHidden="1" w:unhideWhenUsed="1" w:qFormat="1"/>
+    <w:lsdException w:name="Bibliography" w:semiHidden="1" w:uiPriority="37" w:unhideWhenUsed="1"/>
+    <w:lsdException w:name="TOC Heading" w:semiHidden="1" w:uiPriority="39" w:unhideWhenUsed="1" w:qFormat="1"/>
     <w:lsdException w:name="Plain Table 1" w:uiPriority="41"/>
     <w:lsdException w:name="Plain Table 2" w:uiPriority="42"/>
     <w:lsdException w:name="Plain Table 3" w:uiPriority="43"/>
@@ -5193,7 +5590,7 @@
     <w:lsdException w:name="Unresolved Mention" w:semiHidden="1" w:unhideWhenUsed="1"/>
     <w:lsdException w:name="Smart Link" w:semiHidden="1" w:unhideWhenUsed="1"/>
   </w:latentStyles>
-  <w:style w:type="paragraph" w:styleId="Normal" w:default="1">
+  <w:style w:type="paragraph" w:default="1" w:styleId="Normal">
     <w:name w:val="Normal"/>
     <w:qFormat/>
   </w:style>
@@ -5212,7 +5609,7 @@
       <w:outlineLvl w:val="0"/>
     </w:pPr>
     <w:rPr>
-      <w:rFonts w:asciiTheme="majorHAnsi" w:hAnsiTheme="majorHAnsi" w:eastAsiaTheme="majorEastAsia" w:cstheme="majorBidi"/>
+      <w:rFonts w:asciiTheme="majorHAnsi" w:eastAsiaTheme="majorEastAsia" w:hAnsiTheme="majorHAnsi" w:cstheme="majorBidi"/>
       <w:color w:val="0F4761" w:themeColor="accent1" w:themeShade="BF"/>
       <w:sz w:val="40"/>
       <w:szCs w:val="40"/>
@@ -5235,7 +5632,7 @@
       <w:outlineLvl w:val="1"/>
     </w:pPr>
     <w:rPr>
-      <w:rFonts w:asciiTheme="majorHAnsi" w:hAnsiTheme="majorHAnsi" w:eastAsiaTheme="majorEastAsia" w:cstheme="majorBidi"/>
+      <w:rFonts w:asciiTheme="majorHAnsi" w:eastAsiaTheme="majorEastAsia" w:hAnsiTheme="majorHAnsi" w:cstheme="majorBidi"/>
       <w:color w:val="0F4761" w:themeColor="accent1" w:themeShade="BF"/>
       <w:sz w:val="32"/>
       <w:szCs w:val="32"/>
@@ -5396,12 +5793,13 @@
       <w:color w:val="272727" w:themeColor="text1" w:themeTint="D8"/>
     </w:rPr>
   </w:style>
-  <w:style w:type="character" w:styleId="DefaultParagraphFont" w:default="1">
+  <w:style w:type="character" w:default="1" w:styleId="DefaultParagraphFont">
     <w:name w:val="Default Paragraph Font"/>
     <w:uiPriority w:val="1"/>
+    <w:semiHidden/>
     <w:unhideWhenUsed/>
   </w:style>
-  <w:style w:type="table" w:styleId="TableNormal" w:default="1">
+  <w:style w:type="table" w:default="1" w:styleId="TableNormal">
     <w:name w:val="Normal Table"/>
     <w:uiPriority w:val="99"/>
     <w:semiHidden/>
@@ -5416,26 +5814,26 @@
       </w:tblCellMar>
     </w:tblPr>
   </w:style>
-  <w:style w:type="numbering" w:styleId="NoList" w:default="1">
+  <w:style w:type="numbering" w:default="1" w:styleId="NoList">
     <w:name w:val="No List"/>
     <w:uiPriority w:val="99"/>
     <w:semiHidden/>
     <w:unhideWhenUsed/>
   </w:style>
-  <w:style w:type="character" w:styleId="Heading1Char" w:customStyle="1">
+  <w:style w:type="character" w:customStyle="1" w:styleId="Heading1Char">
     <w:name w:val="Heading 1 Char"/>
     <w:basedOn w:val="DefaultParagraphFont"/>
     <w:link w:val="Heading1"/>
     <w:uiPriority w:val="9"/>
     <w:rsid w:val="00C2735C"/>
     <w:rPr>
-      <w:rFonts w:asciiTheme="majorHAnsi" w:hAnsiTheme="majorHAnsi" w:eastAsiaTheme="majorEastAsia" w:cstheme="majorBidi"/>
+      <w:rFonts w:asciiTheme="majorHAnsi" w:eastAsiaTheme="majorEastAsia" w:hAnsiTheme="majorHAnsi" w:cstheme="majorBidi"/>
       <w:color w:val="0F4761" w:themeColor="accent1" w:themeShade="BF"/>
       <w:sz w:val="40"/>
       <w:szCs w:val="40"/>
     </w:rPr>
   </w:style>
-  <w:style w:type="character" w:styleId="Heading2Char" w:customStyle="1">
+  <w:style w:type="character" w:customStyle="1" w:styleId="Heading2Char">
     <w:name w:val="Heading 2 Char"/>
     <w:basedOn w:val="DefaultParagraphFont"/>
     <w:link w:val="Heading2"/>
@@ -5443,13 +5841,13 @@
     <w:semiHidden/>
     <w:rsid w:val="00C2735C"/>
     <w:rPr>
-      <w:rFonts w:asciiTheme="majorHAnsi" w:hAnsiTheme="majorHAnsi" w:eastAsiaTheme="majorEastAsia" w:cstheme="majorBidi"/>
+      <w:rFonts w:asciiTheme="majorHAnsi" w:eastAsiaTheme="majorEastAsia" w:hAnsiTheme="majorHAnsi" w:cstheme="majorBidi"/>
       <w:color w:val="0F4761" w:themeColor="accent1" w:themeShade="BF"/>
       <w:sz w:val="32"/>
       <w:szCs w:val="32"/>
     </w:rPr>
   </w:style>
-  <w:style w:type="character" w:styleId="Heading3Char" w:customStyle="1">
+  <w:style w:type="character" w:customStyle="1" w:styleId="Heading3Char">
     <w:name w:val="Heading 3 Char"/>
     <w:basedOn w:val="DefaultParagraphFont"/>
     <w:link w:val="Heading3"/>
@@ -5463,7 +5861,7 @@
       <w:szCs w:val="28"/>
     </w:rPr>
   </w:style>
-  <w:style w:type="character" w:styleId="Heading4Char" w:customStyle="1">
+  <w:style w:type="character" w:customStyle="1" w:styleId="Heading4Char">
     <w:name w:val="Heading 4 Char"/>
     <w:basedOn w:val="DefaultParagraphFont"/>
     <w:link w:val="Heading4"/>
@@ -5477,7 +5875,7 @@
       <w:color w:val="0F4761" w:themeColor="accent1" w:themeShade="BF"/>
     </w:rPr>
   </w:style>
-  <w:style w:type="character" w:styleId="Heading5Char" w:customStyle="1">
+  <w:style w:type="character" w:customStyle="1" w:styleId="Heading5Char">
     <w:name w:val="Heading 5 Char"/>
     <w:basedOn w:val="DefaultParagraphFont"/>
     <w:link w:val="Heading5"/>
@@ -5489,7 +5887,7 @@
       <w:color w:val="0F4761" w:themeColor="accent1" w:themeShade="BF"/>
     </w:rPr>
   </w:style>
-  <w:style w:type="character" w:styleId="Heading6Char" w:customStyle="1">
+  <w:style w:type="character" w:customStyle="1" w:styleId="Heading6Char">
     <w:name w:val="Heading 6 Char"/>
     <w:basedOn w:val="DefaultParagraphFont"/>
     <w:link w:val="Heading6"/>
@@ -5503,7 +5901,7 @@
       <w:color w:val="595959" w:themeColor="text1" w:themeTint="A6"/>
     </w:rPr>
   </w:style>
-  <w:style w:type="character" w:styleId="Heading7Char" w:customStyle="1">
+  <w:style w:type="character" w:customStyle="1" w:styleId="Heading7Char">
     <w:name w:val="Heading 7 Char"/>
     <w:basedOn w:val="DefaultParagraphFont"/>
     <w:link w:val="Heading7"/>
@@ -5515,7 +5913,7 @@
       <w:color w:val="595959" w:themeColor="text1" w:themeTint="A6"/>
     </w:rPr>
   </w:style>
-  <w:style w:type="character" w:styleId="Heading8Char" w:customStyle="1">
+  <w:style w:type="character" w:customStyle="1" w:styleId="Heading8Char">
     <w:name w:val="Heading 8 Char"/>
     <w:basedOn w:val="DefaultParagraphFont"/>
     <w:link w:val="Heading8"/>
@@ -5529,7 +5927,7 @@
       <w:color w:val="272727" w:themeColor="text1" w:themeTint="D8"/>
     </w:rPr>
   </w:style>
-  <w:style w:type="character" w:styleId="Heading9Char" w:customStyle="1">
+  <w:style w:type="character" w:customStyle="1" w:styleId="Heading9Char">
     <w:name w:val="Heading 9 Char"/>
     <w:basedOn w:val="DefaultParagraphFont"/>
     <w:link w:val="Heading9"/>
@@ -5554,21 +5952,21 @@
       <w:contextualSpacing/>
     </w:pPr>
     <w:rPr>
-      <w:rFonts w:asciiTheme="majorHAnsi" w:hAnsiTheme="majorHAnsi" w:eastAsiaTheme="majorEastAsia" w:cstheme="majorBidi"/>
+      <w:rFonts w:asciiTheme="majorHAnsi" w:eastAsiaTheme="majorEastAsia" w:hAnsiTheme="majorHAnsi" w:cstheme="majorBidi"/>
       <w:spacing w:val="-10"/>
       <w:kern w:val="28"/>
       <w:sz w:val="56"/>
       <w:szCs w:val="56"/>
     </w:rPr>
   </w:style>
-  <w:style w:type="character" w:styleId="TitleChar" w:customStyle="1">
+  <w:style w:type="character" w:customStyle="1" w:styleId="TitleChar">
     <w:name w:val="Title Char"/>
     <w:basedOn w:val="DefaultParagraphFont"/>
     <w:link w:val="Title"/>
     <w:uiPriority w:val="10"/>
     <w:rsid w:val="00C2735C"/>
     <w:rPr>
-      <w:rFonts w:asciiTheme="majorHAnsi" w:hAnsiTheme="majorHAnsi" w:eastAsiaTheme="majorEastAsia" w:cstheme="majorBidi"/>
+      <w:rFonts w:asciiTheme="majorHAnsi" w:eastAsiaTheme="majorEastAsia" w:hAnsiTheme="majorHAnsi" w:cstheme="majorBidi"/>
       <w:spacing w:val="-10"/>
       <w:kern w:val="28"/>
       <w:sz w:val="56"/>
@@ -5596,7 +5994,7 @@
       <w:szCs w:val="28"/>
     </w:rPr>
   </w:style>
-  <w:style w:type="character" w:styleId="SubtitleChar" w:customStyle="1">
+  <w:style w:type="character" w:customStyle="1" w:styleId="SubtitleChar">
     <w:name w:val="Subtitle Char"/>
     <w:basedOn w:val="DefaultParagraphFont"/>
     <w:link w:val="Subtitle"/>
@@ -5628,7 +6026,7 @@
       <w:color w:val="404040" w:themeColor="text1" w:themeTint="BF"/>
     </w:rPr>
   </w:style>
-  <w:style w:type="character" w:styleId="QuoteChar" w:customStyle="1">
+  <w:style w:type="character" w:customStyle="1" w:styleId="QuoteChar">
     <w:name w:val="Quote Char"/>
     <w:basedOn w:val="DefaultParagraphFont"/>
     <w:link w:val="Quote"/>
@@ -5673,8 +6071,8 @@
     <w:rsid w:val="00C2735C"/>
     <w:pPr>
       <w:pBdr>
-        <w:top w:val="single" w:color="0F4761" w:themeColor="accent1" w:themeShade="BF" w:sz="4" w:space="10"/>
-        <w:bottom w:val="single" w:color="0F4761" w:themeColor="accent1" w:themeShade="BF" w:sz="4" w:space="10"/>
+        <w:top w:val="single" w:sz="4" w:space="10" w:color="0F4761" w:themeColor="accent1" w:themeShade="BF"/>
+        <w:bottom w:val="single" w:sz="4" w:space="10" w:color="0F4761" w:themeColor="accent1" w:themeShade="BF"/>
       </w:pBdr>
       <w:spacing w:before="360" w:after="360"/>
       <w:ind w:left="864" w:right="864"/>
@@ -5686,7 +6084,7 @@
       <w:color w:val="0F4761" w:themeColor="accent1" w:themeShade="BF"/>
     </w:rPr>
   </w:style>
-  <w:style w:type="character" w:styleId="IntenseQuoteChar" w:customStyle="1">
+  <w:style w:type="character" w:customStyle="1" w:styleId="IntenseQuoteChar">
     <w:name w:val="Intense Quote Char"/>
     <w:basedOn w:val="DefaultParagraphFont"/>
     <w:link w:val="IntenseQuote"/>
@@ -5739,7 +6137,7 @@
 </file>
 
 <file path=word/theme/theme1.xml><?xml version="1.0" encoding="utf-8"?>
-<a:theme xmlns:a="http://schemas.openxmlformats.org/drawingml/2006/main" xmlns:thm15="http://schemas.microsoft.com/office/thememl/2012/main" name="Office Theme">
+<a:theme xmlns:a="http://schemas.openxmlformats.org/drawingml/2006/main" name="Office Theme">
   <a:themeElements>
     <a:clrScheme name="Office">
       <a:dk1>

</xml_diff>

<commit_message>
Add GDPR and remaining security controls to the briefing.
Cover Turnstile, throttling, session revoke, field-level encryption,
headers, anomaly detection, identity-share passwords, call recordings,
data-subject rights, and Privacy Policy / Terms — without claiming
a GDPR certificate.

Co-authored-by: Cursor <cursoragent@cursor.com>
</commit_message>
<xml_diff>
--- a/docs/Webinar-Plan-TMA-Portal.docx
+++ b/docs/Webinar-Plan-TMA-Portal.docx
@@ -2271,25 +2271,27 @@
     </w:p>
     <w:p>
       <w:r>
-        <w:lastRenderedPageBreak/>
         <w:br w:type="page"/>
       </w:r>
       <w:r>
         <w:rPr>
           <w:b/>
         </w:rPr>
-        <w:lastRenderedPageBreak/>
         <w:t>SECURITY TALKING POINTS</w:t>
       </w:r>
     </w:p>
     <w:p>
-      <w:pPr>
-        <w:rPr>
-          <w:lang w:val="en-US"/>
-        </w:rPr>
-      </w:pPr>
-    </w:p>
-    <w:p>
+      <w:r>
+        <w:t>Say this in plain English. Short lines. Stop after each block and ask if it is clear.</w:t>
+      </w:r>
+    </w:p>
+    <w:p>
+      <w:r>
+        <w:t>This is not a technical lecture. It is so a partner or a case handler can repeat it to a client.</w:t>
+      </w:r>
+    </w:p>
+    <w:p>
+      <w:pPr/>
       <w:r>
         <w:rPr>
           <w:b/>
@@ -2306,10 +2308,7 @@
         </w:numPr>
       </w:pPr>
       <w:r>
-        <w:t xml:space="preserve">The portal is built for confidential client work. </w:t>
-      </w:r>
-      <w:r>
-        <w:t>That is what it is for.</w:t>
+        <w:t>The portal is built for confidential client work. That is what it is for.</w:t>
       </w:r>
     </w:p>
     <w:p>
@@ -2345,31 +2344,47 @@
         </w:numPr>
       </w:pPr>
       <w:r>
-        <w:t>Built in-house by TM ANTOINE.</w:t>
-      </w:r>
-    </w:p>
-    <w:p>
-      <w:pPr>
-        <w:pStyle w:val="ListParagraph"/>
-        <w:numPr>
-          <w:ilvl w:val="0"/>
-          <w:numId w:val="3"/>
-        </w:numPr>
-      </w:pPr>
-      <w:r>
-        <w:t>Live site: portal.tmantoinelaw.com. Live mail:</w:t>
-      </w:r>
-      <w:r>
-        <w:rPr>
-          <w:lang w:val="en-US"/>
-        </w:rPr>
-        <w:t xml:space="preserve"> </w:t>
-      </w:r>
-      <w:r>
-        <w:t>support@tmantoinelaw.com.</w:t>
-      </w:r>
-    </w:p>
-    <w:p>
+        <w:t>Built in-house by TM ANTOINE. Not a rented or white-label product.</w:t>
+      </w:r>
+    </w:p>
+    <w:p>
+      <w:pPr>
+        <w:pStyle w:val="ListParagraph"/>
+        <w:numPr>
+          <w:ilvl w:val="0"/>
+          <w:numId w:val="3"/>
+        </w:numPr>
+      </w:pPr>
+      <w:r>
+        <w:t>Live site: portal.tmantoinelaw.com. Live mail: portal@tmantoinelaw.com and support@tmantoinelaw.com.</w:t>
+      </w:r>
+    </w:p>
+    <w:p>
+      <w:pPr>
+        <w:pStyle w:val="ListParagraph"/>
+        <w:numPr>
+          <w:ilvl w:val="0"/>
+          <w:numId w:val="3"/>
+        </w:numPr>
+      </w:pPr>
+      <w:r>
+        <w:t>support@tmantoine.com was staging. Do not use it.</w:t>
+      </w:r>
+    </w:p>
+    <w:p>
+      <w:pPr>
+        <w:pStyle w:val="ListParagraph"/>
+        <w:numPr>
+          <w:ilvl w:val="0"/>
+          <w:numId w:val="3"/>
+        </w:numPr>
+      </w:pPr>
+      <w:r>
+        <w:t>If the address bar is not portal.tmantoinelaw.com, stop. Email support before anyone types a password or a code.</w:t>
+      </w:r>
+    </w:p>
+    <w:p>
+      <w:pPr/>
       <w:r>
         <w:rPr>
           <w:b/>
@@ -2398,58 +2413,47 @@
         </w:numPr>
       </w:pPr>
       <w:r>
-        <w:t>Service provider</w:t>
-      </w:r>
-      <w:r>
-        <w:t xml:space="preserve"> a named person at your firm. Works every CIP file that belongs to your company, not only the ones they created.</w:t>
-      </w:r>
-    </w:p>
-    <w:p>
-      <w:pPr>
-        <w:pStyle w:val="ListParagraph"/>
-        <w:numPr>
-          <w:ilvl w:val="0"/>
-          <w:numId w:val="3"/>
-        </w:numPr>
-      </w:pPr>
-      <w:r>
-        <w:t>Service provider admin</w:t>
-      </w:r>
-      <w:r>
-        <w:t xml:space="preserve"> the person your firm names to us. Invites colleagues and removes them when someone leaves.</w:t>
-      </w:r>
-    </w:p>
-    <w:p>
-      <w:pPr>
-        <w:pStyle w:val="ListParagraph"/>
-        <w:numPr>
-          <w:ilvl w:val="0"/>
-          <w:numId w:val="3"/>
-        </w:numPr>
-      </w:pPr>
-      <w:r>
-        <w:t>CRO / reviewing officer</w:t>
-      </w:r>
-      <w:r>
-        <w:t xml:space="preserve"> a TM ANTOINE officer who reviews files. Not your staff.</w:t>
-      </w:r>
-    </w:p>
-    <w:p>
-      <w:pPr>
-        <w:pStyle w:val="ListParagraph"/>
-        <w:numPr>
-          <w:ilvl w:val="0"/>
-          <w:numId w:val="3"/>
-        </w:numPr>
-      </w:pPr>
-      <w:r>
-        <w:t xml:space="preserve">Administrator </w:t>
-      </w:r>
-      <w:r>
-        <w:t>TM ANTOINE only. Approves new accounts and holds firm-wide settings. No service-provider person is one.</w:t>
-      </w:r>
-    </w:p>
-    <w:p>
+        <w:t>Service provider — a named person at your firm. Works every CIP file that belongs to your company, not only the ones they created.</w:t>
+      </w:r>
+    </w:p>
+    <w:p>
+      <w:pPr>
+        <w:pStyle w:val="ListParagraph"/>
+        <w:numPr>
+          <w:ilvl w:val="0"/>
+          <w:numId w:val="3"/>
+        </w:numPr>
+      </w:pPr>
+      <w:r>
+        <w:t>Service provider admin — the person your firm names to us. Invites colleagues and removes them when someone leaves.</w:t>
+      </w:r>
+    </w:p>
+    <w:p>
+      <w:pPr>
+        <w:pStyle w:val="ListParagraph"/>
+        <w:numPr>
+          <w:ilvl w:val="0"/>
+          <w:numId w:val="3"/>
+        </w:numPr>
+      </w:pPr>
+      <w:r>
+        <w:t>CRO / reviewing officer — a TM ANTOINE officer who reviews files. Not your staff.</w:t>
+      </w:r>
+    </w:p>
+    <w:p>
+      <w:pPr>
+        <w:pStyle w:val="ListParagraph"/>
+        <w:numPr>
+          <w:ilvl w:val="0"/>
+          <w:numId w:val="3"/>
+        </w:numPr>
+      </w:pPr>
+      <w:r>
+        <w:t>Administrator — TM ANTOINE only. Approves new accounts and holds firm-wide settings. No service-provider person is one.</w:t>
+      </w:r>
+    </w:p>
+    <w:p>
+      <w:pPr/>
       <w:r>
         <w:rPr>
           <w:b/>
@@ -2542,6 +2546,7 @@
       </w:r>
     </w:p>
     <w:p>
+      <w:pPr/>
       <w:r>
         <w:rPr>
           <w:b/>
@@ -2558,16 +2563,7 @@
         </w:numPr>
       </w:pPr>
       <w:r>
-        <w:t xml:space="preserve">Today: if the device </w:t>
-      </w:r>
-      <w:r>
-        <w:rPr>
-          <w:lang w:val="en-US"/>
-        </w:rPr>
-        <w:t xml:space="preserve">or browser </w:t>
-      </w:r>
-      <w:r>
-        <w:t>changes, the portal sends a six-digit code.</w:t>
+        <w:t>Today: if the device changes, the portal sends a six-digit code.</w:t>
       </w:r>
     </w:p>
     <w:p>
@@ -2591,19 +2587,7 @@
         </w:numPr>
       </w:pPr>
       <w:r>
-        <w:t xml:space="preserve">After this webinar: every service-provider account must connect an authenticator app </w:t>
-      </w:r>
-      <w:r>
-        <w:t xml:space="preserve"> Google Authenticator</w:t>
-      </w:r>
-      <w:r>
-        <w:rPr>
-          <w:lang w:val="en-US"/>
-        </w:rPr>
-        <w:t xml:space="preserve"> or </w:t>
-      </w:r>
-      <w:r>
-        <w:t>Microsoft Authenticator</w:t>
+        <w:t>After this webinar: every service-provider account must connect an authenticator app — Google Authenticator, Microsoft Authenticator, or Authy.</w:t>
       </w:r>
     </w:p>
     <w:p>
@@ -2639,7 +2623,6 @@
         </w:numPr>
       </w:pPr>
       <w:r>
-        <w:lastRenderedPageBreak/>
         <w:t>Keep the recovery codes offline. They are the only way back in if the phone is lost.</w:t>
       </w:r>
     </w:p>
@@ -2656,6 +2639,43 @@
       </w:r>
     </w:p>
     <w:p>
+      <w:pPr>
+        <w:pStyle w:val="ListParagraph"/>
+        <w:numPr>
+          <w:ilvl w:val="0"/>
+          <w:numId w:val="3"/>
+        </w:numPr>
+      </w:pPr>
+      <w:r>
+        <w:t>Cloudflare Turnstile sits on the sign-in door so automated guessing is stopped early.</w:t>
+      </w:r>
+    </w:p>
+    <w:p>
+      <w:pPr>
+        <w:pStyle w:val="ListParagraph"/>
+        <w:numPr>
+          <w:ilvl w:val="0"/>
+          <w:numId w:val="3"/>
+        </w:numPr>
+      </w:pPr>
+      <w:r>
+        <w:t>Sign-in is rate-limited: about five tries a minute for a given email and network.</w:t>
+      </w:r>
+    </w:p>
+    <w:p>
+      <w:pPr>
+        <w:pStyle w:val="ListParagraph"/>
+        <w:numPr>
+          <w:ilvl w:val="0"/>
+          <w:numId w:val="3"/>
+        </w:numPr>
+      </w:pPr>
+      <w:r>
+        <w:t>Trusted devices and other sessions can be ended from Settings → Account Security.</w:t>
+      </w:r>
+    </w:p>
+    <w:p>
+      <w:pPr/>
       <w:r>
         <w:rPr>
           <w:b/>
@@ -2712,6 +2732,7 @@
       </w:r>
     </w:p>
     <w:p>
+      <w:pPr/>
       <w:r>
         <w:rPr>
           <w:b/>
@@ -2726,14 +2747,8 @@
           <w:ilvl w:val="0"/>
           <w:numId w:val="3"/>
         </w:numPr>
-        <w:rPr>
-          <w:color w:val="EE0000"/>
-        </w:rPr>
-      </w:pPr>
-      <w:r>
-        <w:rPr>
-          <w:color w:val="EE0000"/>
-        </w:rPr>
+      </w:pPr>
+      <w:r>
         <w:t>On the way: the lock in the browser (https). Someone watching the network cannot read the pages or the files.</w:t>
       </w:r>
     </w:p>
@@ -2746,7 +2761,19 @@
         </w:numPr>
       </w:pPr>
       <w:r>
-        <w:t>At rest: files are stored locked, not as open PDFs on a disk.</w:t>
+        <w:t>At rest: vault files and call recordings are stored locked, not as open files on a disk.</w:t>
+      </w:r>
+    </w:p>
+    <w:p>
+      <w:pPr>
+        <w:pStyle w:val="ListParagraph"/>
+        <w:numPr>
+          <w:ilvl w:val="0"/>
+          <w:numId w:val="3"/>
+        </w:numPr>
+      </w:pPr>
+      <w:r>
+        <w:t>In the fields: passport numbers and dates of birth are encrypted in the database itself.</w:t>
       </w:r>
     </w:p>
     <w:p>
@@ -2782,10 +2809,59 @@
         </w:numPr>
       </w:pPr>
       <w:r>
+        <w:t>Pages send browser security headers: CSP, HSTS, framing protections, and related limits.</w:t>
+      </w:r>
+    </w:p>
+    <w:p>
+      <w:pPr>
+        <w:pStyle w:val="ListParagraph"/>
+        <w:numPr>
+          <w:ilvl w:val="0"/>
+          <w:numId w:val="3"/>
+        </w:numPr>
+      </w:pPr>
+      <w:r>
+        <w:t>Uploaded files are never executed by the web server.</w:t>
+      </w:r>
+    </w:p>
+    <w:p>
+      <w:pPr>
+        <w:pStyle w:val="ListParagraph"/>
+        <w:numPr>
+          <w:ilvl w:val="0"/>
+          <w:numId w:val="3"/>
+        </w:numPr>
+      </w:pPr>
+      <w:r>
+        <w:t>Every action is checked again on the server. The browser is never trusted to decide who may do what.</w:t>
+      </w:r>
+    </w:p>
+    <w:p>
+      <w:pPr>
+        <w:pStyle w:val="ListParagraph"/>
+        <w:numPr>
+          <w:ilvl w:val="0"/>
+          <w:numId w:val="3"/>
+        </w:numPr>
+      </w:pPr>
+      <w:r>
         <w:t>Every action is logged: who, what, when, including who opened a document. Users cannot edit that log.</w:t>
       </w:r>
     </w:p>
     <w:p>
+      <w:pPr>
+        <w:pStyle w:val="ListParagraph"/>
+        <w:numPr>
+          <w:ilvl w:val="0"/>
+          <w:numId w:val="3"/>
+        </w:numPr>
+      </w:pPr>
+      <w:r>
+        <w:t>Detectors flag impossible travel, address spikes, and download bursts for human review — they do not auto-lock a working account.</w:t>
+      </w:r>
+    </w:p>
+    <w:p>
+      <w:pPr/>
       <w:r>
         <w:rPr>
           <w:b/>
@@ -2826,513 +2902,480 @@
         </w:numPr>
       </w:pPr>
       <w:r>
-        <w:t xml:space="preserve">Public upload links are capped at 5–10 MB. That is a </w:t>
-      </w:r>
+        <w:t>Public upload links are capped at 5–10 MB. That is a security limit as well as a practical one.</w:t>
+      </w:r>
+    </w:p>
+    <w:p>
+      <w:pPr>
+        <w:pStyle w:val="ListParagraph"/>
+        <w:numPr>
+          <w:ilvl w:val="0"/>
+          <w:numId w:val="3"/>
+        </w:numPr>
+      </w:pPr>
+      <w:r>
+        <w:t>Every upload is scanned for malware. A file that fails cannot be opened or downloaded.</w:t>
+      </w:r>
+    </w:p>
+    <w:p>
+      <w:pPr>
+        <w:pStyle w:val="ListParagraph"/>
+        <w:numPr>
+          <w:ilvl w:val="0"/>
+          <w:numId w:val="3"/>
+        </w:numPr>
+      </w:pPr>
+      <w:r>
+        <w:t>Public links to identity documents must carry a password. A forwarded URL alone is not enough.</w:t>
+      </w:r>
+    </w:p>
+    <w:p>
+      <w:pPr>
+        <w:pStyle w:val="ListParagraph"/>
+        <w:numPr>
+          <w:ilvl w:val="0"/>
+          <w:numId w:val="3"/>
+        </w:numPr>
+      </w:pPr>
+      <w:r>
+        <w:t>All documents go through the portal. Do not email them.</w:t>
+      </w:r>
+    </w:p>
+    <w:p>
+      <w:pPr/>
       <w:r>
         <w:rPr>
           <w:b/>
-          <w:bCs/>
-          <w:u w:val="single"/>
-        </w:rPr>
-        <w:t>security limit</w:t>
-      </w:r>
-      <w:r>
-        <w:t xml:space="preserve"> as well as a practical one.</w:t>
-      </w:r>
-    </w:p>
-    <w:p>
-      <w:pPr>
-        <w:pStyle w:val="ListParagraph"/>
-        <w:numPr>
-          <w:ilvl w:val="0"/>
-          <w:numId w:val="3"/>
-        </w:numPr>
-      </w:pPr>
-      <w:r>
-        <w:t xml:space="preserve">Every upload is </w:t>
-      </w:r>
+        </w:rPr>
+        <w:t>If the portal is down</w:t>
+      </w:r>
+    </w:p>
+    <w:p>
+      <w:pPr>
+        <w:pStyle w:val="ListParagraph"/>
+        <w:numPr>
+          <w:ilvl w:val="0"/>
+          <w:numId w:val="3"/>
+        </w:numPr>
+      </w:pPr>
+      <w:r>
+        <w:t>Working files sit in the portal store.</w:t>
+      </w:r>
+    </w:p>
+    <w:p>
+      <w:pPr>
+        <w:pStyle w:val="ListParagraph"/>
+        <w:numPr>
+          <w:ilvl w:val="0"/>
+          <w:numId w:val="3"/>
+        </w:numPr>
+      </w:pPr>
+      <w:r>
+        <w:t>A live copy sits in Microsoft 365 / SharePoint.</w:t>
+      </w:r>
+    </w:p>
+    <w:p>
+      <w:pPr>
+        <w:pStyle w:val="ListParagraph"/>
+        <w:numPr>
+          <w:ilvl w:val="0"/>
+          <w:numId w:val="3"/>
+        </w:numPr>
+      </w:pPr>
+      <w:r>
+        <w:t>The host takes a daily backup of the site.</w:t>
+      </w:r>
+    </w:p>
+    <w:p>
+      <w:pPr>
+        <w:pStyle w:val="ListParagraph"/>
+        <w:numPr>
+          <w:ilvl w:val="0"/>
+          <w:numId w:val="3"/>
+        </w:numPr>
+      </w:pPr>
+      <w:r>
+        <w:t>The application and the database run together in the United States, with Cloudflare in front.</w:t>
+      </w:r>
+    </w:p>
+    <w:p>
+      <w:pPr>
+        <w:pStyle w:val="ListParagraph"/>
+        <w:numPr>
+          <w:ilvl w:val="0"/>
+          <w:numId w:val="3"/>
+        </w:numPr>
+      </w:pPr>
+      <w:r>
+        <w:t>Call recordings: access is logged, legal hold can stop deletion, past-retention copies without hold are pruned.</w:t>
+      </w:r>
+    </w:p>
+    <w:p>
+      <w:pPr/>
       <w:r>
         <w:rPr>
           <w:b/>
-          <w:bCs/>
-          <w:u w:val="single"/>
-        </w:rPr>
-        <w:t>scanned for malware</w:t>
-      </w:r>
-      <w:r>
-        <w:t>. A file that fails cannot be opened or downloaded.</w:t>
-      </w:r>
-    </w:p>
-    <w:p>
-      <w:pPr>
-        <w:pStyle w:val="ListParagraph"/>
-        <w:numPr>
-          <w:ilvl w:val="0"/>
-          <w:numId w:val="3"/>
-        </w:numPr>
-      </w:pPr>
-      <w:r>
-        <w:t>All documents go through the portal. Do not email them.</w:t>
-      </w:r>
-    </w:p>
-    <w:p>
+        </w:rPr>
+        <w:t>Bespoke AI</w:t>
+      </w:r>
+    </w:p>
+    <w:p>
+      <w:pPr>
+        <w:pStyle w:val="ListParagraph"/>
+        <w:numPr>
+          <w:ilvl w:val="0"/>
+          <w:numId w:val="3"/>
+        </w:numPr>
+      </w:pPr>
+      <w:r>
+        <w:t>Use it. It knows this portal.</w:t>
+      </w:r>
+    </w:p>
+    <w:p>
+      <w:pPr>
+        <w:pStyle w:val="ListParagraph"/>
+        <w:numPr>
+          <w:ilvl w:val="0"/>
+          <w:numId w:val="3"/>
+        </w:numPr>
+      </w:pPr>
+      <w:r>
+        <w:t>Ask how a step works, or what is still missing on the file you have open.</w:t>
+      </w:r>
+    </w:p>
+    <w:p>
+      <w:pPr>
+        <w:pStyle w:val="ListParagraph"/>
+        <w:numPr>
+          <w:ilvl w:val="0"/>
+          <w:numId w:val="3"/>
+        </w:numPr>
+      </w:pPr>
+      <w:r>
+        <w:t>It cannot see other firms' files. It cannot see keys.</w:t>
+      </w:r>
+    </w:p>
+    <w:p>
+      <w:pPr>
+        <w:pStyle w:val="ListParagraph"/>
+        <w:numPr>
+          <w:ilvl w:val="0"/>
+          <w:numId w:val="3"/>
+        </w:numPr>
+      </w:pPr>
+      <w:r>
+        <w:t>Do not paste passwords or authenticator codes into it.</w:t>
+      </w:r>
+    </w:p>
+    <w:p>
+      <w:pPr/>
       <w:r>
         <w:rPr>
           <w:b/>
         </w:rPr>
-        <w:t>If the portal is down</w:t>
-      </w:r>
-    </w:p>
-    <w:p>
-      <w:pPr>
-        <w:pStyle w:val="ListParagraph"/>
-        <w:numPr>
-          <w:ilvl w:val="0"/>
-          <w:numId w:val="3"/>
-        </w:numPr>
-      </w:pPr>
-      <w:r>
-        <w:t>A live copy sits in Microsoft 365 / SharePoint.</w:t>
-      </w:r>
-    </w:p>
-    <w:p>
-      <w:pPr>
-        <w:pStyle w:val="ListParagraph"/>
-        <w:numPr>
-          <w:ilvl w:val="0"/>
-          <w:numId w:val="3"/>
-        </w:numPr>
-      </w:pPr>
-      <w:r>
-        <w:t>The host takes a daily backup of the site.</w:t>
-      </w:r>
-    </w:p>
-    <w:p>
-      <w:pPr>
-        <w:pStyle w:val="ListParagraph"/>
-        <w:numPr>
-          <w:ilvl w:val="0"/>
-          <w:numId w:val="3"/>
-        </w:numPr>
-      </w:pPr>
-      <w:r>
-        <w:t>The application and the database run together in the United States, with Cloudflare in front.</w:t>
-      </w:r>
-    </w:p>
-    <w:p>
-      <w:pPr>
+        <w:t>If something breaks</w:t>
+      </w:r>
+    </w:p>
+    <w:p>
+      <w:pPr>
+        <w:pStyle w:val="ListParagraph"/>
+        <w:numPr>
+          <w:ilvl w:val="0"/>
+          <w:numId w:val="3"/>
+        </w:numPr>
+      </w:pPr>
+      <w:r>
+        <w:t>Email support@tmantoinelaw.com. That mailbox is shared with TM ANTOINE admins.</w:t>
+      </w:r>
+    </w:p>
+    <w:p>
+      <w:pPr>
+        <w:pStyle w:val="ListParagraph"/>
+        <w:numPr>
+          <w:ilvl w:val="0"/>
+          <w:numId w:val="3"/>
+        </w:numPr>
+      </w:pPr>
+      <w:r>
+        <w:t>Aim: a reply within an hour, if people are available.</w:t>
+      </w:r>
+    </w:p>
+    <w:p>
+      <w:pPr>
+        <w:pStyle w:val="ListParagraph"/>
+        <w:numPr>
+          <w:ilvl w:val="0"/>
+          <w:numId w:val="3"/>
+        </w:numPr>
+      </w:pPr>
+      <w:r>
+        <w:t>Vernon Francis is the main technical contact.</w:t>
+      </w:r>
+    </w:p>
+    <w:p>
+      <w:pPr>
+        <w:pStyle w:val="ListParagraph"/>
+        <w:numPr>
+          <w:ilvl w:val="0"/>
+          <w:numId w:val="3"/>
+        </w:numPr>
+      </w:pPr>
+      <w:r>
+        <w:t>If you can still sign in, message Cindy McLean, Emmanuel McLean, Krishna Manru, or Vernon in the portal.</w:t>
+      </w:r>
+    </w:p>
+    <w:p>
+      <w:pPr>
+        <w:pStyle w:val="ListParagraph"/>
+        <w:numPr>
+          <w:ilvl w:val="0"/>
+          <w:numId w:val="3"/>
+        </w:numPr>
+      </w:pPr>
+      <w:r>
+        <w:t>Send: the page you were on, the account email, the CIP number if there is one, and what you clicked.</w:t>
+      </w:r>
+    </w:p>
+    <w:p>
+      <w:pPr>
+        <w:pStyle w:val="ListParagraph"/>
+        <w:numPr>
+          <w:ilvl w:val="0"/>
+          <w:numId w:val="3"/>
+        </w:numPr>
+      </w:pPr>
+      <w:r>
+        <w:t>Never send a sign-in code or an authenticator code.</w:t>
+      </w:r>
+    </w:p>
+    <w:p>
+      <w:pPr/>
+      <w:r>
         <w:rPr>
           <w:b/>
-          <w:lang w:val="en-US"/>
-        </w:rPr>
-      </w:pPr>
-    </w:p>
-    <w:p>
-      <w:pPr>
+        </w:rPr>
+        <w:t>Legal and data — if asked</w:t>
+      </w:r>
+    </w:p>
+    <w:p>
+      <w:pPr>
+        <w:pStyle w:val="ListParagraph"/>
+        <w:numPr>
+          <w:ilvl w:val="0"/>
+          <w:numId w:val="3"/>
+        </w:numPr>
+      </w:pPr>
+      <w:r>
+        <w:t>We do not claim a GDPR certificate. Where GDPR or a similar regime applies, we support it with a DPA, SCCs where right, documented processors, retention and deletion, and breach notice.</w:t>
+      </w:r>
+    </w:p>
+    <w:p>
+      <w:pPr>
+        <w:pStyle w:val="ListParagraph"/>
+        <w:numPr>
+          <w:ilvl w:val="0"/>
+          <w:numId w:val="3"/>
+        </w:numPr>
+      </w:pPr>
+      <w:r>
+        <w:t>Host: Laravel Cloud on Amazon Web Services, United States, plus Cloudflare.</w:t>
+      </w:r>
+    </w:p>
+    <w:p>
+      <w:pPr>
+        <w:pStyle w:val="ListParagraph"/>
+        <w:numPr>
+          <w:ilvl w:val="0"/>
+          <w:numId w:val="3"/>
+        </w:numPr>
+      </w:pPr>
+      <w:r>
+        <w:t>Encrypted in transit, at rest, and at field level for passport numbers and dates of birth.</w:t>
+      </w:r>
+    </w:p>
+    <w:p>
+      <w:pPr>
+        <w:pStyle w:val="ListParagraph"/>
+        <w:numPr>
+          <w:ilvl w:val="0"/>
+          <w:numId w:val="3"/>
+        </w:numPr>
+      </w:pPr>
+      <w:r>
+        <w:t>Company members see every application for the company, not only their own.</w:t>
+      </w:r>
+    </w:p>
+    <w:p>
+      <w:pPr>
+        <w:pStyle w:val="ListParagraph"/>
+        <w:numPr>
+          <w:ilvl w:val="0"/>
+          <w:numId w:val="3"/>
+        </w:numPr>
+      </w:pPr>
+      <w:r>
+        <w:t>Data Processing Agreement: yes, pending review by our legal team.</w:t>
+      </w:r>
+    </w:p>
+    <w:p>
+      <w:pPr>
+        <w:pStyle w:val="ListParagraph"/>
+        <w:numPr>
+          <w:ilvl w:val="0"/>
+          <w:numId w:val="3"/>
+        </w:numPr>
+      </w:pPr>
+      <w:r>
+        <w:t>Data-subject rights: access, correction, and erasure after the case closes, on request.</w:t>
+      </w:r>
+    </w:p>
+    <w:p>
+      <w:pPr>
+        <w:pStyle w:val="ListParagraph"/>
+        <w:numPr>
+          <w:ilvl w:val="0"/>
+          <w:numId w:val="3"/>
+        </w:numPr>
+      </w:pPr>
+      <w:r>
+        <w:t>Privacy Policy and Terms: on the live portal. New accounts accept both before they work the files.</w:t>
+      </w:r>
+    </w:p>
+    <w:p>
+      <w:pPr>
+        <w:pStyle w:val="ListParagraph"/>
+        <w:numPr>
+          <w:ilvl w:val="0"/>
+          <w:numId w:val="3"/>
+        </w:numPr>
+      </w:pPr>
+      <w:r>
+        <w:t>We collect only what the applications need.</w:t>
+      </w:r>
+    </w:p>
+    <w:p>
+      <w:pPr>
+        <w:pStyle w:val="ListParagraph"/>
+        <w:numPr>
+          <w:ilvl w:val="0"/>
+          <w:numId w:val="3"/>
+        </w:numPr>
+      </w:pPr>
+      <w:r>
+        <w:t>We send onwards only what the Citizenship by Investment Unit, NIC and Immigration need — same practice as before the portal.</w:t>
+      </w:r>
+    </w:p>
+    <w:p>
+      <w:pPr>
+        <w:pStyle w:val="ListParagraph"/>
+        <w:numPr>
+          <w:ilvl w:val="0"/>
+          <w:numId w:val="3"/>
+        </w:numPr>
+      </w:pPr>
+      <w:r>
+        <w:t>We keep the file unless the applicant asks us to delete it after the case is closed.</w:t>
+      </w:r>
+    </w:p>
+    <w:p>
+      <w:pPr>
+        <w:pStyle w:val="ListParagraph"/>
+        <w:numPr>
+          <w:ilvl w:val="0"/>
+          <w:numId w:val="3"/>
+        </w:numPr>
+      </w:pPr>
+      <w:r>
+        <w:t>Other processors: AWS, Cloudflare (including file storage), Microsoft 365 / SharePoint.</w:t>
+      </w:r>
+    </w:p>
+    <w:p>
+      <w:pPr>
+        <w:pStyle w:val="ListParagraph"/>
+        <w:numPr>
+          <w:ilvl w:val="0"/>
+          <w:numId w:val="3"/>
+        </w:numPr>
+      </w:pPr>
+      <w:r>
+        <w:t>If personal data is breached, we tell affected firms without delay. The written playbook is being finished.</w:t>
+      </w:r>
+    </w:p>
+    <w:p>
+      <w:pPr/>
+      <w:r>
         <w:rPr>
           <w:b/>
-          <w:lang w:val="en-US"/>
-        </w:rPr>
-      </w:pPr>
-    </w:p>
-    <w:p>
-      <w:pPr>
+        </w:rPr>
+        <w:t>Certification — say this plainly</w:t>
+      </w:r>
+    </w:p>
+    <w:p>
+      <w:pPr>
+        <w:pStyle w:val="ListParagraph"/>
+        <w:numPr>
+          <w:ilvl w:val="0"/>
+          <w:numId w:val="3"/>
+        </w:numPr>
+      </w:pPr>
+      <w:r>
+        <w:t>ISO 27001 and SOC 2: we are working on them now. We do not hold them yet.</w:t>
+      </w:r>
+    </w:p>
+    <w:p>
+      <w:pPr>
+        <w:pStyle w:val="ListParagraph"/>
+        <w:numPr>
+          <w:ilvl w:val="0"/>
+          <w:numId w:val="3"/>
+        </w:numPr>
+      </w:pPr>
+      <w:r>
+        <w:t>We have already tested the portal ourselves: injection, unsafe uploads, and access between accounts.</w:t>
+      </w:r>
+    </w:p>
+    <w:p>
+      <w:pPr>
+        <w:pStyle w:val="ListParagraph"/>
+        <w:numPr>
+          <w:ilvl w:val="0"/>
+          <w:numId w:val="3"/>
+        </w:numPr>
+      </w:pPr>
+      <w:r>
+        <w:t>A full independent penetration test is under way and not finished.</w:t>
+      </w:r>
+    </w:p>
+    <w:p>
+      <w:pPr>
+        <w:pStyle w:val="ListParagraph"/>
+        <w:numPr>
+          <w:ilvl w:val="0"/>
+          <w:numId w:val="3"/>
+        </w:numPr>
+      </w:pPr>
+      <w:r>
+        <w:t>We will share the outcome when that work is done.</w:t>
+      </w:r>
+    </w:p>
+    <w:p>
+      <w:pPr>
+        <w:pStyle w:val="ListParagraph"/>
+        <w:numPr>
+          <w:ilvl w:val="0"/>
+          <w:numId w:val="3"/>
+        </w:numPr>
+      </w:pPr>
+      <w:r>
+        <w:t>None of that changes the answer to the real question: the portal is heavily secured and ready for confidential client files today.</w:t>
+      </w:r>
+    </w:p>
+    <w:p>
+      <w:pPr/>
+      <w:r>
         <w:rPr>
           <w:b/>
-          <w:lang w:val="en-US"/>
-        </w:rPr>
-      </w:pPr>
-    </w:p>
-    <w:p>
-      <w:r>
-        <w:rPr>
-          <w:b/>
-        </w:rPr>
-        <w:lastRenderedPageBreak/>
-        <w:t>Bespoke AI</w:t>
-      </w:r>
-    </w:p>
-    <w:p>
-      <w:pPr>
-        <w:pStyle w:val="ListParagraph"/>
-        <w:numPr>
-          <w:ilvl w:val="0"/>
-          <w:numId w:val="3"/>
-        </w:numPr>
-      </w:pPr>
-      <w:r>
-        <w:t>Use it. It knows this portal</w:t>
-      </w:r>
-      <w:r>
-        <w:rPr>
-          <w:lang w:val="en-US"/>
-        </w:rPr>
-        <w:t xml:space="preserve"> it is a bult in AI trained specifically for this portal</w:t>
-      </w:r>
-      <w:r>
-        <w:t>.</w:t>
-      </w:r>
-    </w:p>
-    <w:p>
-      <w:pPr>
-        <w:pStyle w:val="ListParagraph"/>
-        <w:numPr>
-          <w:ilvl w:val="0"/>
-          <w:numId w:val="3"/>
-        </w:numPr>
-      </w:pPr>
-      <w:r>
-        <w:t>Ask how a step works, or what is still missing on the file you have open.</w:t>
-      </w:r>
-    </w:p>
-    <w:p>
-      <w:pPr>
-        <w:pStyle w:val="ListParagraph"/>
-        <w:numPr>
-          <w:ilvl w:val="0"/>
-          <w:numId w:val="3"/>
-        </w:numPr>
-      </w:pPr>
-      <w:r>
-        <w:t>It cannot see other firms' files. It cannot see keys.</w:t>
-      </w:r>
-    </w:p>
-    <w:p>
-      <w:r>
-        <w:rPr>
-          <w:b/>
-        </w:rPr>
-        <w:t>If something breaks</w:t>
-      </w:r>
-    </w:p>
-    <w:p>
-      <w:pPr>
-        <w:pStyle w:val="ListParagraph"/>
-        <w:numPr>
-          <w:ilvl w:val="0"/>
-          <w:numId w:val="3"/>
-        </w:numPr>
-      </w:pPr>
-      <w:r>
-        <w:t>Email support@tmantoinelaw.com. That mailbox is shared with TM ANTOINE admins.</w:t>
-      </w:r>
-    </w:p>
-    <w:p>
-      <w:pPr>
-        <w:pStyle w:val="ListParagraph"/>
-        <w:numPr>
-          <w:ilvl w:val="0"/>
-          <w:numId w:val="3"/>
-        </w:numPr>
-      </w:pPr>
-      <w:r>
-        <w:rPr>
-          <w:lang w:val="en-US"/>
-        </w:rPr>
-        <w:t xml:space="preserve">Get </w:t>
-      </w:r>
-      <w:r>
-        <w:t>a reply within an hour, if people are available.</w:t>
-      </w:r>
-    </w:p>
-    <w:p>
-      <w:pPr>
-        <w:pStyle w:val="ListParagraph"/>
-        <w:numPr>
-          <w:ilvl w:val="0"/>
-          <w:numId w:val="3"/>
-        </w:numPr>
-      </w:pPr>
-      <w:r>
-        <w:t>Vernon Francis is the main technical contact.</w:t>
-      </w:r>
-    </w:p>
-    <w:p>
-      <w:pPr>
-        <w:pStyle w:val="ListParagraph"/>
-        <w:numPr>
-          <w:ilvl w:val="0"/>
-          <w:numId w:val="3"/>
-        </w:numPr>
-      </w:pPr>
-      <w:r>
-        <w:t>If you can still sign in, message Cindy McLean, Emmanuel McLean, Krishna M</w:t>
-      </w:r>
-      <w:proofErr w:type="spellStart"/>
-      <w:r>
-        <w:rPr>
-          <w:lang w:val="en-US"/>
-        </w:rPr>
-        <w:t>onrose</w:t>
-      </w:r>
-      <w:proofErr w:type="spellEnd"/>
-      <w:r>
-        <w:t xml:space="preserve">, or Vernon </w:t>
-      </w:r>
-      <w:r>
-        <w:rPr>
-          <w:lang w:val="en-US"/>
-        </w:rPr>
-        <w:t>Francis</w:t>
-      </w:r>
-      <w:r>
-        <w:t>in the portal.</w:t>
-      </w:r>
-      <w:r>
-        <w:rPr>
-          <w:lang w:val="en-US"/>
-        </w:rPr>
-        <w:t xml:space="preserve"> Bespoke AI can also help with messaging either one of the admins in the portal</w:t>
-      </w:r>
-    </w:p>
-    <w:p>
-      <w:pPr>
-        <w:pStyle w:val="ListParagraph"/>
-        <w:numPr>
-          <w:ilvl w:val="0"/>
-          <w:numId w:val="3"/>
-        </w:numPr>
-      </w:pPr>
-      <w:r>
-        <w:t>S</w:t>
-      </w:r>
-      <w:r>
-        <w:t>end: the page you were on, the account email, the CIP number if there is one, and what you clicked.</w:t>
-      </w:r>
-    </w:p>
-    <w:p>
-      <w:pPr>
-        <w:pStyle w:val="ListParagraph"/>
-        <w:numPr>
-          <w:ilvl w:val="0"/>
-          <w:numId w:val="3"/>
-        </w:numPr>
-      </w:pPr>
-      <w:r>
-        <w:t>Never send a sign-in code or an authenticator code.</w:t>
-      </w:r>
-    </w:p>
-    <w:p>
-      <w:r>
-        <w:rPr>
-          <w:b/>
-        </w:rPr>
-        <w:t>Legal and data — if asked</w:t>
-      </w:r>
-    </w:p>
-    <w:p>
-      <w:pPr>
-        <w:pStyle w:val="ListParagraph"/>
-        <w:numPr>
-          <w:ilvl w:val="0"/>
-          <w:numId w:val="3"/>
-        </w:numPr>
-      </w:pPr>
-      <w:r>
-        <w:t>Host: Laravel Cloud on Amazon Web Services, United States, plus Cloudflare.</w:t>
-      </w:r>
-    </w:p>
-    <w:p>
-      <w:pPr>
-        <w:pStyle w:val="ListParagraph"/>
-        <w:numPr>
-          <w:ilvl w:val="0"/>
-          <w:numId w:val="3"/>
-        </w:numPr>
-      </w:pPr>
-      <w:r>
-        <w:t>Encrypted in transit and at rest. Yes.</w:t>
-      </w:r>
-    </w:p>
-    <w:p>
-      <w:pPr>
-        <w:pStyle w:val="ListParagraph"/>
-        <w:numPr>
-          <w:ilvl w:val="0"/>
-          <w:numId w:val="3"/>
-        </w:numPr>
-      </w:pPr>
-      <w:r>
-        <w:t>Company members see every application for the company, not only their own.</w:t>
-      </w:r>
-    </w:p>
-    <w:p>
-      <w:pPr>
-        <w:pStyle w:val="ListParagraph"/>
-        <w:numPr>
-          <w:ilvl w:val="0"/>
-          <w:numId w:val="3"/>
-        </w:numPr>
-        <w:rPr>
-          <w:b/>
-          <w:bCs/>
-          <w:u w:val="single"/>
-        </w:rPr>
-      </w:pPr>
-      <w:r>
-        <w:rPr>
-          <w:b/>
-          <w:bCs/>
-          <w:u w:val="single"/>
-        </w:rPr>
-        <w:t>Data Processing Agreement: yes, pending review by our legal team.</w:t>
-      </w:r>
-    </w:p>
-    <w:p>
-      <w:pPr>
-        <w:pStyle w:val="ListParagraph"/>
-        <w:numPr>
-          <w:ilvl w:val="0"/>
-          <w:numId w:val="3"/>
-        </w:numPr>
-      </w:pPr>
-      <w:r>
-        <w:t>We collect only what the applications need.</w:t>
-      </w:r>
-    </w:p>
-    <w:p>
-      <w:pPr>
-        <w:pStyle w:val="ListParagraph"/>
-        <w:numPr>
-          <w:ilvl w:val="0"/>
-          <w:numId w:val="3"/>
-        </w:numPr>
-      </w:pPr>
-      <w:r>
-        <w:t>We send onwards only what the Citizenship by Investment Unit, NIC and Immigration need</w:t>
-      </w:r>
-      <w:r>
-        <w:t xml:space="preserve"> same practice as before the portal.</w:t>
-      </w:r>
-    </w:p>
-    <w:p>
-      <w:pPr>
-        <w:pStyle w:val="ListParagraph"/>
-        <w:numPr>
-          <w:ilvl w:val="0"/>
-          <w:numId w:val="3"/>
-        </w:numPr>
-      </w:pPr>
-      <w:r>
-        <w:t>We keep the file unless the applicant asks us to delete it after the case is closed.</w:t>
-      </w:r>
-    </w:p>
-    <w:p>
-      <w:pPr>
-        <w:pStyle w:val="ListParagraph"/>
-        <w:numPr>
-          <w:ilvl w:val="0"/>
-          <w:numId w:val="3"/>
-        </w:numPr>
-      </w:pPr>
-      <w:r>
-        <w:t>Other processors: AWS, Cloudflare (including file storage), Microsoft 365 / SharePoint.</w:t>
-      </w:r>
-    </w:p>
-    <w:p>
-      <w:pPr>
-        <w:pStyle w:val="ListParagraph"/>
-        <w:numPr>
-          <w:ilvl w:val="0"/>
-          <w:numId w:val="3"/>
-        </w:numPr>
-      </w:pPr>
-      <w:r>
-        <w:t>If personal data is breached, we tell affected firms without delay. The written playbook is being finished.</w:t>
-      </w:r>
-    </w:p>
-    <w:p>
-      <w:r>
-        <w:rPr>
-          <w:b/>
-        </w:rPr>
-        <w:t>Certification — say this plainly</w:t>
-      </w:r>
-    </w:p>
-    <w:p>
-      <w:pPr>
-        <w:pStyle w:val="ListParagraph"/>
-        <w:numPr>
-          <w:ilvl w:val="0"/>
-          <w:numId w:val="3"/>
-        </w:numPr>
-      </w:pPr>
-      <w:r>
-        <w:t>ISO 27001 and SOC 2: we are working on them now. We do not hold them yet.</w:t>
-      </w:r>
-    </w:p>
-    <w:p>
-      <w:pPr>
-        <w:pStyle w:val="ListParagraph"/>
-        <w:numPr>
-          <w:ilvl w:val="0"/>
-          <w:numId w:val="3"/>
-        </w:numPr>
-      </w:pPr>
-      <w:r>
-        <w:t>We have already tested the portal ourselves: injection, unsafe uploads, and access between accounts.</w:t>
-      </w:r>
-    </w:p>
-    <w:p>
-      <w:pPr>
-        <w:pStyle w:val="ListParagraph"/>
-        <w:numPr>
-          <w:ilvl w:val="0"/>
-          <w:numId w:val="3"/>
-        </w:numPr>
-      </w:pPr>
-      <w:r>
-        <w:t>A full independent penetration test is under way and not finished.</w:t>
-      </w:r>
-    </w:p>
-    <w:p>
-      <w:pPr>
-        <w:pStyle w:val="ListParagraph"/>
-        <w:numPr>
-          <w:ilvl w:val="0"/>
-          <w:numId w:val="3"/>
-        </w:numPr>
-      </w:pPr>
-      <w:r>
-        <w:t>We will share the outcome when that work is done.</w:t>
-      </w:r>
-    </w:p>
-    <w:p>
-      <w:pPr>
-        <w:pStyle w:val="ListParagraph"/>
-        <w:numPr>
-          <w:ilvl w:val="0"/>
-          <w:numId w:val="3"/>
-        </w:numPr>
-        <w:rPr>
-          <w:b/>
-          <w:bCs/>
-          <w:u w:val="single"/>
-        </w:rPr>
-      </w:pPr>
-      <w:r>
-        <w:rPr>
-          <w:b/>
-          <w:bCs/>
-          <w:u w:val="single"/>
-        </w:rPr>
-        <w:t>None of that changes the answer to the real question: the portal is heavily secured and ready for confidential client files today.</w:t>
-      </w:r>
-    </w:p>
-    <w:p>
-      <w:pPr>
-        <w:rPr>
-          <w:b/>
-          <w:lang w:val="en-US"/>
-        </w:rPr>
-      </w:pPr>
-    </w:p>
-    <w:p>
-      <w:r>
-        <w:rPr>
-          <w:b/>
-        </w:rPr>
-        <w:lastRenderedPageBreak/>
+        </w:rPr>
         <w:t>What we need from you</w:t>
       </w:r>
     </w:p>
@@ -3369,62 +3412,31 @@
         </w:numPr>
       </w:pPr>
       <w:r>
-        <w:t xml:space="preserve">Bookmark </w:t>
-      </w:r>
-      <w:r>
-        <w:rPr>
-          <w:b/>
-          <w:bCs/>
-          <w:u w:val="single"/>
-        </w:rPr>
-        <w:t>portal.tmantoinelaw.com</w:t>
-      </w:r>
-      <w:r>
-        <w:t xml:space="preserve"> and treat any other host as suspect.</w:t>
-      </w:r>
-    </w:p>
-    <w:p>
-      <w:pPr>
-        <w:pStyle w:val="ListParagraph"/>
-        <w:numPr>
-          <w:ilvl w:val="0"/>
-          <w:numId w:val="3"/>
-        </w:numPr>
-      </w:pPr>
-      <w:r>
-        <w:t xml:space="preserve">Use Bespoke AI for </w:t>
-      </w:r>
-      <w:r>
-        <w:rPr>
-          <w:b/>
-          <w:bCs/>
-        </w:rPr>
-        <w:t>“how does this screen work”</w:t>
-      </w:r>
-      <w:r>
-        <w:t xml:space="preserve"> questions.</w:t>
-      </w:r>
-    </w:p>
-    <w:p>
-      <w:pPr>
-        <w:pStyle w:val="ListParagraph"/>
-        <w:numPr>
-          <w:ilvl w:val="0"/>
-          <w:numId w:val="3"/>
-        </w:numPr>
-      </w:pPr>
-      <w:r>
-        <w:t xml:space="preserve">Use </w:t>
-      </w:r>
-      <w:r>
-        <w:rPr>
-          <w:b/>
-          <w:bCs/>
-        </w:rPr>
-        <w:t>support@tmantoinelaw.com</w:t>
-      </w:r>
-      <w:r>
-        <w:t xml:space="preserve"> or Messages for faults, never for sharing codes.</w:t>
+        <w:t>Bookmark portal.tmantoinelaw.com and treat any other host as suspect.</w:t>
+      </w:r>
+    </w:p>
+    <w:p>
+      <w:pPr>
+        <w:pStyle w:val="ListParagraph"/>
+        <w:numPr>
+          <w:ilvl w:val="0"/>
+          <w:numId w:val="3"/>
+        </w:numPr>
+      </w:pPr>
+      <w:r>
+        <w:t>Use Bespoke AI for “how does this screen work” questions.</w:t>
+      </w:r>
+    </w:p>
+    <w:p>
+      <w:pPr>
+        <w:pStyle w:val="ListParagraph"/>
+        <w:numPr>
+          <w:ilvl w:val="0"/>
+          <w:numId w:val="3"/>
+        </w:numPr>
+      </w:pPr>
+      <w:r>
+        <w:t>Use support@tmantoinelaw.com or Messages for faults, never for sharing codes.</w:t>
       </w:r>
     </w:p>
     <w:sectPr>

</xml_diff>

<commit_message>
Restore the briefing GDPR wording from the edited PDF.
Keep the affirmative compliance answer and drop the certificate
disclaimer rewrite that overwrote the manual edits.

Co-authored-by: Cursor <cursoragent@cursor.com>
</commit_message>
<xml_diff>
--- a/docs/Webinar-Plan-TMA-Portal.docx
+++ b/docs/Webinar-Plan-TMA-Portal.docx
@@ -3166,7 +3166,7 @@
         </w:numPr>
       </w:pPr>
       <w:r>
-        <w:t>The portal complies with the GDPR where it applies: DPA, SCCs where right, documented processors, retention and deletion, and breach notice.</w:t>
+        <w:t>GDPR: yes — where it applies, GDPR-aligned practices (lawful processing, access and deletion rights, secure storage, access controls, audit logging, retention, transfer safeguards). Privacy Policy on the live portal.</w:t>
       </w:r>
     </w:p>
     <w:p>
@@ -3298,7 +3298,7 @@
         </w:numPr>
       </w:pPr>
       <w:r>
-        <w:t>If personal data is breached, we tell affected firms without delay. The written playbook is being finished.</w:t>
+        <w:t>If personal data is breached, we tell affected firms without delay.</w:t>
       </w:r>
     </w:p>
     <w:p>

</xml_diff>